<commit_message>
feat: :sparkles: se quito justificacion
</commit_message>
<xml_diff>
--- a/libro.docx
+++ b/libro.docx
@@ -10,8 +10,473 @@
       <w:r>
         <w:t>Resumen</w:t>
       </w:r>
+      <w:bookmarkStart w:id="1" w:name="_Toc209434261"/>
       <w:bookmarkEnd w:id="0"/>
     </w:p>
+    <w:p>
+      <w:r>
+        <w:t>Este trabajo de grado se centra en el diseño e implementación de un sistema autónomo de energía solar fotovoltaica, que tiene como objetivo operar una planta de tratamiento de agua mediante cavitación. Este sistema puede funcionar de manera continua durante al menos cuatro horas y no necesita un banco de baterías. El proyecto se desarrolla en un trapiche panelero, donde se pierden alrededor de 600 litros de agua al día que, sin un tratamiento adecuado, no pueden ser reutilizados en la agricultura.</w:t>
+      </w:r>
+    </w:p>
+    <w:p>
+      <w:r>
+        <w:t xml:space="preserve">El sistema incluye una etapa de </w:t>
+      </w:r>
+      <w:proofErr w:type="spellStart"/>
+      <w:r>
+        <w:t>pre-purificación</w:t>
+      </w:r>
+      <w:proofErr w:type="spellEnd"/>
+      <w:r>
+        <w:t xml:space="preserve"> natural, que se desarrolló en paralelo como parte del mismo proyecto, y una etapa de cavitación que mejora la calidad del agua para su uso en cultivos. Desde una perspectiva energética, se ha puesto en marcha un sistema de operación directa con paneles solares (PV-</w:t>
+      </w:r>
+      <w:proofErr w:type="spellStart"/>
+      <w:r>
+        <w:t>direct</w:t>
+      </w:r>
+      <w:proofErr w:type="spellEnd"/>
+      <w:r>
+        <w:t>), lo que ayuda a disminuir tanto los costos de inversión como los de mantenimiento. Los resultados obtenidos respaldan la viabilidad técnica y ambiental de esta propuesta, que se presenta como una alternativa sostenible y replicable para el sector de paneles solares en Colombia.</w:t>
+      </w:r>
+    </w:p>
+    <w:p>
+      <w:pPr>
+        <w:pStyle w:val="Ttulo1"/>
+      </w:pPr>
+      <w:proofErr w:type="spellStart"/>
+      <w:r>
+        <w:t>Abstract</w:t>
+      </w:r>
+      <w:bookmarkEnd w:id="1"/>
+      <w:proofErr w:type="spellEnd"/>
+    </w:p>
+    <w:p>
+      <w:proofErr w:type="spellStart"/>
+      <w:r>
+        <w:t>This</w:t>
+      </w:r>
+      <w:proofErr w:type="spellEnd"/>
+      <w:r>
+        <w:t xml:space="preserve"> </w:t>
+      </w:r>
+      <w:proofErr w:type="spellStart"/>
+      <w:r>
+        <w:t>thesis</w:t>
+      </w:r>
+      <w:proofErr w:type="spellEnd"/>
+      <w:r>
+        <w:t xml:space="preserve"> </w:t>
+      </w:r>
+      <w:proofErr w:type="spellStart"/>
+      <w:r>
+        <w:t>focuses</w:t>
+      </w:r>
+      <w:proofErr w:type="spellEnd"/>
+      <w:r>
+        <w:t xml:space="preserve"> </w:t>
+      </w:r>
+      <w:proofErr w:type="spellStart"/>
+      <w:r>
+        <w:t>on</w:t>
+      </w:r>
+      <w:proofErr w:type="spellEnd"/>
+      <w:r>
+        <w:t xml:space="preserve"> </w:t>
+      </w:r>
+      <w:proofErr w:type="spellStart"/>
+      <w:r>
+        <w:t>the</w:t>
+      </w:r>
+      <w:proofErr w:type="spellEnd"/>
+      <w:r>
+        <w:t xml:space="preserve"> </w:t>
+      </w:r>
+      <w:proofErr w:type="spellStart"/>
+      <w:r>
+        <w:t>design</w:t>
+      </w:r>
+      <w:proofErr w:type="spellEnd"/>
+      <w:r>
+        <w:t xml:space="preserve"> and </w:t>
+      </w:r>
+      <w:proofErr w:type="spellStart"/>
+      <w:r>
+        <w:t>implementation</w:t>
+      </w:r>
+      <w:proofErr w:type="spellEnd"/>
+      <w:r>
+        <w:t xml:space="preserve"> </w:t>
+      </w:r>
+      <w:proofErr w:type="spellStart"/>
+      <w:r>
+        <w:t>of</w:t>
+      </w:r>
+      <w:proofErr w:type="spellEnd"/>
+      <w:r>
+        <w:t xml:space="preserve"> </w:t>
+      </w:r>
+      <w:proofErr w:type="spellStart"/>
+      <w:r>
+        <w:t>an</w:t>
+      </w:r>
+      <w:proofErr w:type="spellEnd"/>
+      <w:r>
+        <w:t xml:space="preserve"> </w:t>
+      </w:r>
+      <w:proofErr w:type="spellStart"/>
+      <w:r>
+        <w:t>autonomous</w:t>
+      </w:r>
+      <w:proofErr w:type="spellEnd"/>
+      <w:r>
+        <w:t xml:space="preserve"> </w:t>
+      </w:r>
+      <w:proofErr w:type="spellStart"/>
+      <w:r>
+        <w:t>photovoltaic</w:t>
+      </w:r>
+      <w:proofErr w:type="spellEnd"/>
+      <w:r>
+        <w:t xml:space="preserve"> solar </w:t>
+      </w:r>
+      <w:proofErr w:type="spellStart"/>
+      <w:r>
+        <w:t>energy</w:t>
+      </w:r>
+      <w:proofErr w:type="spellEnd"/>
+      <w:r>
+        <w:t xml:space="preserve"> </w:t>
+      </w:r>
+      <w:proofErr w:type="spellStart"/>
+      <w:r>
+        <w:t>system</w:t>
+      </w:r>
+      <w:proofErr w:type="spellEnd"/>
+      <w:r>
+        <w:t xml:space="preserve">, </w:t>
+      </w:r>
+      <w:proofErr w:type="spellStart"/>
+      <w:r>
+        <w:t>aimed</w:t>
+      </w:r>
+      <w:proofErr w:type="spellEnd"/>
+      <w:r>
+        <w:t xml:space="preserve"> at </w:t>
+      </w:r>
+      <w:proofErr w:type="spellStart"/>
+      <w:r>
+        <w:t>operating</w:t>
+      </w:r>
+      <w:proofErr w:type="spellEnd"/>
+      <w:r>
+        <w:t xml:space="preserve"> a </w:t>
+      </w:r>
+      <w:proofErr w:type="spellStart"/>
+      <w:r>
+        <w:t>water</w:t>
+      </w:r>
+      <w:proofErr w:type="spellEnd"/>
+      <w:r>
+        <w:t xml:space="preserve"> </w:t>
+      </w:r>
+      <w:proofErr w:type="spellStart"/>
+      <w:r>
+        <w:t>treatment</w:t>
+      </w:r>
+      <w:proofErr w:type="spellEnd"/>
+      <w:r>
+        <w:t xml:space="preserve"> </w:t>
+      </w:r>
+      <w:proofErr w:type="spellStart"/>
+      <w:r>
+        <w:t>plant</w:t>
+      </w:r>
+      <w:proofErr w:type="spellEnd"/>
+      <w:r>
+        <w:t xml:space="preserve"> </w:t>
+      </w:r>
+      <w:proofErr w:type="spellStart"/>
+      <w:r>
+        <w:t>through</w:t>
+      </w:r>
+      <w:proofErr w:type="spellEnd"/>
+      <w:r>
+        <w:t xml:space="preserve"> </w:t>
+      </w:r>
+      <w:proofErr w:type="spellStart"/>
+      <w:r>
+        <w:t>cavitation</w:t>
+      </w:r>
+      <w:proofErr w:type="spellEnd"/>
+      <w:r>
+        <w:t xml:space="preserve">. </w:t>
+      </w:r>
+      <w:proofErr w:type="spellStart"/>
+      <w:r>
+        <w:t>The</w:t>
+      </w:r>
+      <w:proofErr w:type="spellEnd"/>
+      <w:r>
+        <w:t xml:space="preserve"> </w:t>
+      </w:r>
+      <w:proofErr w:type="spellStart"/>
+      <w:r>
+        <w:t>system</w:t>
+      </w:r>
+      <w:proofErr w:type="spellEnd"/>
+      <w:r>
+        <w:t xml:space="preserve"> </w:t>
+      </w:r>
+      <w:proofErr w:type="spellStart"/>
+      <w:r>
+        <w:t>is</w:t>
+      </w:r>
+      <w:proofErr w:type="spellEnd"/>
+      <w:r>
+        <w:t xml:space="preserve"> </w:t>
+      </w:r>
+      <w:proofErr w:type="spellStart"/>
+      <w:r>
+        <w:t>capable</w:t>
+      </w:r>
+      <w:proofErr w:type="spellEnd"/>
+      <w:r>
+        <w:t xml:space="preserve"> </w:t>
+      </w:r>
+      <w:proofErr w:type="spellStart"/>
+      <w:r>
+        <w:t>of</w:t>
+      </w:r>
+      <w:proofErr w:type="spellEnd"/>
+      <w:r>
+        <w:t xml:space="preserve"> running </w:t>
+      </w:r>
+      <w:proofErr w:type="spellStart"/>
+      <w:r>
+        <w:t>continuously</w:t>
+      </w:r>
+      <w:proofErr w:type="spellEnd"/>
+      <w:r>
+        <w:t xml:space="preserve"> </w:t>
+      </w:r>
+      <w:proofErr w:type="spellStart"/>
+      <w:r>
+        <w:t>for</w:t>
+      </w:r>
+      <w:proofErr w:type="spellEnd"/>
+      <w:r>
+        <w:t xml:space="preserve"> at </w:t>
+      </w:r>
+      <w:proofErr w:type="spellStart"/>
+      <w:r>
+        <w:t>least</w:t>
+      </w:r>
+      <w:proofErr w:type="spellEnd"/>
+      <w:r>
+        <w:t xml:space="preserve"> </w:t>
+      </w:r>
+      <w:proofErr w:type="spellStart"/>
+      <w:r>
+        <w:t>four</w:t>
+      </w:r>
+      <w:proofErr w:type="spellEnd"/>
+      <w:r>
+        <w:t xml:space="preserve"> </w:t>
+      </w:r>
+      <w:proofErr w:type="spellStart"/>
+      <w:r>
+        <w:t>hours</w:t>
+      </w:r>
+      <w:proofErr w:type="spellEnd"/>
+      <w:r>
+        <w:t xml:space="preserve"> </w:t>
+      </w:r>
+      <w:proofErr w:type="spellStart"/>
+      <w:r>
+        <w:t>without</w:t>
+      </w:r>
+      <w:proofErr w:type="spellEnd"/>
+      <w:r>
+        <w:t xml:space="preserve"> </w:t>
+      </w:r>
+      <w:proofErr w:type="spellStart"/>
+      <w:r>
+        <w:t>requiring</w:t>
+      </w:r>
+      <w:proofErr w:type="spellEnd"/>
+      <w:r>
+        <w:t xml:space="preserve"> a </w:t>
+      </w:r>
+      <w:proofErr w:type="spellStart"/>
+      <w:r>
+        <w:t>battery</w:t>
+      </w:r>
+      <w:proofErr w:type="spellEnd"/>
+      <w:r>
+        <w:t xml:space="preserve"> </w:t>
+      </w:r>
+      <w:proofErr w:type="spellStart"/>
+      <w:r>
+        <w:t>bank</w:t>
+      </w:r>
+      <w:proofErr w:type="spellEnd"/>
+      <w:r>
+        <w:t xml:space="preserve">. </w:t>
+      </w:r>
+      <w:proofErr w:type="spellStart"/>
+      <w:r>
+        <w:t>The</w:t>
+      </w:r>
+      <w:proofErr w:type="spellEnd"/>
+      <w:r>
+        <w:t xml:space="preserve"> </w:t>
+      </w:r>
+      <w:proofErr w:type="spellStart"/>
+      <w:r>
+        <w:t>project</w:t>
+      </w:r>
+      <w:proofErr w:type="spellEnd"/>
+      <w:r>
+        <w:t xml:space="preserve"> </w:t>
+      </w:r>
+      <w:proofErr w:type="spellStart"/>
+      <w:r>
+        <w:t>was</w:t>
+      </w:r>
+      <w:proofErr w:type="spellEnd"/>
+      <w:r>
+        <w:t xml:space="preserve"> </w:t>
+      </w:r>
+      <w:proofErr w:type="spellStart"/>
+      <w:r>
+        <w:t>developed</w:t>
+      </w:r>
+      <w:proofErr w:type="spellEnd"/>
+      <w:r>
+        <w:t xml:space="preserve"> in a </w:t>
+      </w:r>
+      <w:proofErr w:type="spellStart"/>
+      <w:r>
+        <w:t>sugarcane</w:t>
+      </w:r>
+      <w:proofErr w:type="spellEnd"/>
+      <w:r>
+        <w:t xml:space="preserve"> </w:t>
+      </w:r>
+      <w:proofErr w:type="spellStart"/>
+      <w:r>
+        <w:t>mill</w:t>
+      </w:r>
+      <w:proofErr w:type="spellEnd"/>
+      <w:r>
+        <w:t xml:space="preserve">, </w:t>
+      </w:r>
+      <w:proofErr w:type="spellStart"/>
+      <w:r>
+        <w:t>where</w:t>
+      </w:r>
+      <w:proofErr w:type="spellEnd"/>
+      <w:r>
+        <w:t xml:space="preserve"> </w:t>
+      </w:r>
+      <w:proofErr w:type="spellStart"/>
+      <w:r>
+        <w:t>approximately</w:t>
+      </w:r>
+      <w:proofErr w:type="spellEnd"/>
+      <w:r>
+        <w:t xml:space="preserve"> 600 </w:t>
+      </w:r>
+      <w:proofErr w:type="spellStart"/>
+      <w:r>
+        <w:t>liters</w:t>
+      </w:r>
+      <w:proofErr w:type="spellEnd"/>
+      <w:r>
+        <w:t xml:space="preserve"> </w:t>
+      </w:r>
+      <w:proofErr w:type="spellStart"/>
+      <w:r>
+        <w:t>of</w:t>
+      </w:r>
+      <w:proofErr w:type="spellEnd"/>
+      <w:r>
+        <w:t xml:space="preserve"> </w:t>
+      </w:r>
+      <w:proofErr w:type="spellStart"/>
+      <w:r>
+        <w:t>water</w:t>
+      </w:r>
+      <w:proofErr w:type="spellEnd"/>
+      <w:r>
+        <w:t xml:space="preserve"> are </w:t>
+      </w:r>
+      <w:proofErr w:type="spellStart"/>
+      <w:r>
+        <w:t>lost</w:t>
+      </w:r>
+      <w:proofErr w:type="spellEnd"/>
+      <w:r>
+        <w:t xml:space="preserve"> </w:t>
+      </w:r>
+      <w:proofErr w:type="spellStart"/>
+      <w:r>
+        <w:t>daily</w:t>
+      </w:r>
+      <w:proofErr w:type="spellEnd"/>
+      <w:r>
+        <w:t xml:space="preserve"> and, </w:t>
+      </w:r>
+      <w:proofErr w:type="spellStart"/>
+      <w:r>
+        <w:t>without</w:t>
+      </w:r>
+      <w:proofErr w:type="spellEnd"/>
+      <w:r>
+        <w:t xml:space="preserve"> </w:t>
+      </w:r>
+      <w:proofErr w:type="spellStart"/>
+      <w:r>
+        <w:t>proper</w:t>
+      </w:r>
+      <w:proofErr w:type="spellEnd"/>
+      <w:r>
+        <w:t xml:space="preserve"> </w:t>
+      </w:r>
+      <w:proofErr w:type="spellStart"/>
+      <w:r>
+        <w:t>treatment</w:t>
+      </w:r>
+      <w:proofErr w:type="spellEnd"/>
+      <w:r>
+        <w:t xml:space="preserve">, </w:t>
+      </w:r>
+      <w:proofErr w:type="spellStart"/>
+      <w:r>
+        <w:t>cannot</w:t>
+      </w:r>
+      <w:proofErr w:type="spellEnd"/>
+      <w:r>
+        <w:t xml:space="preserve"> be </w:t>
+      </w:r>
+      <w:proofErr w:type="spellStart"/>
+      <w:r>
+        <w:t>reused</w:t>
+      </w:r>
+      <w:proofErr w:type="spellEnd"/>
+      <w:r>
+        <w:t xml:space="preserve"> in </w:t>
+      </w:r>
+      <w:proofErr w:type="spellStart"/>
+      <w:r>
+        <w:t>agriculture</w:t>
+      </w:r>
+      <w:proofErr w:type="spellEnd"/>
+      <w:r>
+        <w:t>.</w:t>
+      </w:r>
+    </w:p>
+    <w:p/>
     <w:p>
       <w:pPr>
         <w:rPr>
@@ -21,51 +486,453 @@
           <w:szCs w:val="40"/>
         </w:rPr>
       </w:pPr>
-      <w:r>
-        <w:t>Este trabajo de grado presenta el diseño e implementación de un sistema autónomo de energía solar fotovoltaica para operar una planta de tratamiento de agua mediante cavitación, con una autonomía mínima de cuatro horas continuas y sin necesidad de banco de baterías. El proyecto se desarrolla en un trapiche panelero, donde se desperdician alrededor de 600 litros diarios de agua que, sin tratamiento, no pueden reutilizarse en cultivos agrícolas.</w:t>
-      </w:r>
-    </w:p>
-    <w:p>
-      <w:r>
-        <w:t>El sistema integra una etapa de pre-purificación natural, desarrollada en paralelo como parte del mismo proyecto, y una etapa de cavitación que mejora la calidad del agua para su uso agrícola. Energéticamente, se implementó un esquema de operación directa con paneles solares (PV-direct), reduciendo costos de inversión y mantenimiento.</w:t>
-      </w:r>
-    </w:p>
-    <w:p>
-      <w:r>
-        <w:t>Los resultados confirman la viabilidad técnica y ambiental de la propuesta, que constituye una alternativa sostenible y replicable para el sector panelero colombiano.</w:t>
-      </w:r>
-    </w:p>
-    <w:p>
-      <w:pPr>
-        <w:pStyle w:val="Ttulo1"/>
-      </w:pPr>
-      <w:bookmarkStart w:id="1" w:name="_Toc209434261"/>
-      <w:r>
-        <w:t>Abstract</w:t>
-      </w:r>
-      <w:bookmarkEnd w:id="1"/>
-    </w:p>
-    <w:p>
-      <w:r>
-        <w:t>This thesis presents the design and implementation of an autonomous photovoltaic solar system to operate a water treatment plant through cavitation, with a minimum autonomy of four continuous hours and without battery banks. The project was carried out in a sugarcane mill (trapiche panelero), where about 600 liters of water per day are wasted and cannot be reused in agricultural crops without treatment.</w:t>
-      </w:r>
-    </w:p>
-    <w:p>
-      <w:r>
-        <w:t>The system integrates a natural pre-purification stage, developed in parallel as part of the same project, and a cavitation stage that improves water quality for agricultural use. From the energy perspective, a direct PV operation scheme (PV-direct) was implemented, reducing investment and maintenance costs.</w:t>
-      </w:r>
-    </w:p>
-    <w:p>
-      <w:pPr>
-        <w:rPr>
-          <w:rFonts w:asciiTheme="majorHAnsi" w:eastAsiaTheme="majorEastAsia" w:hAnsiTheme="majorHAnsi" w:cstheme="majorBidi"/>
-          <w:color w:val="000000" w:themeColor="text1"/>
-          <w:sz w:val="40"/>
-          <w:szCs w:val="40"/>
-        </w:rPr>
-      </w:pPr>
-      <w:r>
-        <w:t>The results confirm the technical and environmental feasibility of the proposal, providing a sustainable and replicable alternative for the Colombian sugarcane sector.</w:t>
+      <w:proofErr w:type="spellStart"/>
+      <w:r>
+        <w:t>The</w:t>
+      </w:r>
+      <w:proofErr w:type="spellEnd"/>
+      <w:r>
+        <w:t xml:space="preserve"> </w:t>
+      </w:r>
+      <w:proofErr w:type="spellStart"/>
+      <w:r>
+        <w:t>system</w:t>
+      </w:r>
+      <w:proofErr w:type="spellEnd"/>
+      <w:r>
+        <w:t xml:space="preserve"> </w:t>
+      </w:r>
+      <w:proofErr w:type="spellStart"/>
+      <w:r>
+        <w:t>includes</w:t>
+      </w:r>
+      <w:proofErr w:type="spellEnd"/>
+      <w:r>
+        <w:t xml:space="preserve"> a natural </w:t>
+      </w:r>
+      <w:proofErr w:type="spellStart"/>
+      <w:r>
+        <w:t>pre-purification</w:t>
+      </w:r>
+      <w:proofErr w:type="spellEnd"/>
+      <w:r>
+        <w:t xml:space="preserve"> </w:t>
+      </w:r>
+      <w:proofErr w:type="spellStart"/>
+      <w:r>
+        <w:t>stage</w:t>
+      </w:r>
+      <w:proofErr w:type="spellEnd"/>
+      <w:r>
+        <w:t xml:space="preserve">, </w:t>
+      </w:r>
+      <w:proofErr w:type="spellStart"/>
+      <w:r>
+        <w:t>developed</w:t>
+      </w:r>
+      <w:proofErr w:type="spellEnd"/>
+      <w:r>
+        <w:t xml:space="preserve"> in </w:t>
+      </w:r>
+      <w:proofErr w:type="spellStart"/>
+      <w:r>
+        <w:t>parallel</w:t>
+      </w:r>
+      <w:proofErr w:type="spellEnd"/>
+      <w:r>
+        <w:t xml:space="preserve"> as </w:t>
+      </w:r>
+      <w:proofErr w:type="spellStart"/>
+      <w:r>
+        <w:t>part</w:t>
+      </w:r>
+      <w:proofErr w:type="spellEnd"/>
+      <w:r>
+        <w:t xml:space="preserve"> </w:t>
+      </w:r>
+      <w:proofErr w:type="spellStart"/>
+      <w:r>
+        <w:t>of</w:t>
+      </w:r>
+      <w:proofErr w:type="spellEnd"/>
+      <w:r>
+        <w:t xml:space="preserve"> </w:t>
+      </w:r>
+      <w:proofErr w:type="spellStart"/>
+      <w:r>
+        <w:t>the</w:t>
+      </w:r>
+      <w:proofErr w:type="spellEnd"/>
+      <w:r>
+        <w:t xml:space="preserve"> </w:t>
+      </w:r>
+      <w:proofErr w:type="spellStart"/>
+      <w:r>
+        <w:t>same</w:t>
+      </w:r>
+      <w:proofErr w:type="spellEnd"/>
+      <w:r>
+        <w:t xml:space="preserve"> </w:t>
+      </w:r>
+      <w:proofErr w:type="spellStart"/>
+      <w:r>
+        <w:t>project</w:t>
+      </w:r>
+      <w:proofErr w:type="spellEnd"/>
+      <w:r>
+        <w:t xml:space="preserve">, and a </w:t>
+      </w:r>
+      <w:proofErr w:type="spellStart"/>
+      <w:r>
+        <w:t>cavitation</w:t>
+      </w:r>
+      <w:proofErr w:type="spellEnd"/>
+      <w:r>
+        <w:t xml:space="preserve"> </w:t>
+      </w:r>
+      <w:proofErr w:type="spellStart"/>
+      <w:r>
+        <w:t>stage</w:t>
+      </w:r>
+      <w:proofErr w:type="spellEnd"/>
+      <w:r>
+        <w:t xml:space="preserve"> </w:t>
+      </w:r>
+      <w:proofErr w:type="spellStart"/>
+      <w:r>
+        <w:t>that</w:t>
+      </w:r>
+      <w:proofErr w:type="spellEnd"/>
+      <w:r>
+        <w:t xml:space="preserve"> </w:t>
+      </w:r>
+      <w:proofErr w:type="spellStart"/>
+      <w:r>
+        <w:t>improves</w:t>
+      </w:r>
+      <w:proofErr w:type="spellEnd"/>
+      <w:r>
+        <w:t xml:space="preserve"> </w:t>
+      </w:r>
+      <w:proofErr w:type="spellStart"/>
+      <w:r>
+        <w:t>water</w:t>
+      </w:r>
+      <w:proofErr w:type="spellEnd"/>
+      <w:r>
+        <w:t xml:space="preserve"> </w:t>
+      </w:r>
+      <w:proofErr w:type="spellStart"/>
+      <w:r>
+        <w:t>quality</w:t>
+      </w:r>
+      <w:proofErr w:type="spellEnd"/>
+      <w:r>
+        <w:t xml:space="preserve"> </w:t>
+      </w:r>
+      <w:proofErr w:type="spellStart"/>
+      <w:r>
+        <w:t>for</w:t>
+      </w:r>
+      <w:proofErr w:type="spellEnd"/>
+      <w:r>
+        <w:t xml:space="preserve"> </w:t>
+      </w:r>
+      <w:proofErr w:type="spellStart"/>
+      <w:r>
+        <w:t>agricultural</w:t>
+      </w:r>
+      <w:proofErr w:type="spellEnd"/>
+      <w:r>
+        <w:t xml:space="preserve"> use. </w:t>
+      </w:r>
+      <w:proofErr w:type="spellStart"/>
+      <w:r>
+        <w:t>From</w:t>
+      </w:r>
+      <w:proofErr w:type="spellEnd"/>
+      <w:r>
+        <w:t xml:space="preserve"> </w:t>
+      </w:r>
+      <w:proofErr w:type="spellStart"/>
+      <w:r>
+        <w:t>an</w:t>
+      </w:r>
+      <w:proofErr w:type="spellEnd"/>
+      <w:r>
+        <w:t xml:space="preserve"> </w:t>
+      </w:r>
+      <w:proofErr w:type="spellStart"/>
+      <w:r>
+        <w:t>energy</w:t>
+      </w:r>
+      <w:proofErr w:type="spellEnd"/>
+      <w:r>
+        <w:t xml:space="preserve"> </w:t>
+      </w:r>
+      <w:proofErr w:type="spellStart"/>
+      <w:r>
+        <w:t>perspective</w:t>
+      </w:r>
+      <w:proofErr w:type="spellEnd"/>
+      <w:r>
+        <w:t xml:space="preserve">, a </w:t>
+      </w:r>
+      <w:proofErr w:type="spellStart"/>
+      <w:r>
+        <w:t>direct</w:t>
+      </w:r>
+      <w:proofErr w:type="spellEnd"/>
+      <w:r>
+        <w:t xml:space="preserve"> </w:t>
+      </w:r>
+      <w:proofErr w:type="spellStart"/>
+      <w:r>
+        <w:t>operation</w:t>
+      </w:r>
+      <w:proofErr w:type="spellEnd"/>
+      <w:r>
+        <w:t xml:space="preserve"> </w:t>
+      </w:r>
+      <w:proofErr w:type="spellStart"/>
+      <w:r>
+        <w:t>system</w:t>
+      </w:r>
+      <w:proofErr w:type="spellEnd"/>
+      <w:r>
+        <w:t xml:space="preserve"> </w:t>
+      </w:r>
+      <w:proofErr w:type="spellStart"/>
+      <w:r>
+        <w:t>with</w:t>
+      </w:r>
+      <w:proofErr w:type="spellEnd"/>
+      <w:r>
+        <w:t xml:space="preserve"> solar </w:t>
+      </w:r>
+      <w:proofErr w:type="spellStart"/>
+      <w:r>
+        <w:t>panels</w:t>
+      </w:r>
+      <w:proofErr w:type="spellEnd"/>
+      <w:r>
+        <w:t xml:space="preserve"> (PV-</w:t>
+      </w:r>
+      <w:proofErr w:type="spellStart"/>
+      <w:r>
+        <w:t>direct</w:t>
+      </w:r>
+      <w:proofErr w:type="spellEnd"/>
+      <w:r>
+        <w:t xml:space="preserve">) </w:t>
+      </w:r>
+      <w:proofErr w:type="spellStart"/>
+      <w:r>
+        <w:t>was</w:t>
+      </w:r>
+      <w:proofErr w:type="spellEnd"/>
+      <w:r>
+        <w:t xml:space="preserve"> </w:t>
+      </w:r>
+      <w:proofErr w:type="spellStart"/>
+      <w:r>
+        <w:t>implemented</w:t>
+      </w:r>
+      <w:proofErr w:type="spellEnd"/>
+      <w:r>
+        <w:t xml:space="preserve">, </w:t>
+      </w:r>
+      <w:proofErr w:type="spellStart"/>
+      <w:r>
+        <w:t>helping</w:t>
+      </w:r>
+      <w:proofErr w:type="spellEnd"/>
+      <w:r>
+        <w:t xml:space="preserve"> </w:t>
+      </w:r>
+      <w:proofErr w:type="spellStart"/>
+      <w:r>
+        <w:t>to</w:t>
+      </w:r>
+      <w:proofErr w:type="spellEnd"/>
+      <w:r>
+        <w:t xml:space="preserve"> reduce </w:t>
+      </w:r>
+      <w:proofErr w:type="spellStart"/>
+      <w:r>
+        <w:t>both</w:t>
+      </w:r>
+      <w:proofErr w:type="spellEnd"/>
+      <w:r>
+        <w:t xml:space="preserve"> </w:t>
+      </w:r>
+      <w:proofErr w:type="spellStart"/>
+      <w:r>
+        <w:t>investment</w:t>
+      </w:r>
+      <w:proofErr w:type="spellEnd"/>
+      <w:r>
+        <w:t xml:space="preserve"> and </w:t>
+      </w:r>
+      <w:proofErr w:type="spellStart"/>
+      <w:r>
+        <w:t>maintenance</w:t>
+      </w:r>
+      <w:proofErr w:type="spellEnd"/>
+      <w:r>
+        <w:t xml:space="preserve"> </w:t>
+      </w:r>
+      <w:proofErr w:type="spellStart"/>
+      <w:r>
+        <w:t>costs</w:t>
+      </w:r>
+      <w:proofErr w:type="spellEnd"/>
+      <w:r>
+        <w:t xml:space="preserve">. </w:t>
+      </w:r>
+      <w:proofErr w:type="spellStart"/>
+      <w:r>
+        <w:t>The</w:t>
+      </w:r>
+      <w:proofErr w:type="spellEnd"/>
+      <w:r>
+        <w:t xml:space="preserve"> </w:t>
+      </w:r>
+      <w:proofErr w:type="spellStart"/>
+      <w:r>
+        <w:t>results</w:t>
+      </w:r>
+      <w:proofErr w:type="spellEnd"/>
+      <w:r>
+        <w:t xml:space="preserve"> </w:t>
+      </w:r>
+      <w:proofErr w:type="spellStart"/>
+      <w:r>
+        <w:t>obtained</w:t>
+      </w:r>
+      <w:proofErr w:type="spellEnd"/>
+      <w:r>
+        <w:t xml:space="preserve"> </w:t>
+      </w:r>
+      <w:proofErr w:type="spellStart"/>
+      <w:r>
+        <w:t>support</w:t>
+      </w:r>
+      <w:proofErr w:type="spellEnd"/>
+      <w:r>
+        <w:t xml:space="preserve"> </w:t>
+      </w:r>
+      <w:proofErr w:type="spellStart"/>
+      <w:r>
+        <w:t>the</w:t>
+      </w:r>
+      <w:proofErr w:type="spellEnd"/>
+      <w:r>
+        <w:t xml:space="preserve"> </w:t>
+      </w:r>
+      <w:proofErr w:type="spellStart"/>
+      <w:r>
+        <w:t>technical</w:t>
+      </w:r>
+      <w:proofErr w:type="spellEnd"/>
+      <w:r>
+        <w:t xml:space="preserve"> and </w:t>
+      </w:r>
+      <w:proofErr w:type="spellStart"/>
+      <w:r>
+        <w:t>environmental</w:t>
+      </w:r>
+      <w:proofErr w:type="spellEnd"/>
+      <w:r>
+        <w:t xml:space="preserve"> </w:t>
+      </w:r>
+      <w:proofErr w:type="spellStart"/>
+      <w:r>
+        <w:t>feasibility</w:t>
+      </w:r>
+      <w:proofErr w:type="spellEnd"/>
+      <w:r>
+        <w:t xml:space="preserve"> </w:t>
+      </w:r>
+      <w:proofErr w:type="spellStart"/>
+      <w:r>
+        <w:t>of</w:t>
+      </w:r>
+      <w:proofErr w:type="spellEnd"/>
+      <w:r>
+        <w:t xml:space="preserve"> </w:t>
+      </w:r>
+      <w:proofErr w:type="spellStart"/>
+      <w:r>
+        <w:t>this</w:t>
+      </w:r>
+      <w:proofErr w:type="spellEnd"/>
+      <w:r>
+        <w:t xml:space="preserve"> </w:t>
+      </w:r>
+      <w:proofErr w:type="spellStart"/>
+      <w:r>
+        <w:t>proposal</w:t>
+      </w:r>
+      <w:proofErr w:type="spellEnd"/>
+      <w:r>
+        <w:t xml:space="preserve">, </w:t>
+      </w:r>
+      <w:proofErr w:type="spellStart"/>
+      <w:r>
+        <w:t>which</w:t>
+      </w:r>
+      <w:proofErr w:type="spellEnd"/>
+      <w:r>
+        <w:t xml:space="preserve"> </w:t>
+      </w:r>
+      <w:proofErr w:type="spellStart"/>
+      <w:r>
+        <w:t>is</w:t>
+      </w:r>
+      <w:proofErr w:type="spellEnd"/>
+      <w:r>
+        <w:t xml:space="preserve"> </w:t>
+      </w:r>
+      <w:proofErr w:type="spellStart"/>
+      <w:r>
+        <w:t>presented</w:t>
+      </w:r>
+      <w:proofErr w:type="spellEnd"/>
+      <w:r>
+        <w:t xml:space="preserve"> as a </w:t>
+      </w:r>
+      <w:proofErr w:type="spellStart"/>
+      <w:r>
+        <w:t>sustainable</w:t>
+      </w:r>
+      <w:proofErr w:type="spellEnd"/>
+      <w:r>
+        <w:t xml:space="preserve"> and replicable alternative </w:t>
+      </w:r>
+      <w:proofErr w:type="spellStart"/>
+      <w:r>
+        <w:t>for</w:t>
+      </w:r>
+      <w:proofErr w:type="spellEnd"/>
+      <w:r>
+        <w:t xml:space="preserve"> </w:t>
+      </w:r>
+      <w:proofErr w:type="spellStart"/>
+      <w:r>
+        <w:t>the</w:t>
+      </w:r>
+      <w:proofErr w:type="spellEnd"/>
+      <w:r>
+        <w:t xml:space="preserve"> solar </w:t>
+      </w:r>
+      <w:proofErr w:type="spellStart"/>
+      <w:r>
+        <w:t>energy</w:t>
+      </w:r>
+      <w:proofErr w:type="spellEnd"/>
+      <w:r>
+        <w:t xml:space="preserve"> sector in Colombia.</w:t>
       </w:r>
       <w:r>
         <w:br w:type="page"/>
@@ -4870,7 +5737,7 @@
         <w:jc w:val="both"/>
       </w:pPr>
       <w:r>
-        <w:t>El sector panelero en Colombia representa una de las actividades agroindustriales más tradicionales y de mayor relevancia socioeconómica para las comunidades rurales. Sin embargo, este sector enfrenta desafíos relacionados con el manejo eficiente de los recursos naturales, en particular el agua. En los procesos de molienda y producción de panela se generan diariamente volúmenes de agua residual, que en muchos casos superan los 600 litros por día, los cuales son vertidos sin tratamiento y sin posibilidad de ser reutilizados en los cultivos de caña.</w:t>
+        <w:t xml:space="preserve">El sector panelero en Colombia es una de las actividades agroindustriales más tradicionales y significativas para las comunidades rurales. Sin embargo, enfrenta varios desafíos, especialmente en lo que respecta al manejo eficiente de los recursos naturales, sobre todo el agua. Durante los procesos de molienda y producción de panela, se generan diariamente grandes volúmenes de agua residual, que a menudo superan los 600 litros por día. Lamentablemente, esta agua se vierte sin tratamiento y no se puede reutilizar en los cultivos de caña. </w:t>
       </w:r>
     </w:p>
     <w:p>
@@ -4878,7 +5745,23 @@
         <w:jc w:val="both"/>
       </w:pPr>
       <w:r>
-        <w:t>Ante esta problemática, el presente proyecto propone el diseño e implementación de un sistema autónomo de energía solar fotovoltaica que permita operar una planta de tratamiento de agua basada en cavitación, con una autonomía mínima de cuatro horas y sin necesidad de banco de baterías. Adicionalmente, el sistema incorpora una etapa de pre-purificación natural, desarrollada de manera paralela como parte del mismo proyecto, lo que contribuye a optimizar la calidad del agua tratada para su uso agrícola.</w:t>
+        <w:t xml:space="preserve">Para abordar este problema, el proyecto propone diseñar e implementar un sistema autónomo de energía solar fotovoltaica que permita operar una planta de tratamiento de agua mediante cavitación, con una autonomía mínima de cuatro horas y sin necesidad de un banco de baterías. Además, el sistema incluye una etapa de </w:t>
+      </w:r>
+      <w:proofErr w:type="spellStart"/>
+      <w:r>
+        <w:t>pre-purificación</w:t>
+      </w:r>
+      <w:proofErr w:type="spellEnd"/>
+      <w:r>
+        <w:t xml:space="preserve"> natural, que se desarrolla paralelamente como parte del mismo proyecto, lo que ayuda a mejorar la calidad del agua tratada para su uso agrícola. </w:t>
+      </w:r>
+    </w:p>
+    <w:p>
+      <w:pPr>
+        <w:jc w:val="both"/>
+      </w:pPr>
+      <w:r>
+        <w:t>La combinación de energías renovables y tecnologías de tratamiento de agua busca satisfacer las necesidades del sector panelero, ofreciendo una solución replicable, sostenible y de bajo impacto ambiental que fomenta el uso eficiente de los recursos hídricos y energéticos en áreas rurales.</w:t>
       </w:r>
     </w:p>
     <w:p>
@@ -4892,9 +5775,6 @@
         </w:rPr>
       </w:pPr>
       <w:r>
-        <w:t>La combinación de energías renovables y tecnologías de tratamiento de agua busca responder a las necesidades del sector panelero, ofreciendo una solución replicable, sostenible y de bajo impacto ambiental que promueve el aprovechamiento eficiente de los recursos hídricos y energéticos en entornos rurales.</w:t>
-      </w:r>
-      <w:r>
         <w:br w:type="page"/>
       </w:r>
     </w:p>
@@ -4906,48 +5786,151 @@
           <w:numId w:val="24"/>
         </w:numPr>
       </w:pPr>
-      <w:bookmarkStart w:id="3" w:name="_Toc209434263"/>
-      <w:r>
-        <w:t>Justificación</w:t>
+      <w:bookmarkStart w:id="3" w:name="_Toc209434264"/>
+      <w:r>
+        <w:t>Objetivos</w:t>
       </w:r>
       <w:bookmarkEnd w:id="3"/>
     </w:p>
+    <w:p/>
     <w:p>
       <w:pPr>
+        <w:pStyle w:val="Ttulo2"/>
+        <w:numPr>
+          <w:ilvl w:val="1"/>
+          <w:numId w:val="24"/>
+        </w:numPr>
+      </w:pPr>
+      <w:bookmarkStart w:id="4" w:name="_Toc209434265"/>
+      <w:r>
+        <w:t>Objetivo general</w:t>
+      </w:r>
+      <w:bookmarkEnd w:id="4"/>
+    </w:p>
+    <w:p/>
+    <w:p>
+      <w:pPr>
         <w:jc w:val="both"/>
       </w:pPr>
       <w:r>
-        <w:t>La producción panelera es una de las principales fuentes de empleo e ingresos en las zonas rurales colombianas, pero también una actividad que ejerce presión significativa sobre el recurso hídrico. El desperdicio de agua sin tratamiento no solo genera impactos ambientales, sino que también representa una pérdida de insumo crítico para la productividad agrícola.</w:t>
+        <w:t>Diseñar e implementar un sistema autónomo con energía renovable basado en paneles solares, capaz de mantener en operación durante cuatro horas continuas, y sin banco de baterías, una planta de tratamiento de agua mediante cavitación, destinada a la reutilización agrícola en cultivos de caña panelera.</w:t>
       </w:r>
     </w:p>
     <w:p>
       <w:pPr>
         <w:jc w:val="both"/>
       </w:pPr>
-      <w:r>
-        <w:t>El tratamiento de agua mediante cavitación y pre-purificación natural permite reincorporar este recurso al ciclo productivo, destinándolo al riego de caña sin riesgos para la salud humana. No obstante, uno de los retos más importantes es la necesidad de garantizar un suministro energético confiable para operar los equipos de tratamiento (cavitador y bombas).</w:t>
-      </w:r>
     </w:p>
     <w:p>
       <w:pPr>
-        <w:jc w:val="both"/>
-      </w:pPr>
-      <w:r>
-        <w:t>La propuesta de implementar un sistema de energía solar fotovoltaica de operación directa (PV-direct) elimina la dependencia de bancos de baterías, reduciendo costos de inversión, mantenimiento y reemplazo, al mismo tiempo que prolonga la vida útil del sistema. Esto hace viable la solución en contextos rurales donde los recursos económicos son limitados.</w:t>
+        <w:pStyle w:val="Ttulo2"/>
+        <w:numPr>
+          <w:ilvl w:val="1"/>
+          <w:numId w:val="24"/>
+        </w:numPr>
+      </w:pPr>
+      <w:bookmarkStart w:id="5" w:name="_Toc209434266"/>
+      <w:r>
+        <w:t>Objetivos específicos</w:t>
+      </w:r>
+      <w:bookmarkEnd w:id="5"/>
+    </w:p>
+    <w:p/>
+    <w:p>
+      <w:pPr>
+        <w:pStyle w:val="Prrafodelista"/>
+        <w:numPr>
+          <w:ilvl w:val="0"/>
+          <w:numId w:val="25"/>
+        </w:numPr>
+      </w:pPr>
+      <w:r>
+        <w:t>Empalmar con las actividades previamente desarrolladas en el proyecto, incorporando el análisis de los componentes seleccionados (inversor, sistema de control de bombas por nivel, entre otros).</w:t>
       </w:r>
     </w:p>
     <w:p>
       <w:pPr>
-        <w:jc w:val="both"/>
-        <w:rPr>
-          <w:rFonts w:asciiTheme="majorHAnsi" w:eastAsiaTheme="majorEastAsia" w:hAnsiTheme="majorHAnsi" w:cstheme="majorBidi"/>
-          <w:color w:val="000000" w:themeColor="text1"/>
-          <w:sz w:val="40"/>
-          <w:szCs w:val="40"/>
-        </w:rPr>
-      </w:pPr>
-      <w:r>
-        <w:t>En este sentido, el proyecto no solo atiende una problemática ambiental y productiva, sino que también contribuye a la innovación tecnológica en el sector agroindustrial, generando un modelo de referencia para futuras aplicaciones en otras comunidades rurales del país.</w:t>
+        <w:pStyle w:val="Prrafodelista"/>
+      </w:pPr>
+    </w:p>
+    <w:p>
+      <w:pPr>
+        <w:pStyle w:val="Prrafodelista"/>
+        <w:numPr>
+          <w:ilvl w:val="0"/>
+          <w:numId w:val="25"/>
+        </w:numPr>
+      </w:pPr>
+      <w:r>
+        <w:t>Validar técnica y funcionalmente los paneles solares a través de inspección y pruebas iniciales.</w:t>
+      </w:r>
+    </w:p>
+    <w:p>
+      <w:pPr>
+        <w:pStyle w:val="Prrafodelista"/>
+      </w:pPr>
+    </w:p>
+    <w:p>
+      <w:pPr>
+        <w:pStyle w:val="Prrafodelista"/>
+        <w:numPr>
+          <w:ilvl w:val="0"/>
+          <w:numId w:val="25"/>
+        </w:numPr>
+      </w:pPr>
+      <w:r>
+        <w:t>Apoyar en el diseño, ensamble y pruebas de la caja de automatización del sistema, participando en la integración de los motores y proponiendo mejoras para optimizar el control y la confiabilidad del sistema.</w:t>
+      </w:r>
+    </w:p>
+    <w:p>
+      <w:pPr>
+        <w:pStyle w:val="Prrafodelista"/>
+      </w:pPr>
+    </w:p>
+    <w:p>
+      <w:pPr>
+        <w:pStyle w:val="Prrafodelista"/>
+        <w:numPr>
+          <w:ilvl w:val="0"/>
+          <w:numId w:val="25"/>
+        </w:numPr>
+      </w:pPr>
+      <w:r>
+        <w:t>Realizar pruebas en laboratorio y en sitio para verificar el correcto funcionamiento del sistema autónomo durante cuatro horas de operación.</w:t>
+      </w:r>
+    </w:p>
+    <w:p>
+      <w:pPr>
+        <w:pStyle w:val="Prrafodelista"/>
+      </w:pPr>
+    </w:p>
+    <w:p>
+      <w:pPr>
+        <w:pStyle w:val="Prrafodelista"/>
+        <w:numPr>
+          <w:ilvl w:val="0"/>
+          <w:numId w:val="25"/>
+        </w:numPr>
+      </w:pPr>
+      <w:r>
+        <w:t>Elaborar manuales técnicos y de usuario que permitan la correcta operación y mantenimiento del sistema por parte del personal del trapiche.</w:t>
+      </w:r>
+    </w:p>
+    <w:p>
+      <w:pPr>
+        <w:pStyle w:val="Prrafodelista"/>
+      </w:pPr>
+    </w:p>
+    <w:p>
+      <w:pPr>
+        <w:pStyle w:val="Prrafodelista"/>
+        <w:numPr>
+          <w:ilvl w:val="0"/>
+          <w:numId w:val="25"/>
+        </w:numPr>
+      </w:pPr>
+      <w:r>
+        <w:t>Presentar y socializar los resultados en espacios académicos y ante las comunidades beneficiarias.</w:t>
       </w:r>
       <w:r>
         <w:br w:type="page"/>
@@ -4961,11 +5944,11 @@
           <w:numId w:val="24"/>
         </w:numPr>
       </w:pPr>
-      <w:bookmarkStart w:id="4" w:name="_Toc209434264"/>
-      <w:r>
-        <w:t>Objetivos</w:t>
-      </w:r>
-      <w:bookmarkEnd w:id="4"/>
+      <w:bookmarkStart w:id="6" w:name="_Toc209434267"/>
+      <w:r>
+        <w:t>Marco Teórico</w:t>
+      </w:r>
+      <w:bookmarkEnd w:id="6"/>
     </w:p>
     <w:p/>
     <w:p>
@@ -4976,19 +5959,93 @@
           <w:numId w:val="24"/>
         </w:numPr>
       </w:pPr>
-      <w:bookmarkStart w:id="5" w:name="_Toc209434265"/>
-      <w:r>
-        <w:t>Objetivo general</w:t>
-      </w:r>
-      <w:bookmarkEnd w:id="5"/>
+      <w:bookmarkStart w:id="7" w:name="_Toc209434268"/>
+      <w:r>
+        <w:t>Cavitación hidrodinámica aplicada al tratamiento de agua</w:t>
+      </w:r>
+      <w:bookmarkEnd w:id="7"/>
     </w:p>
-    <w:p/>
     <w:p>
       <w:pPr>
+        <w:rPr>
+          <w:b/>
+          <w:bCs/>
+        </w:rPr>
+      </w:pPr>
+    </w:p>
+    <w:p>
+      <w:pPr>
         <w:jc w:val="both"/>
       </w:pPr>
       <w:r>
-        <w:t>Diseñar e implementar un sistema autónomo con energía renovable basado en paneles solares, capaz de mantener en operación durante cuatro horas continuas, y sin banco de baterías, una planta de tratamiento de agua mediante cavitación, destinada a la reutilización agrícola en cultivos de caña panelera.</w:t>
+        <w:t>La cavitación hidrodinámica (CH) es un fenómeno físico que ocurre cuando un fluido atraviesa una zona de constricción, generando una caída de presión suficiente para que el líquido alcance su presión de vapor. Bajo estas condiciones, se forman microburbujas que posteriormente colapsan de manera violenta, liberando altas presiones, temperaturas y radicales libres que inducen procesos mecánicos, térmicos y químicos en el medio líquido (Gutiérrez-Mosquera, Arias-Giraldo, &amp; Cardona-Naranjo, 2019).</w:t>
+      </w:r>
+    </w:p>
+    <w:p>
+      <w:pPr>
+        <w:jc w:val="both"/>
+      </w:pPr>
+      <w:r>
+        <w:t>En el campo agroindustrial, la cavitación se ha consolidado como una tecnología emergente y no convencional para el tratamiento de productos, subproductos y residuos, debido a su alta eficiencia energética y operativa frente a métodos tradicionales. Sus aplicaciones incluyen la hidrólisis de macromoléculas, la síntesis de biodiesel, el pretratamiento de biomasa, la producción de nano-emulsiones y, de manera destacada, el tratamiento de aguas residuales (Gutiérrez-Mosquera et al., 2019).</w:t>
+      </w:r>
+    </w:p>
+    <w:p>
+      <w:pPr>
+        <w:jc w:val="both"/>
+      </w:pPr>
+      <w:r>
+        <w:t xml:space="preserve">El colapso de las burbujas de cavitación genera una intensa turbulencia y </w:t>
+      </w:r>
+      <w:proofErr w:type="spellStart"/>
+      <w:r>
+        <w:t>micro</w:t>
+      </w:r>
+      <w:r>
+        <w:t>-</w:t>
+      </w:r>
+      <w:r>
+        <w:t>chorros</w:t>
+      </w:r>
+      <w:proofErr w:type="spellEnd"/>
+      <w:r>
+        <w:t xml:space="preserve"> que favorecen la desinfección de matrices líquidas y la reducción de contaminantes. Este mecanismo es particularmente útil en aguas agroindustriales, donde permite disminuir la turbidez, sólidos suspendidos y carga microbiológica sin necesidad de reactivos químicos externos, lo cual reduce costos y minimiza impactos ambientales.</w:t>
+      </w:r>
+    </w:p>
+    <w:p>
+      <w:pPr>
+        <w:jc w:val="both"/>
+      </w:pPr>
+      <w:r>
+        <w:t>La eficiencia del proceso depende de variables como la velocidad del flujo, la presión diferencial, el diseño geométrico del dispositivo (</w:t>
+      </w:r>
+      <w:proofErr w:type="spellStart"/>
+      <w:r>
+        <w:t>venturi</w:t>
+      </w:r>
+      <w:proofErr w:type="spellEnd"/>
+      <w:r>
+        <w:t>, placas perforadas u orificios) y las condiciones de operación. En este sentido, la cavitación hidrodinámica presenta ventajas frente a la cavitación ultrasónica, ya que permite mayor escalabilidad y volumen de tratamiento con menor consumo energético (Gutiérrez-Mosquera et al., 2019).</w:t>
+      </w:r>
+    </w:p>
+    <w:p>
+      <w:pPr>
+        <w:jc w:val="both"/>
+      </w:pPr>
+    </w:p>
+    <w:p>
+      <w:pPr>
+        <w:jc w:val="both"/>
+      </w:pPr>
+      <w:r>
+        <w:t xml:space="preserve">En el contexto de este proyecto, la cavitación constituye la etapa central del sistema de purificación, ya que permite acondicionar hasta 600 litros de agua al día provenientes del trapiche panelero para su reutilización en riego agrícola. El control y la operación estable del </w:t>
+      </w:r>
+      <w:proofErr w:type="spellStart"/>
+      <w:r>
+        <w:t>cavitador</w:t>
+      </w:r>
+      <w:proofErr w:type="spellEnd"/>
+      <w:r>
+        <w:t xml:space="preserve"> dependen directamente de la alimentación energética suministrada por el sistema fotovoltaico y regulada por la caja de automatización, lo cual vincula estrechamente esta tecnología con los objetivos de la ingeniería electrónica aplicada al tratamiento sostenible del agua.</w:t>
       </w:r>
     </w:p>
     <w:p>
@@ -5004,243 +6061,107 @@
           <w:numId w:val="24"/>
         </w:numPr>
       </w:pPr>
-      <w:bookmarkStart w:id="6" w:name="_Toc209434266"/>
-      <w:r>
-        <w:t>Objetivos específicos</w:t>
-      </w:r>
-      <w:bookmarkEnd w:id="6"/>
+      <w:bookmarkStart w:id="8" w:name="_Toc209434269"/>
+      <w:r>
+        <w:t>Sistemas fotovoltaicos sin banco de baterías (</w:t>
+      </w:r>
+      <w:proofErr w:type="spellStart"/>
+      <w:r>
+        <w:t>direct-coupled</w:t>
+      </w:r>
+      <w:proofErr w:type="spellEnd"/>
+      <w:r>
+        <w:t>) y control de motores</w:t>
+      </w:r>
+      <w:bookmarkEnd w:id="8"/>
     </w:p>
     <w:p/>
     <w:p>
       <w:pPr>
-        <w:pStyle w:val="Prrafodelista"/>
-        <w:numPr>
-          <w:ilvl w:val="0"/>
-          <w:numId w:val="25"/>
-        </w:numPr>
-      </w:pPr>
-      <w:r>
-        <w:t>Empalmar con las actividades previamente desarrolladas en el proyecto, incorporando el análisis de los componentes seleccionados (inversor, sistema de control de bombas por nivel, entre otros).</w:t>
+        <w:jc w:val="both"/>
+      </w:pPr>
+      <w:r>
+        <w:t>La energía fotovoltaica se ha consolidado como una de las tecnologías renovables de mayor crecimiento a nivel mundial. Según el informe del Fraunhofer ISE (</w:t>
+      </w:r>
+      <w:proofErr w:type="spellStart"/>
+      <w:r>
+        <w:t>Photovoltaics</w:t>
+      </w:r>
+      <w:proofErr w:type="spellEnd"/>
+      <w:r>
+        <w:t xml:space="preserve"> </w:t>
+      </w:r>
+      <w:proofErr w:type="spellStart"/>
+      <w:r>
+        <w:t>Report</w:t>
+      </w:r>
+      <w:proofErr w:type="spellEnd"/>
+      <w:r>
+        <w:t>), la tasa de crecimiento anual compuesta (CAGR) de las instalaciones fotovoltaicas fue de aproximadamente 27 % entre 2014 y 2024, lo que evidencia la rápida expansión y maduración de este sector (</w:t>
+      </w:r>
+      <w:proofErr w:type="spellStart"/>
+      <w:r>
+        <w:t>Philipps</w:t>
+      </w:r>
+      <w:proofErr w:type="spellEnd"/>
+      <w:r>
+        <w:t xml:space="preserve"> &amp; </w:t>
+      </w:r>
+      <w:proofErr w:type="spellStart"/>
+      <w:r>
+        <w:t>Warmuth</w:t>
+      </w:r>
+      <w:proofErr w:type="spellEnd"/>
+      <w:r>
+        <w:t>, 2025).</w:t>
       </w:r>
     </w:p>
     <w:p>
       <w:pPr>
-        <w:pStyle w:val="Prrafodelista"/>
-      </w:pPr>
+        <w:jc w:val="both"/>
+      </w:pPr>
+      <w:r>
+        <w:t xml:space="preserve">Dentro de los esquemas de integración fotovoltaica, los sistemas </w:t>
+      </w:r>
+      <w:proofErr w:type="spellStart"/>
+      <w:r>
+        <w:t>direct-coupled</w:t>
+      </w:r>
+      <w:proofErr w:type="spellEnd"/>
+      <w:r>
+        <w:t xml:space="preserve"> (PV-</w:t>
+      </w:r>
+      <w:proofErr w:type="spellStart"/>
+      <w:r>
+        <w:t>direct</w:t>
+      </w:r>
+      <w:proofErr w:type="spellEnd"/>
+      <w:r>
+        <w:t xml:space="preserve">) representan una alternativa eficiente para aplicaciones donde se requiere el suministro energético durante las horas de irradiancia solar, evitando la inclusión de bancos de baterías. En este tipo de configuración, la energía generada por los paneles es consumida directamente por las cargas (en este caso, motores y </w:t>
+      </w:r>
+      <w:proofErr w:type="spellStart"/>
+      <w:r>
+        <w:t>cavitador</w:t>
+      </w:r>
+      <w:proofErr w:type="spellEnd"/>
+      <w:r>
+        <w:t>), reduciendo costos de inversión, mantenimiento y mitigando los problemas ambientales asociados al ciclo de vida de las baterías.</w:t>
+      </w:r>
     </w:p>
     <w:p>
       <w:pPr>
-        <w:pStyle w:val="Prrafodelista"/>
-        <w:numPr>
-          <w:ilvl w:val="0"/>
-          <w:numId w:val="25"/>
-        </w:numPr>
-      </w:pPr>
-      <w:r>
-        <w:t>Validar técnica y funcionalmente los paneles solares a través de inspección y pruebas iniciales.</w:t>
-      </w:r>
-    </w:p>
-    <w:p>
-      <w:pPr>
-        <w:pStyle w:val="Prrafodelista"/>
-      </w:pPr>
-    </w:p>
-    <w:p>
-      <w:pPr>
-        <w:pStyle w:val="Prrafodelista"/>
-        <w:numPr>
-          <w:ilvl w:val="0"/>
-          <w:numId w:val="25"/>
-        </w:numPr>
-      </w:pPr>
-      <w:r>
-        <w:t>Apoyar en el diseño, ensamble y pruebas de la caja de automatización del sistema, participando en la integración de los motores y proponiendo mejoras para optimizar el control y la confiabilidad del sistema.</w:t>
-      </w:r>
-    </w:p>
-    <w:p>
-      <w:pPr>
-        <w:pStyle w:val="Prrafodelista"/>
-      </w:pPr>
-    </w:p>
-    <w:p>
-      <w:pPr>
-        <w:pStyle w:val="Prrafodelista"/>
-        <w:numPr>
-          <w:ilvl w:val="0"/>
-          <w:numId w:val="25"/>
-        </w:numPr>
-      </w:pPr>
-      <w:r>
-        <w:t>Realizar pruebas en laboratorio y en sitio para verificar el correcto funcionamiento del sistema autónomo durante cuatro horas de operación.</w:t>
-      </w:r>
-    </w:p>
-    <w:p>
-      <w:pPr>
-        <w:pStyle w:val="Prrafodelista"/>
-      </w:pPr>
-    </w:p>
-    <w:p>
-      <w:pPr>
-        <w:pStyle w:val="Prrafodelista"/>
-        <w:numPr>
-          <w:ilvl w:val="0"/>
-          <w:numId w:val="25"/>
-        </w:numPr>
-      </w:pPr>
-      <w:r>
-        <w:t>Elaborar manuales técnicos y de usuario que permitan la correcta operación y mantenimiento del sistema por parte del personal del trapiche.</w:t>
-      </w:r>
-    </w:p>
-    <w:p>
-      <w:pPr>
-        <w:pStyle w:val="Prrafodelista"/>
-      </w:pPr>
-    </w:p>
-    <w:p>
-      <w:pPr>
-        <w:pStyle w:val="Prrafodelista"/>
-        <w:numPr>
-          <w:ilvl w:val="0"/>
-          <w:numId w:val="25"/>
-        </w:numPr>
-      </w:pPr>
-      <w:r>
-        <w:t>Presentar y socializar los resultados en espacios académicos y ante las comunidades beneficiarias.</w:t>
-      </w:r>
-      <w:r>
-        <w:br w:type="page"/>
-      </w:r>
-    </w:p>
-    <w:p>
-      <w:pPr>
-        <w:pStyle w:val="Ttulo1"/>
-        <w:numPr>
-          <w:ilvl w:val="0"/>
-          <w:numId w:val="24"/>
-        </w:numPr>
-      </w:pPr>
-      <w:bookmarkStart w:id="7" w:name="_Toc209434267"/>
-      <w:r>
-        <w:t>Marco Teórico</w:t>
-      </w:r>
-      <w:bookmarkEnd w:id="7"/>
-    </w:p>
-    <w:p/>
-    <w:p>
-      <w:pPr>
-        <w:pStyle w:val="Ttulo2"/>
-        <w:numPr>
-          <w:ilvl w:val="1"/>
-          <w:numId w:val="24"/>
-        </w:numPr>
-      </w:pPr>
-      <w:bookmarkStart w:id="8" w:name="_Toc209434268"/>
-      <w:r>
-        <w:t>Cavitación hidrodinámica aplicada al tratamiento de agua</w:t>
-      </w:r>
-      <w:bookmarkEnd w:id="8"/>
-    </w:p>
-    <w:p>
-      <w:pPr>
-        <w:rPr>
-          <w:b/>
-          <w:bCs/>
-        </w:rPr>
-      </w:pPr>
-    </w:p>
-    <w:p>
-      <w:pPr>
         <w:jc w:val="both"/>
       </w:pPr>
       <w:r>
-        <w:t>La cavitación hidrodinámica (CH) es un fenómeno físico que ocurre cuando un fluido atraviesa una zona de constricción, generando una caída de presión suficiente para que el líquido alcance su presión de vapor. Bajo estas condiciones, se forman microburbujas que posteriormente colapsan de manera violenta, liberando altas presiones, temperaturas y radicales libres que inducen procesos mecánicos, térmicos y químicos en el medio líquido (Gutiérrez-Mosquera, Arias-Giraldo, &amp; Cardona-Naranjo, 2019).</w:t>
-      </w:r>
-    </w:p>
-    <w:p>
-      <w:pPr>
-        <w:jc w:val="both"/>
-      </w:pPr>
-      <w:r>
-        <w:t>En el campo agroindustrial, la cavitación se ha consolidado como una tecnología emergente y no convencional para el tratamiento de productos, subproductos y residuos, debido a su alta eficiencia energética y operativa frente a métodos tradicionales. Sus aplicaciones incluyen la hidrólisis de macromoléculas, la síntesis de biodiesel, el pretratamiento de biomasa, la producción de nano-emulsiones y, de manera destacada, el tratamiento de aguas residuales (Gutiérrez-Mosquera et al., 2019).</w:t>
-      </w:r>
-    </w:p>
-    <w:p>
-      <w:pPr>
-        <w:jc w:val="both"/>
-      </w:pPr>
-      <w:r>
-        <w:t>El colapso de las burbujas de cavitación genera una intensa turbulencia y micro</w:t>
-      </w:r>
-      <w:r>
-        <w:t>-</w:t>
-      </w:r>
-      <w:r>
-        <w:t>chorros que favorecen la desinfección de matrices líquidas y la reducción de contaminantes. Este mecanismo es particularmente útil en aguas agroindustriales, donde permite disminuir la turbidez, sólidos suspendidos y carga microbiológica sin necesidad de reactivos químicos externos, lo cual reduce costos y minimiza impactos ambientales.</w:t>
-      </w:r>
-    </w:p>
-    <w:p>
-      <w:pPr>
-        <w:jc w:val="both"/>
-      </w:pPr>
-      <w:r>
-        <w:t>La eficiencia del proceso depende de variables como la velocidad del flujo, la presión diferencial, el diseño geométrico del dispositivo (venturi, placas perforadas u orificios) y las condiciones de operación. En este sentido, la cavitación hidrodinámica presenta ventajas frente a la cavitación ultrasónica, ya que permite mayor escalabilidad y volumen de tratamiento con menor consumo energético (Gutiérrez-Mosquera et al., 2019).</w:t>
-      </w:r>
-    </w:p>
-    <w:p>
-      <w:pPr>
-        <w:jc w:val="both"/>
-      </w:pPr>
-    </w:p>
-    <w:p>
-      <w:pPr>
-        <w:jc w:val="both"/>
-      </w:pPr>
-      <w:r>
-        <w:t>En el contexto de este proyecto, la cavitación constituye la etapa central del sistema de purificación, ya que permite acondicionar hasta 600 litros de agua al día provenientes del trapiche panelero para su reutilización en riego agrícola. El control y la operación estable del cavitador dependen directamente de la alimentación energética suministrada por el sistema fotovoltaico y regulada por la caja de automatización, lo cual vincula estrechamente esta tecnología con los objetivos de la ingeniería electrónica aplicada al tratamiento sostenible del agua.</w:t>
-      </w:r>
-    </w:p>
-    <w:p>
-      <w:pPr>
-        <w:jc w:val="both"/>
-      </w:pPr>
-    </w:p>
-    <w:p>
-      <w:pPr>
-        <w:pStyle w:val="Ttulo2"/>
-        <w:numPr>
-          <w:ilvl w:val="1"/>
-          <w:numId w:val="24"/>
-        </w:numPr>
-      </w:pPr>
-      <w:bookmarkStart w:id="9" w:name="_Toc209434269"/>
-      <w:r>
-        <w:t>Sistemas fotovoltaicos sin banco de baterías (direct-coupled) y control de motores</w:t>
-      </w:r>
-      <w:bookmarkEnd w:id="9"/>
-    </w:p>
-    <w:p/>
-    <w:p>
-      <w:pPr>
-        <w:jc w:val="both"/>
-      </w:pPr>
-      <w:r>
-        <w:t>La energía fotovoltaica se ha consolidado como una de las tecnologías renovables de mayor crecimiento a nivel mundial. Según el informe del Fraunhofer ISE (Photovoltaics Report), la tasa de crecimiento anual compuesta (CAGR) de las instalaciones fotovoltaicas fue de aproximadamente 27 % entre 2014 y 2024, lo que evidencia la rápida expansión y maduración de este sector (Philipps &amp; Warmuth, 2025).</w:t>
-      </w:r>
-    </w:p>
-    <w:p>
-      <w:pPr>
-        <w:jc w:val="both"/>
-      </w:pPr>
-      <w:r>
-        <w:t>Dentro de los esquemas de integración fotovoltaica, los sistemas direct-coupled (PV-direct) representan una alternativa eficiente para aplicaciones donde se requiere el suministro energético durante las horas de irradiancia solar, evitando la inclusión de bancos de baterías. En este tipo de configuración, la energía generada por los paneles es consumida directamente por las cargas (en este caso, motores y cavitador), reduciendo costos de inversión, mantenimiento y mitigando los problemas ambientales asociados al ciclo de vida de las baterías.</w:t>
-      </w:r>
-    </w:p>
-    <w:p>
-      <w:pPr>
-        <w:jc w:val="both"/>
-      </w:pPr>
-      <w:r>
-        <w:t>Desde la perspectiva de la ingeniería electrónica, la implementación de sistemas PV-direct presenta retos específicos:</w:t>
+        <w:t>Desde la perspectiva de la ingeniería electrónica, la implementación de sistemas PV-</w:t>
+      </w:r>
+      <w:proofErr w:type="spellStart"/>
+      <w:r>
+        <w:t>direct</w:t>
+      </w:r>
+      <w:proofErr w:type="spellEnd"/>
+      <w:r>
+        <w:t xml:space="preserve"> presenta retos específicos:</w:t>
       </w:r>
     </w:p>
     <w:p>
@@ -5252,7 +6173,7 @@
         </w:numPr>
         <w:jc w:val="both"/>
       </w:pPr>
-      <w:bookmarkStart w:id="10" w:name="_Toc209434270"/>
+      <w:bookmarkStart w:id="9" w:name="_Toc209434270"/>
       <w:r>
         <w:rPr>
           <w:rStyle w:val="Ttulo3Car"/>
@@ -5263,7 +6184,7 @@
         </w:rPr>
         <w:t>Condicionamiento de potencia</w:t>
       </w:r>
-      <w:bookmarkEnd w:id="10"/>
+      <w:bookmarkEnd w:id="9"/>
       <w:r>
         <w:t>: el inversor y el controlador deben garantizar la adaptación entre la curva I-V de los paneles y las necesidades de los motores, incluso bajo variaciones de irradiancia y temperatura.</w:t>
       </w:r>
@@ -5277,7 +6198,7 @@
         </w:numPr>
         <w:jc w:val="both"/>
       </w:pPr>
-      <w:bookmarkStart w:id="11" w:name="_Toc209434271"/>
+      <w:bookmarkStart w:id="10" w:name="_Toc209434271"/>
       <w:r>
         <w:rPr>
           <w:rStyle w:val="Ttulo3Car"/>
@@ -5288,7 +6209,7 @@
         </w:rPr>
         <w:t>Protecciones eléctricas</w:t>
       </w:r>
-      <w:bookmarkEnd w:id="11"/>
+      <w:bookmarkEnd w:id="10"/>
       <w:r>
         <w:rPr>
           <w:b/>
@@ -5309,7 +6230,7 @@
         </w:numPr>
         <w:jc w:val="both"/>
       </w:pPr>
-      <w:bookmarkStart w:id="12" w:name="_Toc209434272"/>
+      <w:bookmarkStart w:id="11" w:name="_Toc209434272"/>
       <w:r>
         <w:rPr>
           <w:rStyle w:val="Ttulo3Car"/>
@@ -5320,7 +6241,7 @@
         </w:rPr>
         <w:t>Control de motores</w:t>
       </w:r>
-      <w:bookmarkEnd w:id="12"/>
+      <w:bookmarkEnd w:id="11"/>
       <w:r>
         <w:t>: para garantizar un arranque progresivo y un funcionamiento estable, se integran algoritmos de control que limitan picos de corriente y aseguran operación en el rango nominal de torque y velocidad.</w:t>
       </w:r>
@@ -5334,7 +6255,7 @@
         </w:numPr>
         <w:jc w:val="both"/>
       </w:pPr>
-      <w:bookmarkStart w:id="13" w:name="_Toc209434273"/>
+      <w:bookmarkStart w:id="12" w:name="_Toc209434273"/>
       <w:r>
         <w:rPr>
           <w:rStyle w:val="Ttulo3Car"/>
@@ -5345,7 +6266,7 @@
         </w:rPr>
         <w:t>Monitoreo en tiempo real</w:t>
       </w:r>
-      <w:bookmarkEnd w:id="13"/>
+      <w:bookmarkEnd w:id="12"/>
       <w:r>
         <w:t>: variables como corriente, voltaje, temperatura y potencia deben registrarse para validar el desempeño del sistema y prevenir fallos.</w:t>
       </w:r>
@@ -5360,7 +6281,15 @@
         <w:jc w:val="both"/>
       </w:pPr>
       <w:r>
-        <w:t>En el contexto del presente proyecto, esta configuración resulta estratégica: permite operar el cavitador y las bombas sin necesidad de almacenamiento intermedio, manteniendo una autonomía mínima de cuatro horas durante condiciones de irradiancia adecuadas. El diseño de la caja de automatización cumple un papel clave, ya que integra tanto los dispositivos de protección como los esquemas de control, asegurando la confiabilidad del sistema en campo.</w:t>
+        <w:t xml:space="preserve">En el contexto del presente proyecto, esta configuración resulta estratégica: permite operar el </w:t>
+      </w:r>
+      <w:proofErr w:type="spellStart"/>
+      <w:r>
+        <w:t>cavitador</w:t>
+      </w:r>
+      <w:proofErr w:type="spellEnd"/>
+      <w:r>
+        <w:t xml:space="preserve"> y las bombas sin necesidad de almacenamiento intermedio, manteniendo una autonomía mínima de cuatro horas durante condiciones de irradiancia adecuadas. El diseño de la caja de automatización cumple un papel clave, ya que integra tanto los dispositivos de protección como los esquemas de control, asegurando la confiabilidad del sistema en campo.</w:t>
       </w:r>
     </w:p>
     <w:p/>
@@ -5372,11 +6301,11 @@
           <w:numId w:val="24"/>
         </w:numPr>
       </w:pPr>
-      <w:bookmarkStart w:id="14" w:name="_Toc209434274"/>
+      <w:bookmarkStart w:id="13" w:name="_Toc209434274"/>
       <w:r>
         <w:t>Normativa y criterios para la reutilización de agua en agricultura</w:t>
       </w:r>
-      <w:bookmarkEnd w:id="14"/>
+      <w:bookmarkEnd w:id="13"/>
     </w:p>
     <w:p/>
     <w:p>
@@ -5406,7 +6335,15 @@
         </w:rPr>
       </w:pPr>
       <w:r>
-        <w:t>Es importante resaltar que dentro del presente proyecto, el componente de ingeniería química fue desarrollado en paralelo, abordando los aspectos normativos y experimentales relacionados con la calidad del agua tratada. Dicho trabajo estableció los parámetros técnicos de referencia —</w:t>
+        <w:t xml:space="preserve">Es importante resaltar </w:t>
+      </w:r>
+      <w:proofErr w:type="gramStart"/>
+      <w:r>
+        <w:t>que</w:t>
+      </w:r>
+      <w:proofErr w:type="gramEnd"/>
+      <w:r>
+        <w:t xml:space="preserve"> dentro del presente proyecto, el componente de ingeniería química fue desarrollado en paralelo, abordando los aspectos normativos y experimentales relacionados con la calidad del agua tratada. Dicho trabajo estableció los parámetros técnicos de referencia —</w:t>
       </w:r>
       <w:r>
         <w:rPr>
@@ -5429,11 +6366,11 @@
           <w:numId w:val="24"/>
         </w:numPr>
       </w:pPr>
-      <w:bookmarkStart w:id="15" w:name="_Toc209434275"/>
+      <w:bookmarkStart w:id="14" w:name="_Toc209434275"/>
       <w:r>
         <w:t>Diseño del Sistema</w:t>
       </w:r>
-      <w:bookmarkEnd w:id="15"/>
+      <w:bookmarkEnd w:id="14"/>
     </w:p>
     <w:p/>
     <w:p>
@@ -5449,7 +6386,15 @@
         <w:jc w:val="both"/>
       </w:pPr>
       <w:r>
-        <w:t>En condiciones normales de operación, la energía es suministrada por el campo fotovoltaico de baja tensión, diseñado para alimentar directamente un inversor de frecuencia (variador BPD), el cual convierte la corriente continua generada por los paneles en corriente alterna trifásica. De este modo, se asegura el arranque y funcionamiento de los tres motores que intervienen en el proceso: el cavitador, la bomba de flujo constante y la bomba de retorno.</w:t>
+        <w:t xml:space="preserve">En condiciones normales de operación, la energía es suministrada por el campo fotovoltaico de baja tensión, diseñado para alimentar directamente un inversor de frecuencia (variador BPD), el cual convierte la corriente continua generada por los paneles en corriente alterna trifásica. De este modo, se asegura el arranque y funcionamiento de los tres motores que intervienen en el proceso: el </w:t>
+      </w:r>
+      <w:proofErr w:type="spellStart"/>
+      <w:r>
+        <w:t>cavitador</w:t>
+      </w:r>
+      <w:proofErr w:type="spellEnd"/>
+      <w:r>
+        <w:t>, la bomba de flujo constante y la bomba de retorno.</w:t>
       </w:r>
     </w:p>
     <w:p>
@@ -5457,7 +6402,15 @@
         <w:jc w:val="both"/>
       </w:pPr>
       <w:r>
-        <w:t>Como medida de seguridad y confiabilidad, el sistema incluye una alimentación alterna de respaldo. En caso de baja radiación solar o variaciones climáticas que comprometan la potencia disponible, el variador conmuta automáticamente a la red eléctrica, evitando que el cavitador pierda continuidad en medio del proceso. Esta redundancia energética garantiza la estabilidad del sistema y la preservación de la calidad del agua tratada.</w:t>
+        <w:t xml:space="preserve">Como medida de seguridad y confiabilidad, el sistema incluye una alimentación alterna de respaldo. En caso de baja radiación solar o variaciones climáticas que comprometan la potencia disponible, el variador conmuta automáticamente a la red eléctrica, evitando que el </w:t>
+      </w:r>
+      <w:proofErr w:type="spellStart"/>
+      <w:r>
+        <w:t>cavitador</w:t>
+      </w:r>
+      <w:proofErr w:type="spellEnd"/>
+      <w:r>
+        <w:t xml:space="preserve"> pierda continuidad en medio del proceso. Esta redundancia energética garantiza la estabilidad del sistema y la preservación de la calidad del agua tratada.</w:t>
       </w:r>
     </w:p>
     <w:p>
@@ -5465,7 +6418,23 @@
         <w:jc w:val="both"/>
       </w:pPr>
       <w:r>
-        <w:t>La caja de automatización constituye el núcleo del sistema, al concentrar los elementos de protección, control y distribución. Está diseñada para gestionar la operación secuencial del cavitador y de la bomba de retorno, a través de un selector manual de funciones, que permite al operador escoger entre dos modos de operación: (i) cavitación para el tratamiento del agua, o (ii) recirculación mediante la bomba de retorno.</w:t>
+        <w:t xml:space="preserve">La caja de automatización constituye el núcleo del sistema, al concentrar los elementos de protección, control y distribución. Está diseñada para gestionar la operación secuencial del </w:t>
+      </w:r>
+      <w:proofErr w:type="spellStart"/>
+      <w:r>
+        <w:t>cavitador</w:t>
+      </w:r>
+      <w:proofErr w:type="spellEnd"/>
+      <w:r>
+        <w:t xml:space="preserve"> y de la bomba de retorno, a través de un selector manual de funciones, que permite al operador escoger entre dos modos de operación: (i) cavitación para el tratamiento del agua, o (</w:t>
+      </w:r>
+      <w:proofErr w:type="spellStart"/>
+      <w:r>
+        <w:t>ii</w:t>
+      </w:r>
+      <w:proofErr w:type="spellEnd"/>
+      <w:r>
+        <w:t>) recirculación mediante la bomba de retorno.</w:t>
       </w:r>
     </w:p>
     <w:p>
@@ -5473,7 +6442,23 @@
         <w:jc w:val="both"/>
       </w:pPr>
       <w:r>
-        <w:t>El sistema incorpora un botón de parada de emergencia, ubicado en la parte frontal, que interrumpe de inmediato la alimentación en caso de falla o situación de riesgo, garantizando la seguridad del operario y de los equipos. Para prevenir sobrecorrientes transitorias en el arranque, se implementó un temporizador con retardo de 10 segundos, de manera que primero se energiza el cavitador y, posteriormente, la bomba de flujo constante. Con ello se evita que ambos arranquen de forma simultánea, reduciendo picos de corriente y prolongando la vida útil de los equipos.</w:t>
+        <w:t xml:space="preserve">El sistema incorpora un botón de parada de emergencia, ubicado en la parte frontal, que interrumpe de inmediato la alimentación en caso de falla o situación de riesgo, garantizando la seguridad del operario y de los equipos. Para prevenir </w:t>
+      </w:r>
+      <w:proofErr w:type="spellStart"/>
+      <w:r>
+        <w:t>sobrecorrientes</w:t>
+      </w:r>
+      <w:proofErr w:type="spellEnd"/>
+      <w:r>
+        <w:t xml:space="preserve"> transitorias en el arranque, se implementó un temporizador con retardo de 10 segundos, de manera que primero se energiza el </w:t>
+      </w:r>
+      <w:proofErr w:type="spellStart"/>
+      <w:r>
+        <w:t>cavitador</w:t>
+      </w:r>
+      <w:proofErr w:type="spellEnd"/>
+      <w:r>
+        <w:t xml:space="preserve"> y, posteriormente, la bomba de flujo constante. Con ello se evita que ambos arranquen de forma simultánea, reduciendo picos de corriente y prolongando la vida útil de los equipos.</w:t>
       </w:r>
     </w:p>
     <w:p>
@@ -5539,11 +6524,11 @@
           <w:numId w:val="24"/>
         </w:numPr>
       </w:pPr>
-      <w:bookmarkStart w:id="16" w:name="_Toc209434276"/>
+      <w:bookmarkStart w:id="15" w:name="_Toc209434276"/>
       <w:r>
         <w:t>Diagrama de bloques y diagrama unifilar</w:t>
       </w:r>
-      <w:bookmarkEnd w:id="16"/>
+      <w:bookmarkEnd w:id="15"/>
     </w:p>
     <w:p/>
     <w:p>
@@ -5561,7 +6546,15 @@
         <w:spacing w:after="0"/>
       </w:pPr>
       <w:r>
-        <w:t>Generación fotovoltaica: campo solar conformado por paneles monocristalinos de 500 Wp cada uno, con tensión nominal de 38.35 V y corriente de 13.04 A, conectados en paralelo.</w:t>
+        <w:t xml:space="preserve">Generación fotovoltaica: campo solar conformado por paneles monocristalinos de 500 </w:t>
+      </w:r>
+      <w:proofErr w:type="spellStart"/>
+      <w:r>
+        <w:t>Wp</w:t>
+      </w:r>
+      <w:proofErr w:type="spellEnd"/>
+      <w:r>
+        <w:t xml:space="preserve"> cada uno, con tensión nominal de 38.35 V y corriente de 13.04 A, conectados en paralelo.</w:t>
       </w:r>
     </w:p>
     <w:p>
@@ -5613,7 +6606,15 @@
         <w:spacing w:after="0"/>
       </w:pPr>
       <w:r>
-        <w:t>Cargas: tres motores eléctricos que garantizan el proceso de tratamiento: cavitador (1 HP), bomba de flujo constante (0.5 HP) y bomba de retorno (1.5 HP).</w:t>
+        <w:t xml:space="preserve">Cargas: tres motores eléctricos que garantizan el proceso de tratamiento: </w:t>
+      </w:r>
+      <w:proofErr w:type="spellStart"/>
+      <w:r>
+        <w:t>cavitador</w:t>
+      </w:r>
+      <w:proofErr w:type="spellEnd"/>
+      <w:r>
+        <w:t xml:space="preserve"> (1 HP), bomba de flujo constante (0.5 HP) y bomba de retorno (1.5 HP).</w:t>
       </w:r>
     </w:p>
     <w:p>
@@ -5622,6 +6623,9 @@
         <w:spacing w:after="0"/>
       </w:pPr>
       <w:r>
+        <w:rPr>
+          <w:noProof/>
+        </w:rPr>
         <w:drawing>
           <wp:inline distT="0" distB="0" distL="0" distR="0" wp14:anchorId="364A510C" wp14:editId="6DE61721">
             <wp:extent cx="5612130" cy="3215005"/>
@@ -5664,7 +6668,7 @@
         <w:pStyle w:val="Descripcin"/>
         <w:jc w:val="center"/>
       </w:pPr>
-      <w:bookmarkStart w:id="17" w:name="_Toc209435268"/>
+      <w:bookmarkStart w:id="16" w:name="_Toc209435268"/>
       <w:r>
         <w:t xml:space="preserve">Figura </w:t>
       </w:r>
@@ -5689,7 +6693,7 @@
       <w:r>
         <w:t xml:space="preserve"> Diagrama de bloques</w:t>
       </w:r>
-      <w:bookmarkEnd w:id="17"/>
+      <w:bookmarkEnd w:id="16"/>
     </w:p>
     <w:p>
       <w:r>
@@ -5899,7 +6903,23 @@
                 <w:sz w:val="22"/>
                 <w:szCs w:val="22"/>
               </w:rPr>
-              <w:t>8 paneles solares monocristalinos de 500 Wp conectados en serie.</w:t>
+              <w:t xml:space="preserve">8 paneles solares monocristalinos de 500 </w:t>
+            </w:r>
+            <w:proofErr w:type="spellStart"/>
+            <w:r>
+              <w:rPr>
+                <w:sz w:val="22"/>
+                <w:szCs w:val="22"/>
+              </w:rPr>
+              <w:t>Wp</w:t>
+            </w:r>
+            <w:proofErr w:type="spellEnd"/>
+            <w:r>
+              <w:rPr>
+                <w:sz w:val="22"/>
+                <w:szCs w:val="22"/>
+              </w:rPr>
+              <w:t xml:space="preserve"> conectados en serie.</w:t>
             </w:r>
           </w:p>
         </w:tc>
@@ -6118,7 +7138,39 @@
                 <w:sz w:val="22"/>
                 <w:szCs w:val="22"/>
               </w:rPr>
-              <w:t>Bomba de 0.5 HP (flujo al cavitador); motor del cavitador 1 HP; bomba de 1.5 HP (transporte al destino final).</w:t>
+              <w:t xml:space="preserve">Bomba de 0.5 HP (flujo al </w:t>
+            </w:r>
+            <w:proofErr w:type="spellStart"/>
+            <w:r>
+              <w:rPr>
+                <w:sz w:val="22"/>
+                <w:szCs w:val="22"/>
+              </w:rPr>
+              <w:t>cavitador</w:t>
+            </w:r>
+            <w:proofErr w:type="spellEnd"/>
+            <w:r>
+              <w:rPr>
+                <w:sz w:val="22"/>
+                <w:szCs w:val="22"/>
+              </w:rPr>
+              <w:t xml:space="preserve">); motor del </w:t>
+            </w:r>
+            <w:proofErr w:type="spellStart"/>
+            <w:r>
+              <w:rPr>
+                <w:sz w:val="22"/>
+                <w:szCs w:val="22"/>
+              </w:rPr>
+              <w:t>cavitador</w:t>
+            </w:r>
+            <w:proofErr w:type="spellEnd"/>
+            <w:r>
+              <w:rPr>
+                <w:sz w:val="22"/>
+                <w:szCs w:val="22"/>
+              </w:rPr>
+              <w:t xml:space="preserve"> 1 HP; bomba de 1.5 HP (transporte al destino final).</w:t>
             </w:r>
           </w:p>
         </w:tc>
@@ -6151,7 +7203,7 @@
         <w:pStyle w:val="Descripcin"/>
         <w:jc w:val="center"/>
       </w:pPr>
-      <w:bookmarkStart w:id="18" w:name="_Toc209436904"/>
+      <w:bookmarkStart w:id="17" w:name="_Toc209436904"/>
       <w:r>
         <w:t xml:space="preserve">Tabla </w:t>
       </w:r>
@@ -6179,13 +7231,16 @@
       <w:r>
         <w:t>Subsistema – Componentes principales – Función.</w:t>
       </w:r>
-      <w:bookmarkEnd w:id="18"/>
+      <w:bookmarkEnd w:id="17"/>
     </w:p>
     <w:p>
       <w:pPr>
         <w:keepNext/>
       </w:pPr>
       <w:r>
+        <w:rPr>
+          <w:noProof/>
+        </w:rPr>
         <w:drawing>
           <wp:inline distT="0" distB="0" distL="0" distR="0" wp14:anchorId="637DE48F" wp14:editId="3411F801">
             <wp:extent cx="5612130" cy="3769415"/>
@@ -6235,7 +7290,7 @@
         <w:pStyle w:val="Descripcin"/>
         <w:jc w:val="center"/>
       </w:pPr>
-      <w:bookmarkStart w:id="19" w:name="_Toc209435269"/>
+      <w:bookmarkStart w:id="18" w:name="_Toc209435269"/>
       <w:r>
         <w:t xml:space="preserve">Figura </w:t>
       </w:r>
@@ -6260,7 +7315,7 @@
       <w:r>
         <w:t xml:space="preserve"> Diagrama unifilar</w:t>
       </w:r>
-      <w:bookmarkEnd w:id="19"/>
+      <w:bookmarkEnd w:id="18"/>
     </w:p>
     <w:p/>
     <w:p>
@@ -6271,11 +7326,11 @@
           <w:numId w:val="24"/>
         </w:numPr>
       </w:pPr>
-      <w:bookmarkStart w:id="20" w:name="_Toc209434277"/>
+      <w:bookmarkStart w:id="19" w:name="_Toc209434277"/>
       <w:r>
         <w:t>Descripción de subsistemas</w:t>
       </w:r>
-      <w:bookmarkEnd w:id="20"/>
+      <w:bookmarkEnd w:id="19"/>
     </w:p>
     <w:p/>
     <w:p>
@@ -6292,15 +7347,23 @@
           <w:numId w:val="35"/>
         </w:numPr>
       </w:pPr>
-      <w:bookmarkStart w:id="21" w:name="_Toc209434278"/>
+      <w:bookmarkStart w:id="20" w:name="_Toc209434278"/>
       <w:r>
         <w:t>Campo de generación fotovoltaica.</w:t>
       </w:r>
-      <w:bookmarkEnd w:id="21"/>
+      <w:bookmarkEnd w:id="20"/>
     </w:p>
     <w:p>
       <w:r>
-        <w:t>Constituido por un arreglo de ocho (8) paneles solares monocristalinos, conectados en serie, con potencia nominal de 500 Wp cada uno. Este campo garantiza la entrega de energía en corriente continua a baja tensión, adecuada para la alimentación directa del variador de frecuencia.</w:t>
+        <w:t xml:space="preserve">Constituido por un arreglo de ocho (8) paneles solares monocristalinos, conectados en serie, con potencia nominal de 500 </w:t>
+      </w:r>
+      <w:proofErr w:type="spellStart"/>
+      <w:r>
+        <w:t>Wp</w:t>
+      </w:r>
+      <w:proofErr w:type="spellEnd"/>
+      <w:r>
+        <w:t xml:space="preserve"> cada uno. Este campo garantiza la entrega de energía en corriente continua a baja tensión, adecuada para la alimentación directa del variador de frecuencia.</w:t>
       </w:r>
     </w:p>
     <w:p/>
@@ -6312,11 +7375,11 @@
           <w:numId w:val="35"/>
         </w:numPr>
       </w:pPr>
-      <w:bookmarkStart w:id="22" w:name="_Toc209434279"/>
+      <w:bookmarkStart w:id="21" w:name="_Toc209434279"/>
       <w:r>
         <w:t>Caja de control y automatización.</w:t>
       </w:r>
-      <w:bookmarkEnd w:id="22"/>
+      <w:bookmarkEnd w:id="21"/>
     </w:p>
     <w:p>
       <w:r>
@@ -6469,11 +7532,11 @@
           <w:numId w:val="35"/>
         </w:numPr>
       </w:pPr>
-      <w:bookmarkStart w:id="23" w:name="_Toc209434280"/>
+      <w:bookmarkStart w:id="22" w:name="_Toc209434280"/>
       <w:r>
         <w:t>Sensores de nivel.</w:t>
       </w:r>
-      <w:bookmarkEnd w:id="23"/>
+      <w:bookmarkEnd w:id="22"/>
     </w:p>
     <w:p>
       <w:r>
@@ -6517,11 +7580,11 @@
           <w:numId w:val="35"/>
         </w:numPr>
       </w:pPr>
-      <w:bookmarkStart w:id="24" w:name="_Toc209434281"/>
+      <w:bookmarkStart w:id="23" w:name="_Toc209434281"/>
       <w:r>
         <w:t>Sistema mecánico de bombeo.</w:t>
       </w:r>
-      <w:bookmarkEnd w:id="24"/>
+      <w:bookmarkEnd w:id="23"/>
     </w:p>
     <w:p>
       <w:r>
@@ -6537,7 +7600,15 @@
         </w:numPr>
       </w:pPr>
       <w:r>
-        <w:t>Bomba de 0.5 HP que alimenta el cavitador.</w:t>
+        <w:t xml:space="preserve">Bomba de 0.5 HP que alimenta el </w:t>
+      </w:r>
+      <w:proofErr w:type="spellStart"/>
+      <w:r>
+        <w:t>cavitador</w:t>
+      </w:r>
+      <w:proofErr w:type="spellEnd"/>
+      <w:r>
+        <w:t>.</w:t>
       </w:r>
     </w:p>
     <w:p>
@@ -6549,7 +7620,15 @@
         </w:numPr>
       </w:pPr>
       <w:r>
-        <w:t>Motor del cavitador de 1 HP, responsable del proceso de implosión de burbujas y tratamiento del agua.</w:t>
+        <w:t xml:space="preserve">Motor del </w:t>
+      </w:r>
+      <w:proofErr w:type="spellStart"/>
+      <w:r>
+        <w:t>cavitador</w:t>
+      </w:r>
+      <w:proofErr w:type="spellEnd"/>
+      <w:r>
+        <w:t xml:space="preserve"> de 1 HP, responsable del proceso de implosión de burbujas y tratamiento del agua.</w:t>
       </w:r>
     </w:p>
     <w:p>
@@ -6579,11 +7658,11 @@
           <w:numId w:val="24"/>
         </w:numPr>
       </w:pPr>
-      <w:bookmarkStart w:id="25" w:name="_Toc209434282"/>
+      <w:bookmarkStart w:id="24" w:name="_Toc209434282"/>
       <w:r>
         <w:t>Dimensionamiento fotovoltaico (paneles, inversor/MPPT en operación sin baterías)</w:t>
       </w:r>
-      <w:bookmarkEnd w:id="25"/>
+      <w:bookmarkEnd w:id="24"/>
     </w:p>
     <w:p/>
     <w:p>
@@ -6933,7 +8012,29 @@
                 <w:lang w:eastAsia="es-CO"/>
                 <w14:ligatures w14:val="none"/>
               </w:rPr>
-              <w:t>450 Wp (típico)</w:t>
+              <w:t xml:space="preserve">450 </w:t>
+            </w:r>
+            <w:proofErr w:type="spellStart"/>
+            <w:r>
+              <w:rPr>
+                <w:rFonts w:ascii="Aptos Narrow" w:eastAsia="Times New Roman" w:hAnsi="Aptos Narrow" w:cs="Times New Roman"/>
+                <w:color w:val="000000"/>
+                <w:kern w:val="0"/>
+                <w:lang w:eastAsia="es-CO"/>
+                <w14:ligatures w14:val="none"/>
+              </w:rPr>
+              <w:t>Wp</w:t>
+            </w:r>
+            <w:proofErr w:type="spellEnd"/>
+            <w:r>
+              <w:rPr>
+                <w:rFonts w:ascii="Aptos Narrow" w:eastAsia="Times New Roman" w:hAnsi="Aptos Narrow" w:cs="Times New Roman"/>
+                <w:color w:val="000000"/>
+                <w:kern w:val="0"/>
+                <w:lang w:eastAsia="es-CO"/>
+                <w14:ligatures w14:val="none"/>
+              </w:rPr>
+              <w:t xml:space="preserve"> (típico)</w:t>
             </w:r>
           </w:p>
         </w:tc>
@@ -7047,8 +8148,20 @@
                 <w:lang w:eastAsia="es-CO"/>
                 <w14:ligatures w14:val="none"/>
               </w:rPr>
-              <w:t>3.6 kWp</w:t>
-            </w:r>
+              <w:t xml:space="preserve">3.6 </w:t>
+            </w:r>
+            <w:proofErr w:type="spellStart"/>
+            <w:r>
+              <w:rPr>
+                <w:rFonts w:ascii="Aptos Narrow" w:eastAsia="Times New Roman" w:hAnsi="Aptos Narrow" w:cs="Times New Roman"/>
+                <w:color w:val="000000"/>
+                <w:kern w:val="0"/>
+                <w:lang w:eastAsia="es-CO"/>
+                <w14:ligatures w14:val="none"/>
+              </w:rPr>
+              <w:t>kWp</w:t>
+            </w:r>
+            <w:proofErr w:type="spellEnd"/>
           </w:p>
         </w:tc>
         <w:tc>
@@ -7083,8 +8196,20 @@
                 <w:lang w:eastAsia="es-CO"/>
                 <w14:ligatures w14:val="none"/>
               </w:rPr>
-              <w:t>8 × 450 Wp</w:t>
-            </w:r>
+              <w:t xml:space="preserve">8 × 450 </w:t>
+            </w:r>
+            <w:proofErr w:type="spellStart"/>
+            <w:r>
+              <w:rPr>
+                <w:rFonts w:ascii="Aptos Narrow" w:eastAsia="Times New Roman" w:hAnsi="Aptos Narrow" w:cs="Times New Roman"/>
+                <w:color w:val="000000"/>
+                <w:kern w:val="0"/>
+                <w:lang w:eastAsia="es-CO"/>
+                <w14:ligatures w14:val="none"/>
+              </w:rPr>
+              <w:t>Wp</w:t>
+            </w:r>
+            <w:proofErr w:type="spellEnd"/>
           </w:p>
         </w:tc>
       </w:tr>
@@ -7125,7 +8250,29 @@
                 <w:lang w:eastAsia="es-CO"/>
                 <w14:ligatures w14:val="none"/>
               </w:rPr>
-              <w:t>Tensión máxima en serie (Vmp)</w:t>
+              <w:t>Tensión máxima en serie (</w:t>
+            </w:r>
+            <w:proofErr w:type="spellStart"/>
+            <w:r>
+              <w:rPr>
+                <w:rFonts w:ascii="Aptos Narrow" w:eastAsia="Times New Roman" w:hAnsi="Aptos Narrow" w:cs="Times New Roman"/>
+                <w:color w:val="000000"/>
+                <w:kern w:val="0"/>
+                <w:lang w:eastAsia="es-CO"/>
+                <w14:ligatures w14:val="none"/>
+              </w:rPr>
+              <w:t>Vmp</w:t>
+            </w:r>
+            <w:proofErr w:type="spellEnd"/>
+            <w:r>
+              <w:rPr>
+                <w:rFonts w:ascii="Aptos Narrow" w:eastAsia="Times New Roman" w:hAnsi="Aptos Narrow" w:cs="Times New Roman"/>
+                <w:color w:val="000000"/>
+                <w:kern w:val="0"/>
+                <w:lang w:eastAsia="es-CO"/>
+                <w14:ligatures w14:val="none"/>
+              </w:rPr>
+              <w:t>)</w:t>
             </w:r>
           </w:p>
         </w:tc>
@@ -7322,7 +8469,7 @@
         <w:pStyle w:val="Descripcin"/>
         <w:jc w:val="center"/>
       </w:pPr>
-      <w:bookmarkStart w:id="26" w:name="_Toc209436905"/>
+      <w:bookmarkStart w:id="25" w:name="_Toc209436905"/>
       <w:r>
         <w:t xml:space="preserve">Tabla </w:t>
       </w:r>
@@ -7350,7 +8497,7 @@
       <w:r>
         <w:t>Parámetros del campo fotovoltaico</w:t>
       </w:r>
-      <w:bookmarkEnd w:id="26"/>
+      <w:bookmarkEnd w:id="25"/>
     </w:p>
     <w:tbl>
       <w:tblPr>
@@ -7933,8 +9080,20 @@
                 <w:lang w:eastAsia="es-CO"/>
                 <w14:ligatures w14:val="none"/>
               </w:rPr>
-              <w:t>12 A</w:t>
-            </w:r>
+              <w:t xml:space="preserve">12 </w:t>
+            </w:r>
+            <w:proofErr w:type="gramStart"/>
+            <w:r>
+              <w:rPr>
+                <w:rFonts w:ascii="Aptos Narrow" w:eastAsia="Times New Roman" w:hAnsi="Aptos Narrow" w:cs="Times New Roman"/>
+                <w:color w:val="000000"/>
+                <w:kern w:val="0"/>
+                <w:lang w:eastAsia="es-CO"/>
+                <w14:ligatures w14:val="none"/>
+              </w:rPr>
+              <w:t>A</w:t>
+            </w:r>
+            <w:proofErr w:type="gramEnd"/>
           </w:p>
         </w:tc>
         <w:tc>
@@ -7964,8 +9123,20 @@
                 <w:lang w:eastAsia="es-CO"/>
                 <w14:ligatures w14:val="none"/>
               </w:rPr>
-              <w:t>12 A</w:t>
-            </w:r>
+              <w:t xml:space="preserve">12 </w:t>
+            </w:r>
+            <w:proofErr w:type="gramStart"/>
+            <w:r>
+              <w:rPr>
+                <w:rFonts w:ascii="Aptos Narrow" w:eastAsia="Times New Roman" w:hAnsi="Aptos Narrow" w:cs="Times New Roman"/>
+                <w:color w:val="000000"/>
+                <w:kern w:val="0"/>
+                <w:lang w:eastAsia="es-CO"/>
+                <w14:ligatures w14:val="none"/>
+              </w:rPr>
+              <w:t>A</w:t>
+            </w:r>
+            <w:proofErr w:type="gramEnd"/>
           </w:p>
         </w:tc>
       </w:tr>
@@ -8173,7 +9344,7 @@
         <w:pStyle w:val="Descripcin"/>
         <w:jc w:val="center"/>
       </w:pPr>
-      <w:bookmarkStart w:id="27" w:name="_Toc209436906"/>
+      <w:bookmarkStart w:id="26" w:name="_Toc209436906"/>
       <w:r>
         <w:t xml:space="preserve">Tabla </w:t>
       </w:r>
@@ -8201,7 +9372,7 @@
       <w:r>
         <w:t>Parámetros del inversor BPD</w:t>
       </w:r>
-      <w:bookmarkEnd w:id="27"/>
+      <w:bookmarkEnd w:id="26"/>
     </w:p>
     <w:p/>
     <w:tbl>
@@ -8417,6 +9588,7 @@
                 <w14:ligatures w14:val="none"/>
               </w:rPr>
             </w:pPr>
+            <w:proofErr w:type="spellStart"/>
             <w:r>
               <w:rPr>
                 <w:rFonts w:ascii="Aptos Narrow" w:eastAsia="Times New Roman" w:hAnsi="Aptos Narrow" w:cs="Times New Roman"/>
@@ -8427,7 +9599,20 @@
                 <w:lang w:eastAsia="es-CO"/>
                 <w14:ligatures w14:val="none"/>
               </w:rPr>
-              <w:t>Cavitador (motor asíncrono)</w:t>
+              <w:t>Cavitador</w:t>
+            </w:r>
+            <w:proofErr w:type="spellEnd"/>
+            <w:r>
+              <w:rPr>
+                <w:rFonts w:ascii="Aptos Narrow" w:eastAsia="Times New Roman" w:hAnsi="Aptos Narrow" w:cs="Times New Roman"/>
+                <w:color w:val="000000"/>
+                <w:kern w:val="0"/>
+                <w:sz w:val="22"/>
+                <w:szCs w:val="22"/>
+                <w:lang w:eastAsia="es-CO"/>
+                <w14:ligatures w14:val="none"/>
+              </w:rPr>
+              <w:t xml:space="preserve"> (motor asíncrono)</w:t>
             </w:r>
           </w:p>
         </w:tc>
@@ -8986,7 +10171,7 @@
         <w:pStyle w:val="Descripcin"/>
         <w:jc w:val="center"/>
       </w:pPr>
-      <w:bookmarkStart w:id="28" w:name="_Toc209436907"/>
+      <w:bookmarkStart w:id="27" w:name="_Toc209436907"/>
       <w:r>
         <w:t xml:space="preserve">Tabla </w:t>
       </w:r>
@@ -9014,11 +10199,19 @@
       <w:r>
         <w:t>Balance de Potencia</w:t>
       </w:r>
-      <w:bookmarkEnd w:id="28"/>
+      <w:bookmarkEnd w:id="27"/>
     </w:p>
     <w:p>
       <w:r>
-        <w:t>El arreglo FV (3.6 kWp) garantiza margen suficiente para alimentar las tres cargas en condiciones nominales de irradiancia. El variador BPD opera en modo directo con protección por baja irradiancia (modo hibernación) y conmutación automática a red en caso de déficit energético.</w:t>
+        <w:t xml:space="preserve">El arreglo FV (3.6 </w:t>
+      </w:r>
+      <w:proofErr w:type="spellStart"/>
+      <w:r>
+        <w:t>kWp</w:t>
+      </w:r>
+      <w:proofErr w:type="spellEnd"/>
+      <w:r>
+        <w:t>) garantiza margen suficiente para alimentar las tres cargas en condiciones nominales de irradiancia. El variador BPD opera en modo directo con protección por baja irradiancia (modo hibernación) y conmutación automática a red en caso de déficit energético.</w:t>
       </w:r>
     </w:p>
     <w:p>
@@ -9077,7 +10270,15 @@
         <w:t>temporizador secuencial (10 s)</w:t>
       </w:r>
       <w:r>
-        <w:t xml:space="preserve"> para evitar arranques simultáneos de cavitador y bomba de flujo, limitando picos de corriente.</w:t>
+        <w:t xml:space="preserve"> para evitar arranques simultáneos de </w:t>
+      </w:r>
+      <w:proofErr w:type="spellStart"/>
+      <w:r>
+        <w:t>cavitador</w:t>
+      </w:r>
+      <w:proofErr w:type="spellEnd"/>
+      <w:r>
+        <w:t xml:space="preserve"> y bomba de flujo, limitando picos de corriente.</w:t>
       </w:r>
     </w:p>
     <w:p>
@@ -9089,7 +10290,23 @@
         <w:spacing w:after="0"/>
       </w:pPr>
       <w:r>
-        <w:t>El BPD integra protección contra sobretensión, subtensión, sobrecorriente, fallo de conexión FV y monitoreo de nivel de agua (funciones P15.11–P15.19).</w:t>
+        <w:t xml:space="preserve">El BPD integra protección contra sobretensión, </w:t>
+      </w:r>
+      <w:proofErr w:type="spellStart"/>
+      <w:r>
+        <w:t>subtensión</w:t>
+      </w:r>
+      <w:proofErr w:type="spellEnd"/>
+      <w:r>
+        <w:t xml:space="preserve">, </w:t>
+      </w:r>
+      <w:proofErr w:type="spellStart"/>
+      <w:r>
+        <w:t>sobrecorriente</w:t>
+      </w:r>
+      <w:proofErr w:type="spellEnd"/>
+      <w:r>
+        <w:t>, fallo de conexión FV y monitoreo de nivel de agua (funciones P15.11–P15.19).</w:t>
       </w:r>
     </w:p>
     <w:p>
@@ -9123,22 +10340,32 @@
           <w:numId w:val="24"/>
         </w:numPr>
       </w:pPr>
-      <w:bookmarkStart w:id="29" w:name="_Toc209434283"/>
-      <w:r>
-        <w:t>Dimensionamiento de potencia para tres motores (cavitador, bomba de flujo constante, bomba de retorno)</w:t>
-      </w:r>
-      <w:bookmarkEnd w:id="29"/>
+      <w:bookmarkStart w:id="28" w:name="_Toc209434283"/>
+      <w:r>
+        <w:t>Dimensionamiento de potencia para tres motores (</w:t>
+      </w:r>
+      <w:proofErr w:type="spellStart"/>
+      <w:r>
+        <w:t>cavitador</w:t>
+      </w:r>
+      <w:proofErr w:type="spellEnd"/>
+      <w:r>
+        <w:t>, bomba de flujo constante, bomba de retorno)</w:t>
+      </w:r>
+      <w:bookmarkEnd w:id="28"/>
     </w:p>
     <w:p/>
     <w:p>
       <w:r>
-        <w:t xml:space="preserve">El sistema de tratamiento requiere la operación coordinada de tres motores eléctricos: el cavitador, la bomba de flujo constante y la bomba de retorno. A </w:t>
-      </w:r>
-      <w:r>
-        <w:t>continuación,</w:t>
-      </w:r>
-      <w:r>
-        <w:t xml:space="preserve"> se presenta el dimensionamiento de cada equipo con base en su potencia nominal, tensión de operación y estimaciones de eficiencia.</w:t>
+        <w:t xml:space="preserve">El sistema de tratamiento requiere la operación coordinada de tres motores eléctricos: el </w:t>
+      </w:r>
+      <w:proofErr w:type="spellStart"/>
+      <w:r>
+        <w:t>cavitador</w:t>
+      </w:r>
+      <w:proofErr w:type="spellEnd"/>
+      <w:r>
+        <w:t>, la bomba de flujo constante y la bomba de retorno. A continuación, se presenta el dimensionamiento de cada equipo con base en su potencia nominal, tensión de operación y estimaciones de eficiencia.</w:t>
       </w:r>
     </w:p>
     <w:p/>
@@ -9478,6 +10705,7 @@
                 <w14:ligatures w14:val="none"/>
               </w:rPr>
             </w:pPr>
+            <w:proofErr w:type="spellStart"/>
             <w:r>
               <w:rPr>
                 <w:rFonts w:ascii="Aptos Narrow" w:eastAsia="Times New Roman" w:hAnsi="Aptos Narrow" w:cs="Times New Roman"/>
@@ -9490,6 +10718,7 @@
               </w:rPr>
               <w:t>Cavitador</w:t>
             </w:r>
+            <w:proofErr w:type="spellEnd"/>
           </w:p>
         </w:tc>
         <w:tc>
@@ -10476,7 +11705,7 @@
         <w:pStyle w:val="Descripcin"/>
         <w:jc w:val="center"/>
       </w:pPr>
-      <w:bookmarkStart w:id="30" w:name="_Toc209436908"/>
+      <w:bookmarkStart w:id="29" w:name="_Toc209436908"/>
       <w:r>
         <w:t xml:space="preserve">Tabla </w:t>
       </w:r>
@@ -10504,7 +11733,7 @@
       <w:r>
         <w:t>Parámetros nominales de los motores</w:t>
       </w:r>
-      <w:bookmarkEnd w:id="30"/>
+      <w:bookmarkEnd w:id="29"/>
     </w:p>
     <w:p>
       <w:pPr>
@@ -10514,12 +11743,13 @@
           <w:numId w:val="24"/>
         </w:numPr>
       </w:pPr>
-      <w:bookmarkStart w:id="31" w:name="_Toc209434284"/>
+      <w:bookmarkStart w:id="30" w:name="_Toc209434284"/>
       <w:r>
         <w:t>Caja de automatización: esquemático, lista de materiales y criterios de montaje</w:t>
       </w:r>
-      <w:bookmarkEnd w:id="31"/>
+      <w:bookmarkEnd w:id="30"/>
     </w:p>
+    <w:p/>
     <w:p>
       <w:pPr>
         <w:pStyle w:val="Ttulo2"/>
@@ -10528,11 +11758,19 @@
           <w:numId w:val="24"/>
         </w:numPr>
       </w:pPr>
-      <w:bookmarkStart w:id="32" w:name="_Toc209434285"/>
-      <w:r>
-        <w:t>Diseño mecánico (soportes de paneles, tuberías y cavitador)</w:t>
-      </w:r>
-      <w:bookmarkEnd w:id="32"/>
+      <w:bookmarkStart w:id="31" w:name="_Toc209434285"/>
+      <w:r>
+        <w:t xml:space="preserve">Diseño mecánico (soportes de paneles, tuberías y </w:t>
+      </w:r>
+      <w:proofErr w:type="spellStart"/>
+      <w:r>
+        <w:t>cavitador</w:t>
+      </w:r>
+      <w:proofErr w:type="spellEnd"/>
+      <w:r>
+        <w:t>)</w:t>
+      </w:r>
+      <w:bookmarkEnd w:id="31"/>
     </w:p>
     <w:p/>
     <w:p>
@@ -10548,11 +11786,11 @@
           <w:numId w:val="24"/>
         </w:numPr>
       </w:pPr>
-      <w:bookmarkStart w:id="33" w:name="_Toc209434286"/>
+      <w:bookmarkStart w:id="32" w:name="_Toc209434286"/>
       <w:r>
         <w:t>Metodología y Cronograma</w:t>
       </w:r>
-      <w:bookmarkEnd w:id="33"/>
+      <w:bookmarkEnd w:id="32"/>
     </w:p>
     <w:p>
       <w:pPr>
@@ -10562,11 +11800,11 @@
           <w:numId w:val="24"/>
         </w:numPr>
       </w:pPr>
-      <w:bookmarkStart w:id="34" w:name="_Toc209434287"/>
+      <w:bookmarkStart w:id="33" w:name="_Toc209434287"/>
       <w:r>
         <w:t>Fases del proyecto</w:t>
       </w:r>
-      <w:bookmarkEnd w:id="34"/>
+      <w:bookmarkEnd w:id="33"/>
     </w:p>
     <w:p>
       <w:pPr>
@@ -10576,11 +11814,11 @@
           <w:numId w:val="24"/>
         </w:numPr>
       </w:pPr>
-      <w:bookmarkStart w:id="35" w:name="_Toc209434288"/>
+      <w:bookmarkStart w:id="34" w:name="_Toc209434288"/>
       <w:r>
         <w:t>Cronograma de actividades (24 semanas)</w:t>
       </w:r>
-      <w:bookmarkEnd w:id="35"/>
+      <w:bookmarkEnd w:id="34"/>
     </w:p>
     <w:p>
       <w:pPr>
@@ -10603,11 +11841,11 @@
           <w:numId w:val="24"/>
         </w:numPr>
       </w:pPr>
-      <w:bookmarkStart w:id="36" w:name="_Toc209434289"/>
+      <w:bookmarkStart w:id="35" w:name="_Toc209434289"/>
       <w:r>
         <w:t>Resultados Experimentales y Pruebas en Laboratorio</w:t>
       </w:r>
-      <w:bookmarkEnd w:id="36"/>
+      <w:bookmarkEnd w:id="35"/>
     </w:p>
     <w:p>
       <w:pPr>
@@ -10617,11 +11855,11 @@
           <w:numId w:val="24"/>
         </w:numPr>
       </w:pPr>
-      <w:bookmarkStart w:id="37" w:name="_Toc209434290"/>
+      <w:bookmarkStart w:id="36" w:name="_Toc209434290"/>
       <w:r>
         <w:t>Mediciones eléctricas</w:t>
       </w:r>
-      <w:bookmarkEnd w:id="37"/>
+      <w:bookmarkEnd w:id="36"/>
     </w:p>
     <w:p>
       <w:pPr>
@@ -10631,11 +11869,11 @@
           <w:numId w:val="24"/>
         </w:numPr>
       </w:pPr>
-      <w:bookmarkStart w:id="38" w:name="_Toc209434291"/>
+      <w:bookmarkStart w:id="37" w:name="_Toc209434291"/>
       <w:r>
         <w:t>Curvas I-V de los paneles solares</w:t>
       </w:r>
-      <w:bookmarkEnd w:id="38"/>
+      <w:bookmarkEnd w:id="37"/>
     </w:p>
     <w:p>
       <w:pPr>
@@ -10645,11 +11883,11 @@
           <w:numId w:val="24"/>
         </w:numPr>
       </w:pPr>
-      <w:bookmarkStart w:id="39" w:name="_Toc209434292"/>
+      <w:bookmarkStart w:id="38" w:name="_Toc209434292"/>
       <w:r>
         <w:t>Consumo de los motores</w:t>
       </w:r>
-      <w:bookmarkEnd w:id="39"/>
+      <w:bookmarkEnd w:id="38"/>
     </w:p>
     <w:p>
       <w:pPr>
@@ -10659,11 +11897,11 @@
           <w:numId w:val="24"/>
         </w:numPr>
       </w:pPr>
-      <w:bookmarkStart w:id="40" w:name="_Toc209434293"/>
+      <w:bookmarkStart w:id="39" w:name="_Toc209434293"/>
       <w:r>
         <w:t>Pruebas de tratamiento de agua (turbidez, TSS, COD/BOD, coliformes, rendimiento de cavitación, etc.)</w:t>
       </w:r>
-      <w:bookmarkEnd w:id="40"/>
+      <w:bookmarkEnd w:id="39"/>
     </w:p>
     <w:p/>
     <w:p>
@@ -10674,11 +11912,11 @@
           <w:numId w:val="24"/>
         </w:numPr>
       </w:pPr>
-      <w:bookmarkStart w:id="41" w:name="_Toc209434294"/>
+      <w:bookmarkStart w:id="40" w:name="_Toc209434294"/>
       <w:r>
         <w:t>Implementación en Sitio y Validación Final</w:t>
       </w:r>
-      <w:bookmarkEnd w:id="41"/>
+      <w:bookmarkEnd w:id="40"/>
     </w:p>
     <w:p>
       <w:pPr>
@@ -10688,11 +11926,11 @@
           <w:numId w:val="24"/>
         </w:numPr>
       </w:pPr>
-      <w:bookmarkStart w:id="42" w:name="_Toc209434295"/>
+      <w:bookmarkStart w:id="41" w:name="_Toc209434295"/>
       <w:r>
         <w:t>Instalación en trapiche panelero</w:t>
       </w:r>
-      <w:bookmarkEnd w:id="42"/>
+      <w:bookmarkEnd w:id="41"/>
     </w:p>
     <w:p>
       <w:pPr>
@@ -10702,11 +11940,11 @@
           <w:numId w:val="24"/>
         </w:numPr>
       </w:pPr>
-      <w:bookmarkStart w:id="43" w:name="_Toc209434296"/>
+      <w:bookmarkStart w:id="42" w:name="_Toc209434296"/>
       <w:r>
         <w:t>Pruebas de autonomía de 4 horas</w:t>
       </w:r>
-      <w:bookmarkEnd w:id="43"/>
+      <w:bookmarkEnd w:id="42"/>
     </w:p>
     <w:p>
       <w:pPr>
@@ -10716,11 +11954,11 @@
           <w:numId w:val="24"/>
         </w:numPr>
       </w:pPr>
-      <w:bookmarkStart w:id="44" w:name="_Toc209434297"/>
+      <w:bookmarkStart w:id="43" w:name="_Toc209434297"/>
       <w:r>
         <w:t>Ajustes técnicos y puesta en marcha</w:t>
       </w:r>
-      <w:bookmarkEnd w:id="44"/>
+      <w:bookmarkEnd w:id="43"/>
     </w:p>
     <w:p>
       <w:pPr>
@@ -10743,11 +11981,11 @@
           <w:numId w:val="24"/>
         </w:numPr>
       </w:pPr>
-      <w:bookmarkStart w:id="45" w:name="_Toc209434298"/>
+      <w:bookmarkStart w:id="44" w:name="_Toc209434298"/>
       <w:r>
         <w:t>Manuales de Operación y Mantenimiento</w:t>
       </w:r>
-      <w:bookmarkEnd w:id="45"/>
+      <w:bookmarkEnd w:id="44"/>
     </w:p>
     <w:p>
       <w:pPr>
@@ -10757,11 +11995,11 @@
           <w:numId w:val="24"/>
         </w:numPr>
       </w:pPr>
-      <w:bookmarkStart w:id="46" w:name="_Toc209434299"/>
+      <w:bookmarkStart w:id="45" w:name="_Toc209434299"/>
       <w:r>
         <w:t>Manual de usuario para el personal del trapiche</w:t>
       </w:r>
-      <w:bookmarkEnd w:id="46"/>
+      <w:bookmarkEnd w:id="45"/>
     </w:p>
     <w:p>
       <w:pPr>
@@ -10771,11 +12009,11 @@
           <w:numId w:val="24"/>
         </w:numPr>
       </w:pPr>
-      <w:bookmarkStart w:id="47" w:name="_Toc209434300"/>
+      <w:bookmarkStart w:id="46" w:name="_Toc209434300"/>
       <w:r>
         <w:t>Manual técnico de operación y mantenimiento</w:t>
       </w:r>
-      <w:bookmarkEnd w:id="47"/>
+      <w:bookmarkEnd w:id="46"/>
     </w:p>
     <w:p>
       <w:pPr>
@@ -10798,11 +12036,11 @@
           <w:numId w:val="24"/>
         </w:numPr>
       </w:pPr>
-      <w:bookmarkStart w:id="48" w:name="_Toc209434301"/>
+      <w:bookmarkStart w:id="47" w:name="_Toc209434301"/>
       <w:r>
         <w:t>Anexos</w:t>
       </w:r>
-      <w:bookmarkEnd w:id="48"/>
+      <w:bookmarkEnd w:id="47"/>
     </w:p>
     <w:p>
       <w:pPr>
@@ -10812,11 +12050,11 @@
           <w:numId w:val="24"/>
         </w:numPr>
       </w:pPr>
-      <w:bookmarkStart w:id="49" w:name="_Toc209434302"/>
+      <w:bookmarkStart w:id="48" w:name="_Toc209434302"/>
       <w:r>
         <w:t>Fotografías documentadas</w:t>
       </w:r>
-      <w:bookmarkEnd w:id="49"/>
+      <w:bookmarkEnd w:id="48"/>
     </w:p>
     <w:p>
       <w:pPr>
@@ -10826,11 +12064,16 @@
           <w:numId w:val="24"/>
         </w:numPr>
       </w:pPr>
-      <w:bookmarkStart w:id="50" w:name="_Toc209434303"/>
-      <w:r>
-        <w:t>Datasheets y hojas técnicas</w:t>
-      </w:r>
-      <w:bookmarkEnd w:id="50"/>
+      <w:bookmarkStart w:id="49" w:name="_Toc209434303"/>
+      <w:proofErr w:type="spellStart"/>
+      <w:r>
+        <w:t>Datasheets</w:t>
+      </w:r>
+      <w:proofErr w:type="spellEnd"/>
+      <w:r>
+        <w:t xml:space="preserve"> y hojas técnicas</w:t>
+      </w:r>
+      <w:bookmarkEnd w:id="49"/>
     </w:p>
     <w:p>
       <w:pPr>
@@ -10840,11 +12083,11 @@
           <w:numId w:val="24"/>
         </w:numPr>
       </w:pPr>
-      <w:bookmarkStart w:id="51" w:name="_Toc209434304"/>
+      <w:bookmarkStart w:id="50" w:name="_Toc209434304"/>
       <w:r>
         <w:t>Códigos/firmware de automatización</w:t>
       </w:r>
-      <w:bookmarkEnd w:id="51"/>
+      <w:bookmarkEnd w:id="50"/>
     </w:p>
     <w:p>
       <w:pPr>
@@ -10854,11 +12097,11 @@
           <w:numId w:val="24"/>
         </w:numPr>
       </w:pPr>
-      <w:bookmarkStart w:id="52" w:name="_Toc209434305"/>
+      <w:bookmarkStart w:id="51" w:name="_Toc209434305"/>
       <w:r>
         <w:t>Planos eléctricos y mecánicos</w:t>
       </w:r>
-      <w:bookmarkEnd w:id="52"/>
+      <w:bookmarkEnd w:id="51"/>
     </w:p>
     <w:p>
       <w:pPr>
@@ -10868,11 +12111,11 @@
           <w:numId w:val="24"/>
         </w:numPr>
       </w:pPr>
-      <w:bookmarkStart w:id="53" w:name="_Toc209434306"/>
+      <w:bookmarkStart w:id="52" w:name="_Toc209434306"/>
       <w:r>
         <w:t>Certificados y facturas</w:t>
       </w:r>
-      <w:bookmarkEnd w:id="53"/>
+      <w:bookmarkEnd w:id="52"/>
     </w:p>
     <w:p>
       <w:pPr>
@@ -10882,11 +12125,11 @@
           <w:numId w:val="24"/>
         </w:numPr>
       </w:pPr>
-      <w:bookmarkStart w:id="54" w:name="_Toc209434307"/>
+      <w:bookmarkStart w:id="53" w:name="_Toc209434307"/>
       <w:r>
         <w:t>Registro de entregas y actas de socialización</w:t>
       </w:r>
-      <w:bookmarkEnd w:id="54"/>
+      <w:bookmarkEnd w:id="53"/>
     </w:p>
     <w:p>
       <w:pPr>
@@ -10912,14 +12155,14 @@
           <w:rStyle w:val="Ttulo1Car"/>
         </w:rPr>
       </w:pPr>
-      <w:bookmarkStart w:id="55" w:name="_Toc209434308"/>
+      <w:bookmarkStart w:id="54" w:name="_Toc209434308"/>
       <w:r>
         <w:rPr>
           <w:rStyle w:val="Ttulo1Car"/>
         </w:rPr>
         <w:t>Referencias Bibliográficas</w:t>
       </w:r>
-      <w:bookmarkEnd w:id="55"/>
+      <w:bookmarkEnd w:id="54"/>
     </w:p>
     <w:p>
       <w:pPr>
@@ -10928,13 +12171,31 @@
       <w:r>
         <w:t xml:space="preserve">Gutiérrez-Mosquera, L. F., Arias-Giraldo, S., &amp; Cardona-Naranjo, D. F. (2019). Cavitación hidrodinámica: un enfoque desde la ingeniería y la agroindustria. </w:t>
       </w:r>
+      <w:proofErr w:type="spellStart"/>
       <w:r>
         <w:rPr>
           <w:i/>
           <w:iCs/>
         </w:rPr>
-        <w:t>Scientia Et Technica</w:t>
-      </w:r>
+        <w:t>Scientia</w:t>
+      </w:r>
+      <w:proofErr w:type="spellEnd"/>
+      <w:r>
+        <w:rPr>
+          <w:i/>
+          <w:iCs/>
+        </w:rPr>
+        <w:t xml:space="preserve"> Et </w:t>
+      </w:r>
+      <w:proofErr w:type="spellStart"/>
+      <w:r>
+        <w:rPr>
+          <w:i/>
+          <w:iCs/>
+        </w:rPr>
+        <w:t>Technica</w:t>
+      </w:r>
+      <w:proofErr w:type="spellEnd"/>
       <w:r>
         <w:t>, 24(2), 283–304. Universidad Tecnológica de</w:t>
       </w:r>
@@ -10961,18 +12222,89 @@
       <w:pPr>
         <w:jc w:val="both"/>
       </w:pPr>
-      <w:r>
-        <w:t xml:space="preserve">Philipps, S., &amp; Warmuth, W. (2025, mayo 29). </w:t>
-      </w:r>
+      <w:proofErr w:type="spellStart"/>
+      <w:r>
+        <w:t>Philipps</w:t>
+      </w:r>
+      <w:proofErr w:type="spellEnd"/>
+      <w:r>
+        <w:t xml:space="preserve">, S., &amp; </w:t>
+      </w:r>
+      <w:proofErr w:type="spellStart"/>
+      <w:r>
+        <w:t>Warmuth</w:t>
+      </w:r>
+      <w:proofErr w:type="spellEnd"/>
+      <w:r>
+        <w:t xml:space="preserve">, W. (2025, mayo 29). </w:t>
+      </w:r>
+      <w:proofErr w:type="spellStart"/>
       <w:r>
         <w:rPr>
           <w:i/>
           <w:iCs/>
         </w:rPr>
-        <w:t>Photovoltaics report</w:t>
-      </w:r>
-      <w:r>
-        <w:t xml:space="preserve">. Fraunhofer Institute for Solar Energy Systems ISE &amp; PSE Projects GmbH. </w:t>
+        <w:t>Photovoltaics</w:t>
+      </w:r>
+      <w:proofErr w:type="spellEnd"/>
+      <w:r>
+        <w:rPr>
+          <w:i/>
+          <w:iCs/>
+        </w:rPr>
+        <w:t xml:space="preserve"> </w:t>
+      </w:r>
+      <w:proofErr w:type="spellStart"/>
+      <w:r>
+        <w:rPr>
+          <w:i/>
+          <w:iCs/>
+        </w:rPr>
+        <w:t>report</w:t>
+      </w:r>
+      <w:proofErr w:type="spellEnd"/>
+      <w:r>
+        <w:t xml:space="preserve">. Fraunhofer </w:t>
+      </w:r>
+      <w:proofErr w:type="spellStart"/>
+      <w:r>
+        <w:t>Institute</w:t>
+      </w:r>
+      <w:proofErr w:type="spellEnd"/>
+      <w:r>
+        <w:t xml:space="preserve"> </w:t>
+      </w:r>
+      <w:proofErr w:type="spellStart"/>
+      <w:r>
+        <w:t>for</w:t>
+      </w:r>
+      <w:proofErr w:type="spellEnd"/>
+      <w:r>
+        <w:t xml:space="preserve"> Solar Energy </w:t>
+      </w:r>
+      <w:proofErr w:type="spellStart"/>
+      <w:r>
+        <w:t>Systems</w:t>
+      </w:r>
+      <w:proofErr w:type="spellEnd"/>
+      <w:r>
+        <w:t xml:space="preserve"> ISE &amp; PSE </w:t>
+      </w:r>
+      <w:proofErr w:type="spellStart"/>
+      <w:r>
+        <w:t>Projects</w:t>
+      </w:r>
+      <w:proofErr w:type="spellEnd"/>
+      <w:r>
+        <w:t xml:space="preserve"> </w:t>
+      </w:r>
+      <w:proofErr w:type="spellStart"/>
+      <w:r>
+        <w:t>GmbH</w:t>
+      </w:r>
+      <w:proofErr w:type="spellEnd"/>
+      <w:r>
+        <w:t xml:space="preserve">. </w:t>
       </w:r>
       <w:hyperlink r:id="rId9" w:tgtFrame="_new" w:history="1">
         <w:r>
@@ -11020,18 +12352,177 @@
         </w:rPr>
         <w:br/>
       </w:r>
-      <w:r>
-        <w:t xml:space="preserve">World Health Organization (WHO). (2006). </w:t>
-      </w:r>
+      <w:proofErr w:type="spellStart"/>
+      <w:r>
+        <w:t>World</w:t>
+      </w:r>
+      <w:proofErr w:type="spellEnd"/>
+      <w:r>
+        <w:t xml:space="preserve"> </w:t>
+      </w:r>
+      <w:proofErr w:type="spellStart"/>
+      <w:r>
+        <w:t>Health</w:t>
+      </w:r>
+      <w:proofErr w:type="spellEnd"/>
+      <w:r>
+        <w:t xml:space="preserve"> </w:t>
+      </w:r>
+      <w:proofErr w:type="spellStart"/>
+      <w:r>
+        <w:t>Organization</w:t>
+      </w:r>
+      <w:proofErr w:type="spellEnd"/>
+      <w:r>
+        <w:t xml:space="preserve"> (WHO). (2006). </w:t>
+      </w:r>
+      <w:proofErr w:type="spellStart"/>
       <w:r>
         <w:rPr>
           <w:i/>
           <w:iCs/>
         </w:rPr>
-        <w:t>Guidelines for the safe use of wastewater, excreta and greywater</w:t>
-      </w:r>
-      <w:r>
-        <w:t xml:space="preserve"> (Vol. 2: Wastewater use in agriculture). World Health Organization. </w:t>
+        <w:t>Guidelines</w:t>
+      </w:r>
+      <w:proofErr w:type="spellEnd"/>
+      <w:r>
+        <w:rPr>
+          <w:i/>
+          <w:iCs/>
+        </w:rPr>
+        <w:t xml:space="preserve"> </w:t>
+      </w:r>
+      <w:proofErr w:type="spellStart"/>
+      <w:r>
+        <w:rPr>
+          <w:i/>
+          <w:iCs/>
+        </w:rPr>
+        <w:t>for</w:t>
+      </w:r>
+      <w:proofErr w:type="spellEnd"/>
+      <w:r>
+        <w:rPr>
+          <w:i/>
+          <w:iCs/>
+        </w:rPr>
+        <w:t xml:space="preserve"> </w:t>
+      </w:r>
+      <w:proofErr w:type="spellStart"/>
+      <w:r>
+        <w:rPr>
+          <w:i/>
+          <w:iCs/>
+        </w:rPr>
+        <w:t>the</w:t>
+      </w:r>
+      <w:proofErr w:type="spellEnd"/>
+      <w:r>
+        <w:rPr>
+          <w:i/>
+          <w:iCs/>
+        </w:rPr>
+        <w:t xml:space="preserve"> </w:t>
+      </w:r>
+      <w:proofErr w:type="spellStart"/>
+      <w:r>
+        <w:rPr>
+          <w:i/>
+          <w:iCs/>
+        </w:rPr>
+        <w:t>safe</w:t>
+      </w:r>
+      <w:proofErr w:type="spellEnd"/>
+      <w:r>
+        <w:rPr>
+          <w:i/>
+          <w:iCs/>
+        </w:rPr>
+        <w:t xml:space="preserve"> use </w:t>
+      </w:r>
+      <w:proofErr w:type="spellStart"/>
+      <w:r>
+        <w:rPr>
+          <w:i/>
+          <w:iCs/>
+        </w:rPr>
+        <w:t>of</w:t>
+      </w:r>
+      <w:proofErr w:type="spellEnd"/>
+      <w:r>
+        <w:rPr>
+          <w:i/>
+          <w:iCs/>
+        </w:rPr>
+        <w:t xml:space="preserve"> </w:t>
+      </w:r>
+      <w:proofErr w:type="spellStart"/>
+      <w:r>
+        <w:rPr>
+          <w:i/>
+          <w:iCs/>
+        </w:rPr>
+        <w:t>wastewater</w:t>
+      </w:r>
+      <w:proofErr w:type="spellEnd"/>
+      <w:r>
+        <w:rPr>
+          <w:i/>
+          <w:iCs/>
+        </w:rPr>
+        <w:t xml:space="preserve">, excreta and </w:t>
+      </w:r>
+      <w:proofErr w:type="spellStart"/>
+      <w:r>
+        <w:rPr>
+          <w:i/>
+          <w:iCs/>
+        </w:rPr>
+        <w:t>greywater</w:t>
+      </w:r>
+      <w:proofErr w:type="spellEnd"/>
+      <w:r>
+        <w:t xml:space="preserve"> (Vol. 2: </w:t>
+      </w:r>
+      <w:proofErr w:type="spellStart"/>
+      <w:r>
+        <w:t>Wastewater</w:t>
+      </w:r>
+      <w:proofErr w:type="spellEnd"/>
+      <w:r>
+        <w:t xml:space="preserve"> use in </w:t>
+      </w:r>
+      <w:proofErr w:type="spellStart"/>
+      <w:r>
+        <w:t>agriculture</w:t>
+      </w:r>
+      <w:proofErr w:type="spellEnd"/>
+      <w:r>
+        <w:t xml:space="preserve">). </w:t>
+      </w:r>
+      <w:proofErr w:type="spellStart"/>
+      <w:r>
+        <w:t>World</w:t>
+      </w:r>
+      <w:proofErr w:type="spellEnd"/>
+      <w:r>
+        <w:t xml:space="preserve"> </w:t>
+      </w:r>
+      <w:proofErr w:type="spellStart"/>
+      <w:r>
+        <w:t>Health</w:t>
+      </w:r>
+      <w:proofErr w:type="spellEnd"/>
+      <w:r>
+        <w:t xml:space="preserve"> </w:t>
+      </w:r>
+      <w:proofErr w:type="spellStart"/>
+      <w:r>
+        <w:t>Organization</w:t>
+      </w:r>
+      <w:proofErr w:type="spellEnd"/>
+      <w:r>
+        <w:t xml:space="preserve">. </w:t>
       </w:r>
       <w:hyperlink r:id="rId10" w:tgtFrame="_new" w:history="1">
         <w:r>
@@ -11068,17 +12559,114 @@
       </w:r>
       <w:r>
         <w:br/>
-        <w:t xml:space="preserve">Food and Agriculture Organization (FAO). (2010). </w:t>
-      </w:r>
+      </w:r>
+      <w:proofErr w:type="spellStart"/>
+      <w:r>
+        <w:t>Food</w:t>
+      </w:r>
+      <w:proofErr w:type="spellEnd"/>
+      <w:r>
+        <w:t xml:space="preserve"> and </w:t>
+      </w:r>
+      <w:proofErr w:type="spellStart"/>
+      <w:r>
+        <w:t>Agriculture</w:t>
+      </w:r>
+      <w:proofErr w:type="spellEnd"/>
+      <w:r>
+        <w:t xml:space="preserve"> </w:t>
+      </w:r>
+      <w:proofErr w:type="spellStart"/>
+      <w:r>
+        <w:t>Organization</w:t>
+      </w:r>
+      <w:proofErr w:type="spellEnd"/>
+      <w:r>
+        <w:t xml:space="preserve"> (FAO). (2010). </w:t>
+      </w:r>
+      <w:proofErr w:type="spellStart"/>
       <w:r>
         <w:rPr>
           <w:i/>
           <w:iCs/>
         </w:rPr>
-        <w:t>Water quality for agriculture</w:t>
-      </w:r>
-      <w:r>
-        <w:t xml:space="preserve"> (FAO Irrigation and Drainage Paper 29, Rev. 1). FAO.</w:t>
+        <w:t>Water</w:t>
+      </w:r>
+      <w:proofErr w:type="spellEnd"/>
+      <w:r>
+        <w:rPr>
+          <w:i/>
+          <w:iCs/>
+        </w:rPr>
+        <w:t xml:space="preserve"> </w:t>
+      </w:r>
+      <w:proofErr w:type="spellStart"/>
+      <w:r>
+        <w:rPr>
+          <w:i/>
+          <w:iCs/>
+        </w:rPr>
+        <w:t>quality</w:t>
+      </w:r>
+      <w:proofErr w:type="spellEnd"/>
+      <w:r>
+        <w:rPr>
+          <w:i/>
+          <w:iCs/>
+        </w:rPr>
+        <w:t xml:space="preserve"> </w:t>
+      </w:r>
+      <w:proofErr w:type="spellStart"/>
+      <w:r>
+        <w:rPr>
+          <w:i/>
+          <w:iCs/>
+        </w:rPr>
+        <w:t>for</w:t>
+      </w:r>
+      <w:proofErr w:type="spellEnd"/>
+      <w:r>
+        <w:rPr>
+          <w:i/>
+          <w:iCs/>
+        </w:rPr>
+        <w:t xml:space="preserve"> </w:t>
+      </w:r>
+      <w:proofErr w:type="spellStart"/>
+      <w:r>
+        <w:rPr>
+          <w:i/>
+          <w:iCs/>
+        </w:rPr>
+        <w:t>agriculture</w:t>
+      </w:r>
+      <w:proofErr w:type="spellEnd"/>
+      <w:r>
+        <w:t xml:space="preserve"> (FAO </w:t>
+      </w:r>
+      <w:proofErr w:type="spellStart"/>
+      <w:r>
+        <w:t>Irrigation</w:t>
+      </w:r>
+      <w:proofErr w:type="spellEnd"/>
+      <w:r>
+        <w:t xml:space="preserve"> and </w:t>
+      </w:r>
+      <w:proofErr w:type="spellStart"/>
+      <w:r>
+        <w:t>Drainage</w:t>
+      </w:r>
+      <w:proofErr w:type="spellEnd"/>
+      <w:r>
+        <w:t xml:space="preserve"> </w:t>
+      </w:r>
+      <w:proofErr w:type="spellStart"/>
+      <w:r>
+        <w:t>Paper</w:t>
+      </w:r>
+      <w:proofErr w:type="spellEnd"/>
+      <w:r>
+        <w:t xml:space="preserve"> 29, Rev. 1). FAO.</w:t>
       </w:r>
     </w:p>
     <w:p>

</xml_diff>

<commit_message>
feat: :sparkles: apartado 4.4
</commit_message>
<xml_diff>
--- a/libro.docx
+++ b/libro.docx
@@ -1,6 +1,6 @@
 
 <file path=word/document.xml><?xml version="1.0" encoding="utf-8"?>
-<w:document xmlns:wpc="http://schemas.microsoft.com/office/word/2010/wordprocessingCanvas" xmlns:cx="http://schemas.microsoft.com/office/drawing/2014/chartex" xmlns:cx1="http://schemas.microsoft.com/office/drawing/2015/9/8/chartex" xmlns:cx2="http://schemas.microsoft.com/office/drawing/2015/10/21/chartex" xmlns:cx3="http://schemas.microsoft.com/office/drawing/2016/5/9/chartex" xmlns:cx4="http://schemas.microsoft.com/office/drawing/2016/5/10/chartex" xmlns:cx5="http://schemas.microsoft.com/office/drawing/2016/5/11/chartex" xmlns:cx6="http://schemas.microsoft.com/office/drawing/2016/5/12/chartex" xmlns:cx7="http://schemas.microsoft.com/office/drawing/2016/5/13/chartex" xmlns:cx8="http://schemas.microsoft.com/office/drawing/2016/5/14/chartex" xmlns:mc="http://schemas.openxmlformats.org/markup-compatibility/2006" xmlns:aink="http://schemas.microsoft.com/office/drawing/2016/ink" xmlns:am3d="http://schemas.microsoft.com/office/drawing/2017/model3d" xmlns:o="urn:schemas-microsoft-com:office:office" xmlns:oel="http://schemas.microsoft.com/office/2019/extlst" xmlns:r="http://schemas.openxmlformats.org/officeDocument/2006/relationships" xmlns:m="http://schemas.openxmlformats.org/officeDocument/2006/math" xmlns:v="urn:schemas-microsoft-com:vml" xmlns:wp14="http://schemas.microsoft.com/office/word/2010/wordprocessingDrawing" xmlns:wp="http://schemas.openxmlformats.org/drawingml/2006/wordprocessingDrawing" xmlns:w10="urn:schemas-microsoft-com:office:word" xmlns:w="http://schemas.openxmlformats.org/wordprocessingml/2006/main" xmlns:w14="http://schemas.microsoft.com/office/word/2010/wordml" xmlns:w15="http://schemas.microsoft.com/office/word/2012/wordml" xmlns:w16cex="http://schemas.microsoft.com/office/word/2018/wordml/cex" xmlns:w16cid="http://schemas.microsoft.com/office/word/2016/wordml/cid" xmlns:w16="http://schemas.microsoft.com/office/word/2018/wordml" xmlns:w16sdtdh="http://schemas.microsoft.com/office/word/2020/wordml/sdtdatahash" xmlns:w16se="http://schemas.microsoft.com/office/word/2015/wordml/symex" xmlns:wpg="http://schemas.microsoft.com/office/word/2010/wordprocessingGroup" xmlns:wpi="http://schemas.microsoft.com/office/word/2010/wordprocessingInk" xmlns:wne="http://schemas.microsoft.com/office/word/2006/wordml" xmlns:wps="http://schemas.microsoft.com/office/word/2010/wordprocessingShape" mc:Ignorable="w14 w15 w16se w16cid w16 w16cex w16sdtdh wp14">
+<w:document xmlns:wpc="http://schemas.microsoft.com/office/word/2010/wordprocessingCanvas" xmlns:cx="http://schemas.microsoft.com/office/drawing/2014/chartex" xmlns:cx1="http://schemas.microsoft.com/office/drawing/2015/9/8/chartex" xmlns:cx2="http://schemas.microsoft.com/office/drawing/2015/10/21/chartex" xmlns:cx3="http://schemas.microsoft.com/office/drawing/2016/5/9/chartex" xmlns:cx4="http://schemas.microsoft.com/office/drawing/2016/5/10/chartex" xmlns:cx5="http://schemas.microsoft.com/office/drawing/2016/5/11/chartex" xmlns:cx6="http://schemas.microsoft.com/office/drawing/2016/5/12/chartex" xmlns:cx7="http://schemas.microsoft.com/office/drawing/2016/5/13/chartex" xmlns:cx8="http://schemas.microsoft.com/office/drawing/2016/5/14/chartex" xmlns:mc="http://schemas.openxmlformats.org/markup-compatibility/2006" xmlns:aink="http://schemas.microsoft.com/office/drawing/2016/ink" xmlns:am3d="http://schemas.microsoft.com/office/drawing/2017/model3d" xmlns:o="urn:schemas-microsoft-com:office:office" xmlns:oel="http://schemas.microsoft.com/office/2019/extlst" xmlns:r="http://schemas.openxmlformats.org/officeDocument/2006/relationships" xmlns:m="http://schemas.openxmlformats.org/officeDocument/2006/math" xmlns:v="urn:schemas-microsoft-com:vml" xmlns:wp14="http://schemas.microsoft.com/office/word/2010/wordprocessingDrawing" xmlns:wp="http://schemas.openxmlformats.org/drawingml/2006/wordprocessingDrawing" xmlns:w10="urn:schemas-microsoft-com:office:word" xmlns:w="http://schemas.openxmlformats.org/wordprocessingml/2006/main" xmlns:w14="http://schemas.microsoft.com/office/word/2010/wordml" xmlns:w15="http://schemas.microsoft.com/office/word/2012/wordml" xmlns:w16cex="http://schemas.microsoft.com/office/word/2018/wordml/cex" xmlns:w16cid="http://schemas.microsoft.com/office/word/2016/wordml/cid" xmlns:w16="http://schemas.microsoft.com/office/word/2018/wordml" xmlns:w16du="http://schemas.microsoft.com/office/word/2023/wordml/word16du" xmlns:w16sdtdh="http://schemas.microsoft.com/office/word/2020/wordml/sdtdatahash" xmlns:w16sdtfl="http://schemas.microsoft.com/office/word/2024/wordml/sdtformatlock" xmlns:w16se="http://schemas.microsoft.com/office/word/2015/wordml/symex" xmlns:wpg="http://schemas.microsoft.com/office/word/2010/wordprocessingGroup" xmlns:wpi="http://schemas.microsoft.com/office/word/2010/wordprocessingInk" xmlns:wne="http://schemas.microsoft.com/office/word/2006/wordml" xmlns:wps="http://schemas.microsoft.com/office/word/2010/wordprocessingShape" mc:Ignorable="w14 w15 w16se w16cid w16 w16cex w16sdtdh w16sdtfl w16du wp14">
   <w:body>
     <w:p>
       <w:pPr>
@@ -19,7 +19,23 @@
     </w:p>
     <w:p>
       <w:r>
-        <w:t>El sistema incluye una etapa de pre-purificación natural, que se desarrolló en paralelo como parte del mismo proyecto, y una etapa de cavitación que mejora la calidad del agua para su uso en cultivos. Desde una perspectiva energética, se ha puesto en marcha un sistema de operación directa con paneles solares (PV-direct), lo que ayuda a disminuir tanto los costos de inversión como los de mantenimiento. Los resultados obtenidos respaldan la viabilidad técnica y ambiental de esta propuesta, que se presenta como una alternativa sostenible y replicable para el sector de paneles solares en Colombia.</w:t>
+        <w:t xml:space="preserve">El sistema incluye una etapa de </w:t>
+      </w:r>
+      <w:proofErr w:type="spellStart"/>
+      <w:r>
+        <w:t>pre-purificación</w:t>
+      </w:r>
+      <w:proofErr w:type="spellEnd"/>
+      <w:r>
+        <w:t xml:space="preserve"> natural, que se desarrolló en paralelo como parte del mismo proyecto, y una etapa de cavitación que mejora la calidad del agua para su uso en cultivos. Desde una perspectiva energética, se ha puesto en marcha un sistema de operación directa con paneles solares (PV-</w:t>
+      </w:r>
+      <w:proofErr w:type="spellStart"/>
+      <w:r>
+        <w:t>direct</w:t>
+      </w:r>
+      <w:proofErr w:type="spellEnd"/>
+      <w:r>
+        <w:t>), lo que ayuda a disminuir tanto los costos de inversión como los de mantenimiento. Los resultados obtenidos respaldan la viabilidad técnica y ambiental de esta propuesta, que se presenta como una alternativa sostenible y replicable para el sector de paneles solares en Colombia.</w:t>
       </w:r>
     </w:p>
     <w:p>
@@ -27,14 +43,437 @@
         <w:pStyle w:val="Ttulo1"/>
       </w:pPr>
       <w:bookmarkStart w:id="1" w:name="_Toc209712926"/>
+      <w:proofErr w:type="spellStart"/>
       <w:r>
         <w:t>Abstract</w:t>
       </w:r>
       <w:bookmarkEnd w:id="1"/>
+      <w:proofErr w:type="spellEnd"/>
     </w:p>
     <w:p>
-      <w:r>
-        <w:t>This thesis focuses on the design and implementation of an autonomous photovoltaic solar energy system, aimed at operating a water treatment plant through cavitation. The system is capable of running continuously for at least four hours without requiring a battery bank. The project was developed in a sugarcane mill, where approximately 600 liters of water are lost daily and, without proper treatment, cannot be reused in agriculture.</w:t>
+      <w:proofErr w:type="spellStart"/>
+      <w:r>
+        <w:t>This</w:t>
+      </w:r>
+      <w:proofErr w:type="spellEnd"/>
+      <w:r>
+        <w:t xml:space="preserve"> </w:t>
+      </w:r>
+      <w:proofErr w:type="spellStart"/>
+      <w:r>
+        <w:t>thesis</w:t>
+      </w:r>
+      <w:proofErr w:type="spellEnd"/>
+      <w:r>
+        <w:t xml:space="preserve"> </w:t>
+      </w:r>
+      <w:proofErr w:type="spellStart"/>
+      <w:r>
+        <w:t>focuses</w:t>
+      </w:r>
+      <w:proofErr w:type="spellEnd"/>
+      <w:r>
+        <w:t xml:space="preserve"> </w:t>
+      </w:r>
+      <w:proofErr w:type="spellStart"/>
+      <w:r>
+        <w:t>on</w:t>
+      </w:r>
+      <w:proofErr w:type="spellEnd"/>
+      <w:r>
+        <w:t xml:space="preserve"> </w:t>
+      </w:r>
+      <w:proofErr w:type="spellStart"/>
+      <w:r>
+        <w:t>the</w:t>
+      </w:r>
+      <w:proofErr w:type="spellEnd"/>
+      <w:r>
+        <w:t xml:space="preserve"> </w:t>
+      </w:r>
+      <w:proofErr w:type="spellStart"/>
+      <w:r>
+        <w:t>design</w:t>
+      </w:r>
+      <w:proofErr w:type="spellEnd"/>
+      <w:r>
+        <w:t xml:space="preserve"> and </w:t>
+      </w:r>
+      <w:proofErr w:type="spellStart"/>
+      <w:r>
+        <w:t>implementation</w:t>
+      </w:r>
+      <w:proofErr w:type="spellEnd"/>
+      <w:r>
+        <w:t xml:space="preserve"> </w:t>
+      </w:r>
+      <w:proofErr w:type="spellStart"/>
+      <w:r>
+        <w:t>of</w:t>
+      </w:r>
+      <w:proofErr w:type="spellEnd"/>
+      <w:r>
+        <w:t xml:space="preserve"> </w:t>
+      </w:r>
+      <w:proofErr w:type="spellStart"/>
+      <w:r>
+        <w:t>an</w:t>
+      </w:r>
+      <w:proofErr w:type="spellEnd"/>
+      <w:r>
+        <w:t xml:space="preserve"> </w:t>
+      </w:r>
+      <w:proofErr w:type="spellStart"/>
+      <w:r>
+        <w:t>autonomous</w:t>
+      </w:r>
+      <w:proofErr w:type="spellEnd"/>
+      <w:r>
+        <w:t xml:space="preserve"> </w:t>
+      </w:r>
+      <w:proofErr w:type="spellStart"/>
+      <w:r>
+        <w:t>photovoltaic</w:t>
+      </w:r>
+      <w:proofErr w:type="spellEnd"/>
+      <w:r>
+        <w:t xml:space="preserve"> solar </w:t>
+      </w:r>
+      <w:proofErr w:type="spellStart"/>
+      <w:r>
+        <w:t>energy</w:t>
+      </w:r>
+      <w:proofErr w:type="spellEnd"/>
+      <w:r>
+        <w:t xml:space="preserve"> </w:t>
+      </w:r>
+      <w:proofErr w:type="spellStart"/>
+      <w:r>
+        <w:t>system</w:t>
+      </w:r>
+      <w:proofErr w:type="spellEnd"/>
+      <w:r>
+        <w:t xml:space="preserve">, </w:t>
+      </w:r>
+      <w:proofErr w:type="spellStart"/>
+      <w:r>
+        <w:t>aimed</w:t>
+      </w:r>
+      <w:proofErr w:type="spellEnd"/>
+      <w:r>
+        <w:t xml:space="preserve"> at </w:t>
+      </w:r>
+      <w:proofErr w:type="spellStart"/>
+      <w:r>
+        <w:t>operating</w:t>
+      </w:r>
+      <w:proofErr w:type="spellEnd"/>
+      <w:r>
+        <w:t xml:space="preserve"> a </w:t>
+      </w:r>
+      <w:proofErr w:type="spellStart"/>
+      <w:r>
+        <w:t>water</w:t>
+      </w:r>
+      <w:proofErr w:type="spellEnd"/>
+      <w:r>
+        <w:t xml:space="preserve"> </w:t>
+      </w:r>
+      <w:proofErr w:type="spellStart"/>
+      <w:r>
+        <w:t>treatment</w:t>
+      </w:r>
+      <w:proofErr w:type="spellEnd"/>
+      <w:r>
+        <w:t xml:space="preserve"> </w:t>
+      </w:r>
+      <w:proofErr w:type="spellStart"/>
+      <w:r>
+        <w:t>plant</w:t>
+      </w:r>
+      <w:proofErr w:type="spellEnd"/>
+      <w:r>
+        <w:t xml:space="preserve"> </w:t>
+      </w:r>
+      <w:proofErr w:type="spellStart"/>
+      <w:r>
+        <w:t>through</w:t>
+      </w:r>
+      <w:proofErr w:type="spellEnd"/>
+      <w:r>
+        <w:t xml:space="preserve"> </w:t>
+      </w:r>
+      <w:proofErr w:type="spellStart"/>
+      <w:r>
+        <w:t>cavitation</w:t>
+      </w:r>
+      <w:proofErr w:type="spellEnd"/>
+      <w:r>
+        <w:t xml:space="preserve">. </w:t>
+      </w:r>
+      <w:proofErr w:type="spellStart"/>
+      <w:r>
+        <w:t>The</w:t>
+      </w:r>
+      <w:proofErr w:type="spellEnd"/>
+      <w:r>
+        <w:t xml:space="preserve"> </w:t>
+      </w:r>
+      <w:proofErr w:type="spellStart"/>
+      <w:r>
+        <w:t>system</w:t>
+      </w:r>
+      <w:proofErr w:type="spellEnd"/>
+      <w:r>
+        <w:t xml:space="preserve"> </w:t>
+      </w:r>
+      <w:proofErr w:type="spellStart"/>
+      <w:r>
+        <w:t>is</w:t>
+      </w:r>
+      <w:proofErr w:type="spellEnd"/>
+      <w:r>
+        <w:t xml:space="preserve"> </w:t>
+      </w:r>
+      <w:proofErr w:type="spellStart"/>
+      <w:r>
+        <w:t>capable</w:t>
+      </w:r>
+      <w:proofErr w:type="spellEnd"/>
+      <w:r>
+        <w:t xml:space="preserve"> </w:t>
+      </w:r>
+      <w:proofErr w:type="spellStart"/>
+      <w:r>
+        <w:t>of</w:t>
+      </w:r>
+      <w:proofErr w:type="spellEnd"/>
+      <w:r>
+        <w:t xml:space="preserve"> running </w:t>
+      </w:r>
+      <w:proofErr w:type="spellStart"/>
+      <w:r>
+        <w:t>continuously</w:t>
+      </w:r>
+      <w:proofErr w:type="spellEnd"/>
+      <w:r>
+        <w:t xml:space="preserve"> </w:t>
+      </w:r>
+      <w:proofErr w:type="spellStart"/>
+      <w:r>
+        <w:t>for</w:t>
+      </w:r>
+      <w:proofErr w:type="spellEnd"/>
+      <w:r>
+        <w:t xml:space="preserve"> at </w:t>
+      </w:r>
+      <w:proofErr w:type="spellStart"/>
+      <w:r>
+        <w:t>least</w:t>
+      </w:r>
+      <w:proofErr w:type="spellEnd"/>
+      <w:r>
+        <w:t xml:space="preserve"> </w:t>
+      </w:r>
+      <w:proofErr w:type="spellStart"/>
+      <w:r>
+        <w:t>four</w:t>
+      </w:r>
+      <w:proofErr w:type="spellEnd"/>
+      <w:r>
+        <w:t xml:space="preserve"> </w:t>
+      </w:r>
+      <w:proofErr w:type="spellStart"/>
+      <w:r>
+        <w:t>hours</w:t>
+      </w:r>
+      <w:proofErr w:type="spellEnd"/>
+      <w:r>
+        <w:t xml:space="preserve"> </w:t>
+      </w:r>
+      <w:proofErr w:type="spellStart"/>
+      <w:r>
+        <w:t>without</w:t>
+      </w:r>
+      <w:proofErr w:type="spellEnd"/>
+      <w:r>
+        <w:t xml:space="preserve"> </w:t>
+      </w:r>
+      <w:proofErr w:type="spellStart"/>
+      <w:r>
+        <w:t>requiring</w:t>
+      </w:r>
+      <w:proofErr w:type="spellEnd"/>
+      <w:r>
+        <w:t xml:space="preserve"> a </w:t>
+      </w:r>
+      <w:proofErr w:type="spellStart"/>
+      <w:r>
+        <w:t>battery</w:t>
+      </w:r>
+      <w:proofErr w:type="spellEnd"/>
+      <w:r>
+        <w:t xml:space="preserve"> </w:t>
+      </w:r>
+      <w:proofErr w:type="spellStart"/>
+      <w:r>
+        <w:t>bank</w:t>
+      </w:r>
+      <w:proofErr w:type="spellEnd"/>
+      <w:r>
+        <w:t xml:space="preserve">. </w:t>
+      </w:r>
+      <w:proofErr w:type="spellStart"/>
+      <w:r>
+        <w:t>The</w:t>
+      </w:r>
+      <w:proofErr w:type="spellEnd"/>
+      <w:r>
+        <w:t xml:space="preserve"> </w:t>
+      </w:r>
+      <w:proofErr w:type="spellStart"/>
+      <w:r>
+        <w:t>project</w:t>
+      </w:r>
+      <w:proofErr w:type="spellEnd"/>
+      <w:r>
+        <w:t xml:space="preserve"> </w:t>
+      </w:r>
+      <w:proofErr w:type="spellStart"/>
+      <w:r>
+        <w:t>was</w:t>
+      </w:r>
+      <w:proofErr w:type="spellEnd"/>
+      <w:r>
+        <w:t xml:space="preserve"> </w:t>
+      </w:r>
+      <w:proofErr w:type="spellStart"/>
+      <w:r>
+        <w:t>developed</w:t>
+      </w:r>
+      <w:proofErr w:type="spellEnd"/>
+      <w:r>
+        <w:t xml:space="preserve"> in a </w:t>
+      </w:r>
+      <w:proofErr w:type="spellStart"/>
+      <w:r>
+        <w:t>sugarcane</w:t>
+      </w:r>
+      <w:proofErr w:type="spellEnd"/>
+      <w:r>
+        <w:t xml:space="preserve"> </w:t>
+      </w:r>
+      <w:proofErr w:type="spellStart"/>
+      <w:r>
+        <w:t>mill</w:t>
+      </w:r>
+      <w:proofErr w:type="spellEnd"/>
+      <w:r>
+        <w:t xml:space="preserve">, </w:t>
+      </w:r>
+      <w:proofErr w:type="spellStart"/>
+      <w:r>
+        <w:t>where</w:t>
+      </w:r>
+      <w:proofErr w:type="spellEnd"/>
+      <w:r>
+        <w:t xml:space="preserve"> </w:t>
+      </w:r>
+      <w:proofErr w:type="spellStart"/>
+      <w:r>
+        <w:t>approximately</w:t>
+      </w:r>
+      <w:proofErr w:type="spellEnd"/>
+      <w:r>
+        <w:t xml:space="preserve"> 600 </w:t>
+      </w:r>
+      <w:proofErr w:type="spellStart"/>
+      <w:r>
+        <w:t>liters</w:t>
+      </w:r>
+      <w:proofErr w:type="spellEnd"/>
+      <w:r>
+        <w:t xml:space="preserve"> </w:t>
+      </w:r>
+      <w:proofErr w:type="spellStart"/>
+      <w:r>
+        <w:t>of</w:t>
+      </w:r>
+      <w:proofErr w:type="spellEnd"/>
+      <w:r>
+        <w:t xml:space="preserve"> </w:t>
+      </w:r>
+      <w:proofErr w:type="spellStart"/>
+      <w:r>
+        <w:t>water</w:t>
+      </w:r>
+      <w:proofErr w:type="spellEnd"/>
+      <w:r>
+        <w:t xml:space="preserve"> are </w:t>
+      </w:r>
+      <w:proofErr w:type="spellStart"/>
+      <w:r>
+        <w:t>lost</w:t>
+      </w:r>
+      <w:proofErr w:type="spellEnd"/>
+      <w:r>
+        <w:t xml:space="preserve"> </w:t>
+      </w:r>
+      <w:proofErr w:type="spellStart"/>
+      <w:r>
+        <w:t>daily</w:t>
+      </w:r>
+      <w:proofErr w:type="spellEnd"/>
+      <w:r>
+        <w:t xml:space="preserve"> and, </w:t>
+      </w:r>
+      <w:proofErr w:type="spellStart"/>
+      <w:r>
+        <w:t>without</w:t>
+      </w:r>
+      <w:proofErr w:type="spellEnd"/>
+      <w:r>
+        <w:t xml:space="preserve"> </w:t>
+      </w:r>
+      <w:proofErr w:type="spellStart"/>
+      <w:r>
+        <w:t>proper</w:t>
+      </w:r>
+      <w:proofErr w:type="spellEnd"/>
+      <w:r>
+        <w:t xml:space="preserve"> </w:t>
+      </w:r>
+      <w:proofErr w:type="spellStart"/>
+      <w:r>
+        <w:t>treatment</w:t>
+      </w:r>
+      <w:proofErr w:type="spellEnd"/>
+      <w:r>
+        <w:t xml:space="preserve">, </w:t>
+      </w:r>
+      <w:proofErr w:type="spellStart"/>
+      <w:r>
+        <w:t>cannot</w:t>
+      </w:r>
+      <w:proofErr w:type="spellEnd"/>
+      <w:r>
+        <w:t xml:space="preserve"> be </w:t>
+      </w:r>
+      <w:proofErr w:type="spellStart"/>
+      <w:r>
+        <w:t>reused</w:t>
+      </w:r>
+      <w:proofErr w:type="spellEnd"/>
+      <w:r>
+        <w:t xml:space="preserve"> in </w:t>
+      </w:r>
+      <w:proofErr w:type="spellStart"/>
+      <w:r>
+        <w:t>agriculture</w:t>
+      </w:r>
+      <w:proofErr w:type="spellEnd"/>
+      <w:r>
+        <w:t>.</w:t>
       </w:r>
     </w:p>
     <w:p/>
@@ -47,8 +486,453 @@
           <w:szCs w:val="40"/>
         </w:rPr>
       </w:pPr>
-      <w:r>
-        <w:t>The system includes a natural pre-purification stage, developed in parallel as part of the same project, and a cavitation stage that improves water quality for agricultural use. From an energy perspective, a direct operation system with solar panels (PV-direct) was implemented, helping to reduce both investment and maintenance costs. The results obtained support the technical and environmental feasibility of this proposal, which is presented as a sustainable and replicable alternative for the solar energy sector in Colombia.</w:t>
+      <w:proofErr w:type="spellStart"/>
+      <w:r>
+        <w:t>The</w:t>
+      </w:r>
+      <w:proofErr w:type="spellEnd"/>
+      <w:r>
+        <w:t xml:space="preserve"> </w:t>
+      </w:r>
+      <w:proofErr w:type="spellStart"/>
+      <w:r>
+        <w:t>system</w:t>
+      </w:r>
+      <w:proofErr w:type="spellEnd"/>
+      <w:r>
+        <w:t xml:space="preserve"> </w:t>
+      </w:r>
+      <w:proofErr w:type="spellStart"/>
+      <w:r>
+        <w:t>includes</w:t>
+      </w:r>
+      <w:proofErr w:type="spellEnd"/>
+      <w:r>
+        <w:t xml:space="preserve"> a natural </w:t>
+      </w:r>
+      <w:proofErr w:type="spellStart"/>
+      <w:r>
+        <w:t>pre-purification</w:t>
+      </w:r>
+      <w:proofErr w:type="spellEnd"/>
+      <w:r>
+        <w:t xml:space="preserve"> </w:t>
+      </w:r>
+      <w:proofErr w:type="spellStart"/>
+      <w:r>
+        <w:t>stage</w:t>
+      </w:r>
+      <w:proofErr w:type="spellEnd"/>
+      <w:r>
+        <w:t xml:space="preserve">, </w:t>
+      </w:r>
+      <w:proofErr w:type="spellStart"/>
+      <w:r>
+        <w:t>developed</w:t>
+      </w:r>
+      <w:proofErr w:type="spellEnd"/>
+      <w:r>
+        <w:t xml:space="preserve"> in </w:t>
+      </w:r>
+      <w:proofErr w:type="spellStart"/>
+      <w:r>
+        <w:t>parallel</w:t>
+      </w:r>
+      <w:proofErr w:type="spellEnd"/>
+      <w:r>
+        <w:t xml:space="preserve"> as </w:t>
+      </w:r>
+      <w:proofErr w:type="spellStart"/>
+      <w:r>
+        <w:t>part</w:t>
+      </w:r>
+      <w:proofErr w:type="spellEnd"/>
+      <w:r>
+        <w:t xml:space="preserve"> </w:t>
+      </w:r>
+      <w:proofErr w:type="spellStart"/>
+      <w:r>
+        <w:t>of</w:t>
+      </w:r>
+      <w:proofErr w:type="spellEnd"/>
+      <w:r>
+        <w:t xml:space="preserve"> </w:t>
+      </w:r>
+      <w:proofErr w:type="spellStart"/>
+      <w:r>
+        <w:t>the</w:t>
+      </w:r>
+      <w:proofErr w:type="spellEnd"/>
+      <w:r>
+        <w:t xml:space="preserve"> </w:t>
+      </w:r>
+      <w:proofErr w:type="spellStart"/>
+      <w:r>
+        <w:t>same</w:t>
+      </w:r>
+      <w:proofErr w:type="spellEnd"/>
+      <w:r>
+        <w:t xml:space="preserve"> </w:t>
+      </w:r>
+      <w:proofErr w:type="spellStart"/>
+      <w:r>
+        <w:t>project</w:t>
+      </w:r>
+      <w:proofErr w:type="spellEnd"/>
+      <w:r>
+        <w:t xml:space="preserve">, and a </w:t>
+      </w:r>
+      <w:proofErr w:type="spellStart"/>
+      <w:r>
+        <w:t>cavitation</w:t>
+      </w:r>
+      <w:proofErr w:type="spellEnd"/>
+      <w:r>
+        <w:t xml:space="preserve"> </w:t>
+      </w:r>
+      <w:proofErr w:type="spellStart"/>
+      <w:r>
+        <w:t>stage</w:t>
+      </w:r>
+      <w:proofErr w:type="spellEnd"/>
+      <w:r>
+        <w:t xml:space="preserve"> </w:t>
+      </w:r>
+      <w:proofErr w:type="spellStart"/>
+      <w:r>
+        <w:t>that</w:t>
+      </w:r>
+      <w:proofErr w:type="spellEnd"/>
+      <w:r>
+        <w:t xml:space="preserve"> </w:t>
+      </w:r>
+      <w:proofErr w:type="spellStart"/>
+      <w:r>
+        <w:t>improves</w:t>
+      </w:r>
+      <w:proofErr w:type="spellEnd"/>
+      <w:r>
+        <w:t xml:space="preserve"> </w:t>
+      </w:r>
+      <w:proofErr w:type="spellStart"/>
+      <w:r>
+        <w:t>water</w:t>
+      </w:r>
+      <w:proofErr w:type="spellEnd"/>
+      <w:r>
+        <w:t xml:space="preserve"> </w:t>
+      </w:r>
+      <w:proofErr w:type="spellStart"/>
+      <w:r>
+        <w:t>quality</w:t>
+      </w:r>
+      <w:proofErr w:type="spellEnd"/>
+      <w:r>
+        <w:t xml:space="preserve"> </w:t>
+      </w:r>
+      <w:proofErr w:type="spellStart"/>
+      <w:r>
+        <w:t>for</w:t>
+      </w:r>
+      <w:proofErr w:type="spellEnd"/>
+      <w:r>
+        <w:t xml:space="preserve"> </w:t>
+      </w:r>
+      <w:proofErr w:type="spellStart"/>
+      <w:r>
+        <w:t>agricultural</w:t>
+      </w:r>
+      <w:proofErr w:type="spellEnd"/>
+      <w:r>
+        <w:t xml:space="preserve"> use. </w:t>
+      </w:r>
+      <w:proofErr w:type="spellStart"/>
+      <w:r>
+        <w:t>From</w:t>
+      </w:r>
+      <w:proofErr w:type="spellEnd"/>
+      <w:r>
+        <w:t xml:space="preserve"> </w:t>
+      </w:r>
+      <w:proofErr w:type="spellStart"/>
+      <w:r>
+        <w:t>an</w:t>
+      </w:r>
+      <w:proofErr w:type="spellEnd"/>
+      <w:r>
+        <w:t xml:space="preserve"> </w:t>
+      </w:r>
+      <w:proofErr w:type="spellStart"/>
+      <w:r>
+        <w:t>energy</w:t>
+      </w:r>
+      <w:proofErr w:type="spellEnd"/>
+      <w:r>
+        <w:t xml:space="preserve"> </w:t>
+      </w:r>
+      <w:proofErr w:type="spellStart"/>
+      <w:r>
+        <w:t>perspective</w:t>
+      </w:r>
+      <w:proofErr w:type="spellEnd"/>
+      <w:r>
+        <w:t xml:space="preserve">, a </w:t>
+      </w:r>
+      <w:proofErr w:type="spellStart"/>
+      <w:r>
+        <w:t>direct</w:t>
+      </w:r>
+      <w:proofErr w:type="spellEnd"/>
+      <w:r>
+        <w:t xml:space="preserve"> </w:t>
+      </w:r>
+      <w:proofErr w:type="spellStart"/>
+      <w:r>
+        <w:t>operation</w:t>
+      </w:r>
+      <w:proofErr w:type="spellEnd"/>
+      <w:r>
+        <w:t xml:space="preserve"> </w:t>
+      </w:r>
+      <w:proofErr w:type="spellStart"/>
+      <w:r>
+        <w:t>system</w:t>
+      </w:r>
+      <w:proofErr w:type="spellEnd"/>
+      <w:r>
+        <w:t xml:space="preserve"> </w:t>
+      </w:r>
+      <w:proofErr w:type="spellStart"/>
+      <w:r>
+        <w:t>with</w:t>
+      </w:r>
+      <w:proofErr w:type="spellEnd"/>
+      <w:r>
+        <w:t xml:space="preserve"> solar </w:t>
+      </w:r>
+      <w:proofErr w:type="spellStart"/>
+      <w:r>
+        <w:t>panels</w:t>
+      </w:r>
+      <w:proofErr w:type="spellEnd"/>
+      <w:r>
+        <w:t xml:space="preserve"> (PV-</w:t>
+      </w:r>
+      <w:proofErr w:type="spellStart"/>
+      <w:r>
+        <w:t>direct</w:t>
+      </w:r>
+      <w:proofErr w:type="spellEnd"/>
+      <w:r>
+        <w:t xml:space="preserve">) </w:t>
+      </w:r>
+      <w:proofErr w:type="spellStart"/>
+      <w:r>
+        <w:t>was</w:t>
+      </w:r>
+      <w:proofErr w:type="spellEnd"/>
+      <w:r>
+        <w:t xml:space="preserve"> </w:t>
+      </w:r>
+      <w:proofErr w:type="spellStart"/>
+      <w:r>
+        <w:t>implemented</w:t>
+      </w:r>
+      <w:proofErr w:type="spellEnd"/>
+      <w:r>
+        <w:t xml:space="preserve">, </w:t>
+      </w:r>
+      <w:proofErr w:type="spellStart"/>
+      <w:r>
+        <w:t>helping</w:t>
+      </w:r>
+      <w:proofErr w:type="spellEnd"/>
+      <w:r>
+        <w:t xml:space="preserve"> </w:t>
+      </w:r>
+      <w:proofErr w:type="spellStart"/>
+      <w:r>
+        <w:t>to</w:t>
+      </w:r>
+      <w:proofErr w:type="spellEnd"/>
+      <w:r>
+        <w:t xml:space="preserve"> reduce </w:t>
+      </w:r>
+      <w:proofErr w:type="spellStart"/>
+      <w:r>
+        <w:t>both</w:t>
+      </w:r>
+      <w:proofErr w:type="spellEnd"/>
+      <w:r>
+        <w:t xml:space="preserve"> </w:t>
+      </w:r>
+      <w:proofErr w:type="spellStart"/>
+      <w:r>
+        <w:t>investment</w:t>
+      </w:r>
+      <w:proofErr w:type="spellEnd"/>
+      <w:r>
+        <w:t xml:space="preserve"> and </w:t>
+      </w:r>
+      <w:proofErr w:type="spellStart"/>
+      <w:r>
+        <w:t>maintenance</w:t>
+      </w:r>
+      <w:proofErr w:type="spellEnd"/>
+      <w:r>
+        <w:t xml:space="preserve"> </w:t>
+      </w:r>
+      <w:proofErr w:type="spellStart"/>
+      <w:r>
+        <w:t>costs</w:t>
+      </w:r>
+      <w:proofErr w:type="spellEnd"/>
+      <w:r>
+        <w:t xml:space="preserve">. </w:t>
+      </w:r>
+      <w:proofErr w:type="spellStart"/>
+      <w:r>
+        <w:t>The</w:t>
+      </w:r>
+      <w:proofErr w:type="spellEnd"/>
+      <w:r>
+        <w:t xml:space="preserve"> </w:t>
+      </w:r>
+      <w:proofErr w:type="spellStart"/>
+      <w:r>
+        <w:t>results</w:t>
+      </w:r>
+      <w:proofErr w:type="spellEnd"/>
+      <w:r>
+        <w:t xml:space="preserve"> </w:t>
+      </w:r>
+      <w:proofErr w:type="spellStart"/>
+      <w:r>
+        <w:t>obtained</w:t>
+      </w:r>
+      <w:proofErr w:type="spellEnd"/>
+      <w:r>
+        <w:t xml:space="preserve"> </w:t>
+      </w:r>
+      <w:proofErr w:type="spellStart"/>
+      <w:r>
+        <w:t>support</w:t>
+      </w:r>
+      <w:proofErr w:type="spellEnd"/>
+      <w:r>
+        <w:t xml:space="preserve"> </w:t>
+      </w:r>
+      <w:proofErr w:type="spellStart"/>
+      <w:r>
+        <w:t>the</w:t>
+      </w:r>
+      <w:proofErr w:type="spellEnd"/>
+      <w:r>
+        <w:t xml:space="preserve"> </w:t>
+      </w:r>
+      <w:proofErr w:type="spellStart"/>
+      <w:r>
+        <w:t>technical</w:t>
+      </w:r>
+      <w:proofErr w:type="spellEnd"/>
+      <w:r>
+        <w:t xml:space="preserve"> and </w:t>
+      </w:r>
+      <w:proofErr w:type="spellStart"/>
+      <w:r>
+        <w:t>environmental</w:t>
+      </w:r>
+      <w:proofErr w:type="spellEnd"/>
+      <w:r>
+        <w:t xml:space="preserve"> </w:t>
+      </w:r>
+      <w:proofErr w:type="spellStart"/>
+      <w:r>
+        <w:t>feasibility</w:t>
+      </w:r>
+      <w:proofErr w:type="spellEnd"/>
+      <w:r>
+        <w:t xml:space="preserve"> </w:t>
+      </w:r>
+      <w:proofErr w:type="spellStart"/>
+      <w:r>
+        <w:t>of</w:t>
+      </w:r>
+      <w:proofErr w:type="spellEnd"/>
+      <w:r>
+        <w:t xml:space="preserve"> </w:t>
+      </w:r>
+      <w:proofErr w:type="spellStart"/>
+      <w:r>
+        <w:t>this</w:t>
+      </w:r>
+      <w:proofErr w:type="spellEnd"/>
+      <w:r>
+        <w:t xml:space="preserve"> </w:t>
+      </w:r>
+      <w:proofErr w:type="spellStart"/>
+      <w:r>
+        <w:t>proposal</w:t>
+      </w:r>
+      <w:proofErr w:type="spellEnd"/>
+      <w:r>
+        <w:t xml:space="preserve">, </w:t>
+      </w:r>
+      <w:proofErr w:type="spellStart"/>
+      <w:r>
+        <w:t>which</w:t>
+      </w:r>
+      <w:proofErr w:type="spellEnd"/>
+      <w:r>
+        <w:t xml:space="preserve"> </w:t>
+      </w:r>
+      <w:proofErr w:type="spellStart"/>
+      <w:r>
+        <w:t>is</w:t>
+      </w:r>
+      <w:proofErr w:type="spellEnd"/>
+      <w:r>
+        <w:t xml:space="preserve"> </w:t>
+      </w:r>
+      <w:proofErr w:type="spellStart"/>
+      <w:r>
+        <w:t>presented</w:t>
+      </w:r>
+      <w:proofErr w:type="spellEnd"/>
+      <w:r>
+        <w:t xml:space="preserve"> as a </w:t>
+      </w:r>
+      <w:proofErr w:type="spellStart"/>
+      <w:r>
+        <w:t>sustainable</w:t>
+      </w:r>
+      <w:proofErr w:type="spellEnd"/>
+      <w:r>
+        <w:t xml:space="preserve"> and replicable alternative </w:t>
+      </w:r>
+      <w:proofErr w:type="spellStart"/>
+      <w:r>
+        <w:t>for</w:t>
+      </w:r>
+      <w:proofErr w:type="spellEnd"/>
+      <w:r>
+        <w:t xml:space="preserve"> </w:t>
+      </w:r>
+      <w:proofErr w:type="spellStart"/>
+      <w:r>
+        <w:t>the</w:t>
+      </w:r>
+      <w:proofErr w:type="spellEnd"/>
+      <w:r>
+        <w:t xml:space="preserve"> solar </w:t>
+      </w:r>
+      <w:proofErr w:type="spellStart"/>
+      <w:r>
+        <w:t>energy</w:t>
+      </w:r>
+      <w:proofErr w:type="spellEnd"/>
+      <w:r>
+        <w:t xml:space="preserve"> sector in Colombia.</w:t>
       </w:r>
       <w:r>
         <w:br w:type="page"/>
@@ -4308,6 +5192,7 @@
     </w:p>
     <w:p>
       <w:r>
+        <w:lastRenderedPageBreak/>
         <w:t>Índice de tablas</w:t>
       </w:r>
     </w:p>
@@ -4682,6 +5567,7 @@
     </w:p>
     <w:p>
       <w:r>
+        <w:lastRenderedPageBreak/>
         <w:t>Índice de Figuras</w:t>
       </w:r>
     </w:p>
@@ -4706,13 +5592,13 @@
       <w:r>
         <w:fldChar w:fldCharType="separate"/>
       </w:r>
-      <w:hyperlink w:anchor="_Toc209435268" w:history="1">
+      <w:hyperlink w:anchor="_Toc209716474" w:history="1">
         <w:r>
           <w:rPr>
             <w:rStyle w:val="Hipervnculo"/>
             <w:noProof/>
           </w:rPr>
-          <w:t>Figura 2 Diagrama de bloques</w:t>
+          <w:t>Figura 1 Diagrama de bloques</w:t>
         </w:r>
         <w:r>
           <w:rPr>
@@ -4733,7 +5619,77 @@
             <w:noProof/>
             <w:webHidden/>
           </w:rPr>
-          <w:instrText xml:space="preserve"> PAGEREF _Toc209435268 \h </w:instrText>
+          <w:instrText xml:space="preserve"> PAGEREF _Toc209716474 \h </w:instrText>
+        </w:r>
+        <w:r>
+          <w:rPr>
+            <w:noProof/>
+            <w:webHidden/>
+          </w:rPr>
+        </w:r>
+        <w:r>
+          <w:rPr>
+            <w:noProof/>
+            <w:webHidden/>
+          </w:rPr>
+          <w:fldChar w:fldCharType="separate"/>
+        </w:r>
+        <w:r>
+          <w:rPr>
+            <w:noProof/>
+            <w:webHidden/>
+          </w:rPr>
+          <w:t>13</w:t>
+        </w:r>
+        <w:r>
+          <w:rPr>
+            <w:noProof/>
+            <w:webHidden/>
+          </w:rPr>
+          <w:fldChar w:fldCharType="end"/>
+        </w:r>
+      </w:hyperlink>
+    </w:p>
+    <w:p>
+      <w:pPr>
+        <w:pStyle w:val="Tabladeilustraciones"/>
+        <w:tabs>
+          <w:tab w:val="right" w:leader="dot" w:pos="8828"/>
+        </w:tabs>
+        <w:rPr>
+          <w:rFonts w:eastAsiaTheme="minorEastAsia"/>
+          <w:noProof/>
+          <w:lang w:eastAsia="es-CO"/>
+        </w:rPr>
+      </w:pPr>
+      <w:hyperlink w:anchor="_Toc209716475" w:history="1">
+        <w:r>
+          <w:rPr>
+            <w:rStyle w:val="Hipervnculo"/>
+            <w:noProof/>
+          </w:rPr>
+          <w:t>Figura 3 Diagrama unifilar</w:t>
+        </w:r>
+        <w:r>
+          <w:rPr>
+            <w:noProof/>
+            <w:webHidden/>
+          </w:rPr>
+          <w:tab/>
+        </w:r>
+        <w:r>
+          <w:rPr>
+            <w:noProof/>
+            <w:webHidden/>
+          </w:rPr>
+          <w:fldChar w:fldCharType="begin"/>
+        </w:r>
+        <w:r>
+          <w:rPr>
+            <w:noProof/>
+            <w:webHidden/>
+          </w:rPr>
+          <w:instrText xml:space="preserve"> PAGEREF _Toc209716475 \h </w:instrText>
         </w:r>
         <w:r>
           <w:rPr>
@@ -4776,13 +5732,13 @@
           <w:lang w:eastAsia="es-CO"/>
         </w:rPr>
       </w:pPr>
-      <w:hyperlink w:anchor="_Toc209435269" w:history="1">
+      <w:hyperlink w:anchor="_Toc209716476" w:history="1">
         <w:r>
           <w:rPr>
             <w:rStyle w:val="Hipervnculo"/>
             <w:noProof/>
           </w:rPr>
-          <w:t>Figura 3 Diagrama unifilar</w:t>
+          <w:t>Figura 4 Flujo de potencia: paneles solares hasta el sistema de tratamiento</w:t>
         </w:r>
         <w:r>
           <w:rPr>
@@ -4803,7 +5759,7 @@
             <w:noProof/>
             <w:webHidden/>
           </w:rPr>
-          <w:instrText xml:space="preserve"> PAGEREF _Toc209435269 \h </w:instrText>
+          <w:instrText xml:space="preserve"> PAGEREF _Toc209716476 \h </w:instrText>
         </w:r>
         <w:r>
           <w:rPr>
@@ -4823,7 +5779,7 @@
             <w:noProof/>
             <w:webHidden/>
           </w:rPr>
-          <w:t>15</w:t>
+          <w:t>18</w:t>
         </w:r>
         <w:r>
           <w:rPr>
@@ -4835,6 +5791,9 @@
       </w:hyperlink>
     </w:p>
     <w:p>
+      <w:pPr>
+        <w:pStyle w:val="Descripcin"/>
+      </w:pPr>
       <w:r>
         <w:fldChar w:fldCharType="end"/>
       </w:r>
@@ -4852,6 +5811,7 @@
       </w:pPr>
       <w:bookmarkStart w:id="2" w:name="_Toc209712927"/>
       <w:r>
+        <w:lastRenderedPageBreak/>
         <w:t>Introducción</w:t>
       </w:r>
       <w:bookmarkEnd w:id="2"/>
@@ -4869,7 +5829,15 @@
         <w:jc w:val="both"/>
       </w:pPr>
       <w:r>
-        <w:t xml:space="preserve">Para abordar este problema, el proyecto propone diseñar e implementar un sistema autónomo de energía solar fotovoltaica que permita operar una planta de tratamiento de agua mediante cavitación, con una autonomía mínima de cuatro horas y sin necesidad de un banco de baterías. Además, el sistema incluye una etapa de pre-purificación natural, que se desarrolla paralelamente como parte del mismo proyecto, lo que ayuda a mejorar la calidad del agua tratada para su uso agrícola. </w:t>
+        <w:t xml:space="preserve">Para abordar este problema, el proyecto propone diseñar e implementar un sistema autónomo de energía solar fotovoltaica que permita operar una planta de tratamiento de agua mediante cavitación, con una autonomía mínima de cuatro horas y sin necesidad de un banco de baterías. Además, el sistema incluye una etapa de </w:t>
+      </w:r>
+      <w:proofErr w:type="spellStart"/>
+      <w:r>
+        <w:t>pre-purificación</w:t>
+      </w:r>
+      <w:proofErr w:type="spellEnd"/>
+      <w:r>
+        <w:t xml:space="preserve"> natural, que se desarrolla paralelamente como parte del mismo proyecto, lo que ayuda a mejorar la calidad del agua tratada para su uso agrícola. </w:t>
       </w:r>
     </w:p>
     <w:p>
@@ -4904,6 +5872,7 @@
       </w:pPr>
       <w:bookmarkStart w:id="3" w:name="_Toc209712928"/>
       <w:r>
+        <w:lastRenderedPageBreak/>
         <w:t>Objetivos</w:t>
       </w:r>
       <w:bookmarkEnd w:id="3"/>
@@ -5062,6 +6031,7 @@
       </w:pPr>
       <w:bookmarkStart w:id="6" w:name="_Toc209712931"/>
       <w:r>
+        <w:lastRenderedPageBreak/>
         <w:t>Marco Teórico</w:t>
       </w:r>
       <w:bookmarkEnd w:id="6"/>
@@ -5110,13 +6080,21 @@
         <w:jc w:val="both"/>
       </w:pPr>
       <w:r>
-        <w:t>El colapso de las burbujas de cavitación genera una intensa turbulencia y micro</w:t>
+        <w:t xml:space="preserve">El colapso de las burbujas de cavitación genera una intensa turbulencia y </w:t>
+      </w:r>
+      <w:proofErr w:type="spellStart"/>
+      <w:r>
+        <w:t>micro</w:t>
       </w:r>
       <w:r>
         <w:t>-</w:t>
       </w:r>
       <w:r>
-        <w:t>chorros que favorecen la desinfección de matrices líquidas y la reducción de contaminantes. Este mecanismo es particularmente útil en aguas agroindustriales, donde permite disminuir la turbidez, sólidos suspendidos y carga microbiológica sin necesidad de reactivos químicos externos, lo cual reduce costos y minimiza impactos ambientales.</w:t>
+        <w:t>chorros</w:t>
+      </w:r>
+      <w:proofErr w:type="spellEnd"/>
+      <w:r>
+        <w:t xml:space="preserve"> que favorecen la desinfección de matrices líquidas y la reducción de contaminantes. Este mecanismo es particularmente útil en aguas agroindustriales, donde permite disminuir la turbidez, sólidos suspendidos y carga microbiológica sin necesidad de reactivos químicos externos, lo cual reduce costos y minimiza impactos ambientales.</w:t>
       </w:r>
     </w:p>
     <w:p>
@@ -5124,7 +6102,15 @@
         <w:jc w:val="both"/>
       </w:pPr>
       <w:r>
-        <w:t>La eficiencia del proceso depende de variables como la velocidad del flujo, la presión diferencial, el diseño geométrico del dispositivo (venturi, placas perforadas u orificios) y las condiciones de operación. En este sentido, la cavitación hidrodinámica presenta ventajas frente a la cavitación ultrasónica, ya que permite mayor escalabilidad y volumen de tratamiento con menor consumo energético (Gutiérrez-Mosquera et al., 2019).</w:t>
+        <w:t>La eficiencia del proceso depende de variables como la velocidad del flujo, la presión diferencial, el diseño geométrico del dispositivo (</w:t>
+      </w:r>
+      <w:proofErr w:type="spellStart"/>
+      <w:r>
+        <w:t>venturi</w:t>
+      </w:r>
+      <w:proofErr w:type="spellEnd"/>
+      <w:r>
+        <w:t>, placas perforadas u orificios) y las condiciones de operación. En este sentido, la cavitación hidrodinámica presenta ventajas frente a la cavitación ultrasónica, ya que permite mayor escalabilidad y volumen de tratamiento con menor consumo energético (Gutiérrez-Mosquera et al., 2019).</w:t>
       </w:r>
     </w:p>
     <w:p>
@@ -5137,7 +6123,19 @@
         <w:jc w:val="both"/>
       </w:pPr>
       <w:r>
-        <w:t>En el contexto de este proyecto, la cavitación constituye la etapa central del sistema de purificación, ya que permite acondicionar hasta 600 litros de agua al día provenientes del trapiche panelero para su reutilización en riego agrícola. El control y la operación estable del cavitador dependen directamente de la alimentación energética suministrada por el sistema fotovoltaico y regulada por la caja de automatización, lo cual vincula estrechamente esta tecnología con los objetivos de la ingeniería electrónica aplicada al tratamiento sostenible del agua.</w:t>
+        <w:t xml:space="preserve">En el contexto de este proyecto, la cavitación constituye la etapa central del sistema de purificación, ya que permite acondicionar hasta 600 litros de agua al día </w:t>
+      </w:r>
+      <w:r>
+        <w:lastRenderedPageBreak/>
+        <w:t xml:space="preserve">provenientes del trapiche panelero para su reutilización en riego agrícola. El control y la operación estable del </w:t>
+      </w:r>
+      <w:proofErr w:type="spellStart"/>
+      <w:r>
+        <w:t>cavitador</w:t>
+      </w:r>
+      <w:proofErr w:type="spellEnd"/>
+      <w:r>
+        <w:t xml:space="preserve"> dependen directamente de la alimentación energética suministrada por el sistema fotovoltaico y regulada por la caja de automatización, lo cual vincula estrechamente esta tecnología con los objetivos de la ingeniería electrónica aplicada al tratamiento sostenible del agua.</w:t>
       </w:r>
     </w:p>
     <w:p>
@@ -5155,7 +6153,15 @@
       </w:pPr>
       <w:bookmarkStart w:id="8" w:name="_Toc209712933"/>
       <w:r>
-        <w:t>Sistemas fotovoltaicos sin banco de baterías (direct-coupled) y control de motores</w:t>
+        <w:t>Sistemas fotovoltaicos sin banco de baterías (</w:t>
+      </w:r>
+      <w:proofErr w:type="spellStart"/>
+      <w:r>
+        <w:t>direct-coupled</w:t>
+      </w:r>
+      <w:proofErr w:type="spellEnd"/>
+      <w:r>
+        <w:t>) y control de motores</w:t>
       </w:r>
       <w:bookmarkEnd w:id="8"/>
     </w:p>
@@ -5165,7 +6171,39 @@
         <w:jc w:val="both"/>
       </w:pPr>
       <w:r>
-        <w:t>La energía fotovoltaica se ha consolidado como una de las tecnologías renovables de mayor crecimiento a nivel mundial. Según el informe del Fraunhofer ISE (Photovoltaics Report), la tasa de crecimiento anual compuesta (CAGR) de las instalaciones fotovoltaicas fue de aproximadamente 27 % entre 2014 y 2024, lo que evidencia la rápida expansión y maduración de este sector (Philipps &amp; Warmuth, 2025).</w:t>
+        <w:t>La energía fotovoltaica se ha consolidado como una de las tecnologías renovables de mayor crecimiento a nivel mundial. Según el informe del Fraunhofer ISE (</w:t>
+      </w:r>
+      <w:proofErr w:type="spellStart"/>
+      <w:r>
+        <w:t>Photovoltaics</w:t>
+      </w:r>
+      <w:proofErr w:type="spellEnd"/>
+      <w:r>
+        <w:t xml:space="preserve"> </w:t>
+      </w:r>
+      <w:proofErr w:type="spellStart"/>
+      <w:r>
+        <w:t>Report</w:t>
+      </w:r>
+      <w:proofErr w:type="spellEnd"/>
+      <w:r>
+        <w:t>), la tasa de crecimiento anual compuesta (CAGR) de las instalaciones fotovoltaicas fue de aproximadamente 27 % entre 2014 y 2024, lo que evidencia la rápida expansión y maduración de este sector (</w:t>
+      </w:r>
+      <w:proofErr w:type="spellStart"/>
+      <w:r>
+        <w:t>Philipps</w:t>
+      </w:r>
+      <w:proofErr w:type="spellEnd"/>
+      <w:r>
+        <w:t xml:space="preserve"> &amp; </w:t>
+      </w:r>
+      <w:proofErr w:type="spellStart"/>
+      <w:r>
+        <w:t>Warmuth</w:t>
+      </w:r>
+      <w:proofErr w:type="spellEnd"/>
+      <w:r>
+        <w:t>, 2025).</w:t>
       </w:r>
     </w:p>
     <w:p>
@@ -5173,7 +6211,31 @@
         <w:jc w:val="both"/>
       </w:pPr>
       <w:r>
-        <w:t>Dentro de los esquemas de integración fotovoltaica, los sistemas direct-coupled (PV-direct) representan una alternativa eficiente para aplicaciones donde se requiere el suministro energético durante las horas de irradiancia solar, evitando la inclusión de bancos de baterías. En este tipo de configuración, la energía generada por los paneles es consumida directamente por las cargas (en este caso, motores y cavitador), reduciendo costos de inversión, mantenimiento y mitigando los problemas ambientales asociados al ciclo de vida de las baterías.</w:t>
+        <w:t xml:space="preserve">Dentro de los esquemas de integración fotovoltaica, los sistemas </w:t>
+      </w:r>
+      <w:proofErr w:type="spellStart"/>
+      <w:r>
+        <w:t>direct-coupled</w:t>
+      </w:r>
+      <w:proofErr w:type="spellEnd"/>
+      <w:r>
+        <w:t xml:space="preserve"> (PV-</w:t>
+      </w:r>
+      <w:proofErr w:type="spellStart"/>
+      <w:r>
+        <w:t>direct</w:t>
+      </w:r>
+      <w:proofErr w:type="spellEnd"/>
+      <w:r>
+        <w:t xml:space="preserve">) representan una alternativa eficiente para aplicaciones donde se requiere el suministro energético durante las horas de irradiancia solar, evitando la inclusión de bancos de baterías. En este tipo de configuración, la energía generada por los paneles es consumida directamente por las cargas (en este caso, motores y </w:t>
+      </w:r>
+      <w:proofErr w:type="spellStart"/>
+      <w:r>
+        <w:t>cavitador</w:t>
+      </w:r>
+      <w:proofErr w:type="spellEnd"/>
+      <w:r>
+        <w:t>), reduciendo costos de inversión, mantenimiento y mitigando los problemas ambientales asociados al ciclo de vida de las baterías.</w:t>
       </w:r>
     </w:p>
     <w:p>
@@ -5181,7 +6243,15 @@
         <w:jc w:val="both"/>
       </w:pPr>
       <w:r>
-        <w:t>Desde la perspectiva de la ingeniería electrónica, la implementación de sistemas PV-direct presenta retos específicos:</w:t>
+        <w:t>Desde la perspectiva de la ingeniería electrónica, la implementación de sistemas PV-</w:t>
+      </w:r>
+      <w:proofErr w:type="spellStart"/>
+      <w:r>
+        <w:t>direct</w:t>
+      </w:r>
+      <w:proofErr w:type="spellEnd"/>
+      <w:r>
+        <w:t xml:space="preserve"> presenta retos específicos:</w:t>
       </w:r>
     </w:p>
     <w:p>
@@ -5301,7 +6371,15 @@
         <w:jc w:val="both"/>
       </w:pPr>
       <w:r>
-        <w:t>En el contexto del presente proyecto, esta configuración resulta estratégica: permite operar el cavitador y las bombas sin necesidad de almacenamiento intermedio, manteniendo una autonomía mínima de cuatro horas durante condiciones de irradiancia adecuadas. El diseño de la caja de automatización cumple un papel clave, ya que integra tanto los dispositivos de protección como los esquemas de control, asegurando la confiabilidad del sistema en campo.</w:t>
+        <w:t xml:space="preserve">En el contexto del presente proyecto, esta configuración resulta estratégica: permite operar el </w:t>
+      </w:r>
+      <w:proofErr w:type="spellStart"/>
+      <w:r>
+        <w:t>cavitador</w:t>
+      </w:r>
+      <w:proofErr w:type="spellEnd"/>
+      <w:r>
+        <w:t xml:space="preserve"> y las bombas sin necesidad de almacenamiento intermedio, manteniendo una autonomía mínima de cuatro horas durante condiciones de irradiancia adecuadas. El diseño de la caja de automatización cumple un papel clave, ya que integra tanto los dispositivos de protección como los esquemas de control, asegurando la confiabilidad del sistema en campo.</w:t>
       </w:r>
     </w:p>
     <w:p/>
@@ -5347,7 +6425,15 @@
         </w:rPr>
       </w:pPr>
       <w:r>
-        <w:t>Es importante resaltar que dentro del presente proyecto, el componente de ingeniería química fue desarrollado en paralelo, abordando los aspectos normativos y experimentales relacionados con la calidad del agua tratada. Dicho trabajo estableció los parámetros técnicos de referencia —</w:t>
+        <w:t xml:space="preserve">Es importante resaltar </w:t>
+      </w:r>
+      <w:proofErr w:type="gramStart"/>
+      <w:r>
+        <w:t>que</w:t>
+      </w:r>
+      <w:proofErr w:type="gramEnd"/>
+      <w:r>
+        <w:t xml:space="preserve"> dentro del presente proyecto, el componente de ingeniería química fue desarrollado en paralelo, abordando los aspectos normativos y experimentales relacionados con la calidad del agua tratada. Dicho trabajo estableció los parámetros técnicos de referencia —</w:t>
       </w:r>
       <w:r>
         <w:rPr>
@@ -5372,6 +6458,7 @@
       </w:pPr>
       <w:bookmarkStart w:id="14" w:name="_Toc209712939"/>
       <w:r>
+        <w:lastRenderedPageBreak/>
         <w:t>Diseño del Sistema</w:t>
       </w:r>
       <w:bookmarkEnd w:id="14"/>
@@ -5390,7 +6477,15 @@
         <w:jc w:val="both"/>
       </w:pPr>
       <w:r>
-        <w:t>En condiciones normales de operación, la energía es suministrada por el campo fotovoltaico de baja tensión, diseñado para alimentar directamente un inversor de frecuencia (variador BPD), el cual convierte la corriente continua generada por los paneles en corriente alterna trifásica. De este modo, se asegura el arranque y funcionamiento de los tres motores que intervienen en el proceso: el cavitador, la bomba de flujo constante y la bomba de retorno.</w:t>
+        <w:t xml:space="preserve">En condiciones normales de operación, la energía es suministrada por el campo fotovoltaico de baja tensión, diseñado para alimentar directamente un inversor de frecuencia (variador BPD), el cual convierte la corriente continua generada por los paneles en corriente alterna trifásica. De este modo, se asegura el arranque y funcionamiento de los tres motores que intervienen en el proceso: el </w:t>
+      </w:r>
+      <w:proofErr w:type="spellStart"/>
+      <w:r>
+        <w:t>cavitador</w:t>
+      </w:r>
+      <w:proofErr w:type="spellEnd"/>
+      <w:r>
+        <w:t>, la bomba de flujo constante y la bomba de retorno.</w:t>
       </w:r>
     </w:p>
     <w:p>
@@ -5398,7 +6493,15 @@
         <w:jc w:val="both"/>
       </w:pPr>
       <w:r>
-        <w:t>Como medida de seguridad y confiabilidad, el sistema incluye una alimentación alterna de respaldo. En caso de baja radiación solar o variaciones climáticas que comprometan la potencia disponible, el variador conmuta automáticamente a la red eléctrica, evitando que el cavitador pierda continuidad en medio del proceso. Esta redundancia energética garantiza la estabilidad del sistema y la preservación de la calidad del agua tratada.</w:t>
+        <w:t xml:space="preserve">Como medida de seguridad y confiabilidad, el sistema incluye una alimentación alterna de respaldo. En caso de baja radiación solar o variaciones climáticas que comprometan la potencia disponible, el variador conmuta automáticamente a la red eléctrica, evitando que el </w:t>
+      </w:r>
+      <w:proofErr w:type="spellStart"/>
+      <w:r>
+        <w:t>cavitador</w:t>
+      </w:r>
+      <w:proofErr w:type="spellEnd"/>
+      <w:r>
+        <w:t xml:space="preserve"> pierda continuidad en medio del proceso. Esta redundancia energética garantiza la estabilidad del sistema y la preservación de la calidad del agua tratada.</w:t>
       </w:r>
     </w:p>
     <w:p>
@@ -5406,7 +6509,23 @@
         <w:jc w:val="both"/>
       </w:pPr>
       <w:r>
-        <w:t>La caja de automatización constituye el núcleo del sistema, al concentrar los elementos de protección, control y distribución. Está diseñada para gestionar la operación secuencial del cavitador y de la bomba de retorno, a través de un selector manual de funciones, que permite al operador escoger entre dos modos de operación: (i) cavitación para el tratamiento del agua, o (ii) recirculación mediante la bomba de retorno.</w:t>
+        <w:t xml:space="preserve">La caja de automatización constituye el núcleo del sistema, al concentrar los elementos de protección, control y distribución. Está diseñada para gestionar la operación secuencial del </w:t>
+      </w:r>
+      <w:proofErr w:type="spellStart"/>
+      <w:r>
+        <w:t>cavitador</w:t>
+      </w:r>
+      <w:proofErr w:type="spellEnd"/>
+      <w:r>
+        <w:t xml:space="preserve"> y de la bomba de retorno, a través de un selector manual de funciones, que permite al operador escoger entre dos modos de operación: (i) cavitación para el tratamiento del agua, o (</w:t>
+      </w:r>
+      <w:proofErr w:type="spellStart"/>
+      <w:r>
+        <w:t>ii</w:t>
+      </w:r>
+      <w:proofErr w:type="spellEnd"/>
+      <w:r>
+        <w:t>) recirculación mediante la bomba de retorno.</w:t>
       </w:r>
     </w:p>
     <w:p>
@@ -5414,7 +6533,23 @@
         <w:jc w:val="both"/>
       </w:pPr>
       <w:r>
-        <w:t>El sistema incorpora un botón de parada de emergencia, ubicado en la parte frontal, que interrumpe de inmediato la alimentación en caso de falla o situación de riesgo, garantizando la seguridad del operario y de los equipos. Para prevenir sobrecorrientes transitorias en el arranque, se implementó un temporizador con retardo de 10 segundos, de manera que primero se energiza el cavitador y, posteriormente, la bomba de flujo constante. Con ello se evita que ambos arranquen de forma simultánea, reduciendo picos de corriente y prolongando la vida útil de los equipos.</w:t>
+        <w:t xml:space="preserve">El sistema incorpora un botón de parada de emergencia, ubicado en la parte frontal, que interrumpe de inmediato la alimentación en caso de falla o situación de riesgo, garantizando la seguridad del operario y de los equipos. Para prevenir </w:t>
+      </w:r>
+      <w:proofErr w:type="spellStart"/>
+      <w:r>
+        <w:t>sobrecorrientes</w:t>
+      </w:r>
+      <w:proofErr w:type="spellEnd"/>
+      <w:r>
+        <w:t xml:space="preserve"> transitorias en el arranque, se implementó un temporizador con retardo de 10 segundos, de manera que primero se energiza el </w:t>
+      </w:r>
+      <w:proofErr w:type="spellStart"/>
+      <w:r>
+        <w:t>cavitador</w:t>
+      </w:r>
+      <w:proofErr w:type="spellEnd"/>
+      <w:r>
+        <w:t xml:space="preserve"> y, posteriormente, la bomba de flujo constante. Con ello se evita que ambos arranquen de forma simultánea, reduciendo picos de corriente y prolongando la vida útil de los equipos.</w:t>
       </w:r>
     </w:p>
     <w:p>
@@ -5435,6 +6570,7 @@
         <w:jc w:val="both"/>
       </w:pPr>
       <w:r>
+        <w:lastRenderedPageBreak/>
         <w:t>Protecciones en corriente continua (DC): fusibles de entrada, interruptor seccionador DC y descargadores de sobretensión (DPS).</w:t>
       </w:r>
     </w:p>
@@ -5502,7 +6638,15 @@
         <w:spacing w:after="0"/>
       </w:pPr>
       <w:r>
-        <w:t>Generación fotovoltaica: campo solar conformado por paneles monocristalinos de 500 Wp cada uno, con tensión nominal de 38.35 V y corriente de 13.04 A, conectados en paralelo.</w:t>
+        <w:t xml:space="preserve">Generación fotovoltaica: campo solar conformado por paneles monocristalinos de 500 </w:t>
+      </w:r>
+      <w:proofErr w:type="spellStart"/>
+      <w:r>
+        <w:t>Wp</w:t>
+      </w:r>
+      <w:proofErr w:type="spellEnd"/>
+      <w:r>
+        <w:t xml:space="preserve"> cada uno, con tensión nominal de 38.35 V y corriente de 13.04 A, conectados en paralelo.</w:t>
       </w:r>
     </w:p>
     <w:p>
@@ -5554,7 +6698,15 @@
         <w:spacing w:after="0"/>
       </w:pPr>
       <w:r>
-        <w:t>Cargas: tres motores eléctricos que garantizan el proceso de tratamiento: cavitador (1 HP), bomba de flujo constante (0.5 HP) y bomba de retorno (1.5 HP).</w:t>
+        <w:t xml:space="preserve">Cargas: tres motores eléctricos que garantizan el proceso de tratamiento: </w:t>
+      </w:r>
+      <w:proofErr w:type="spellStart"/>
+      <w:r>
+        <w:t>cavitador</w:t>
+      </w:r>
+      <w:proofErr w:type="spellEnd"/>
+      <w:r>
+        <w:t xml:space="preserve"> (1 HP), bomba de flujo constante (0.5 HP) y bomba de retorno (1.5 HP).</w:t>
       </w:r>
     </w:p>
     <w:p>
@@ -5566,6 +6718,7 @@
         <w:rPr>
           <w:noProof/>
         </w:rPr>
+        <w:lastRenderedPageBreak/>
         <w:drawing>
           <wp:inline distT="0" distB="0" distL="0" distR="0" wp14:anchorId="364A510C" wp14:editId="6DE61721">
             <wp:extent cx="5612130" cy="3215005"/>
@@ -5608,7 +6761,7 @@
         <w:pStyle w:val="Descripcin"/>
         <w:jc w:val="center"/>
       </w:pPr>
-      <w:bookmarkStart w:id="16" w:name="_Toc209435268"/>
+      <w:bookmarkStart w:id="16" w:name="_Toc209716474"/>
       <w:r>
         <w:t xml:space="preserve">Figura </w:t>
       </w:r>
@@ -5843,7 +6996,23 @@
                 <w:sz w:val="22"/>
                 <w:szCs w:val="22"/>
               </w:rPr>
-              <w:t>8 paneles solares monocristalinos de 500 Wp conectados en serie.</w:t>
+              <w:t xml:space="preserve">8 paneles solares monocristalinos de 500 </w:t>
+            </w:r>
+            <w:proofErr w:type="spellStart"/>
+            <w:r>
+              <w:rPr>
+                <w:sz w:val="22"/>
+                <w:szCs w:val="22"/>
+              </w:rPr>
+              <w:t>Wp</w:t>
+            </w:r>
+            <w:proofErr w:type="spellEnd"/>
+            <w:r>
+              <w:rPr>
+                <w:sz w:val="22"/>
+                <w:szCs w:val="22"/>
+              </w:rPr>
+              <w:t xml:space="preserve"> conectados en serie.</w:t>
             </w:r>
           </w:p>
         </w:tc>
@@ -5916,7 +7085,15 @@
                 <w:sz w:val="22"/>
                 <w:szCs w:val="22"/>
               </w:rPr>
-              <w:t>Variador de frecuencia BPD; protecciones DC y AC; protección termomagnética; DPS; barrajes; temporizador con retardo (10 s); contactor; parada de emergencia; transferencia manual/automática; teclado de supervisión.</w:t>
+              <w:t xml:space="preserve">Variador de frecuencia BPD; protecciones DC y AC; protección termomagnética; DPS; </w:t>
+            </w:r>
+            <w:r>
+              <w:rPr>
+                <w:sz w:val="22"/>
+                <w:szCs w:val="22"/>
+              </w:rPr>
+              <w:lastRenderedPageBreak/>
+              <w:t>barrajes; temporizador con retardo (10 s); contactor; parada de emergencia; transferencia manual/automática; teclado de supervisión.</w:t>
             </w:r>
           </w:p>
         </w:tc>
@@ -5938,7 +7115,16 @@
                 <w:sz w:val="22"/>
                 <w:szCs w:val="22"/>
               </w:rPr>
-              <w:t>Proteger, distribuir y controlar la energía. Gestionar arranques secuenciales y garantizar la seguridad del sistema.</w:t>
+              <w:lastRenderedPageBreak/>
+              <w:t xml:space="preserve">Proteger, distribuir y controlar la energía. </w:t>
+            </w:r>
+            <w:r>
+              <w:rPr>
+                <w:sz w:val="22"/>
+                <w:szCs w:val="22"/>
+              </w:rPr>
+              <w:lastRenderedPageBreak/>
+              <w:t>Gestionar arranques secuenciales y garantizar la seguridad del sistema.</w:t>
             </w:r>
           </w:p>
         </w:tc>
@@ -5967,6 +7153,7 @@
                 <w:sz w:val="22"/>
                 <w:szCs w:val="22"/>
               </w:rPr>
+              <w:lastRenderedPageBreak/>
               <w:t>Sensores de nivel</w:t>
             </w:r>
           </w:p>
@@ -6062,7 +7249,39 @@
                 <w:sz w:val="22"/>
                 <w:szCs w:val="22"/>
               </w:rPr>
-              <w:t>Bomba de 0.5 HP (flujo al cavitador); motor del cavitador 1 HP; bomba de 1.5 HP (transporte al destino final).</w:t>
+              <w:t xml:space="preserve">Bomba de 0.5 HP (flujo al </w:t>
+            </w:r>
+            <w:proofErr w:type="spellStart"/>
+            <w:r>
+              <w:rPr>
+                <w:sz w:val="22"/>
+                <w:szCs w:val="22"/>
+              </w:rPr>
+              <w:t>cavitador</w:t>
+            </w:r>
+            <w:proofErr w:type="spellEnd"/>
+            <w:r>
+              <w:rPr>
+                <w:sz w:val="22"/>
+                <w:szCs w:val="22"/>
+              </w:rPr>
+              <w:t xml:space="preserve">); motor del </w:t>
+            </w:r>
+            <w:proofErr w:type="spellStart"/>
+            <w:r>
+              <w:rPr>
+                <w:sz w:val="22"/>
+                <w:szCs w:val="22"/>
+              </w:rPr>
+              <w:t>cavitador</w:t>
+            </w:r>
+            <w:proofErr w:type="spellEnd"/>
+            <w:r>
+              <w:rPr>
+                <w:sz w:val="22"/>
+                <w:szCs w:val="22"/>
+              </w:rPr>
+              <w:t xml:space="preserve"> 1 HP; bomba de 1.5 HP (transporte al destino final).</w:t>
             </w:r>
           </w:p>
         </w:tc>
@@ -6182,7 +7401,7 @@
         <w:pStyle w:val="Descripcin"/>
         <w:jc w:val="center"/>
       </w:pPr>
-      <w:bookmarkStart w:id="18" w:name="_Toc209435269"/>
+      <w:bookmarkStart w:id="18" w:name="_Toc209716475"/>
       <w:r>
         <w:t xml:space="preserve">Figura </w:t>
       </w:r>
@@ -6220,6 +7439,7 @@
       </w:pPr>
       <w:bookmarkStart w:id="19" w:name="_Toc209712941"/>
       <w:r>
+        <w:lastRenderedPageBreak/>
         <w:t>Descripción de subsistemas</w:t>
       </w:r>
       <w:bookmarkEnd w:id="19"/>
@@ -6247,7 +7467,15 @@
     </w:p>
     <w:p>
       <w:r>
-        <w:t>Constituido por un arreglo de ocho (8) paneles solares monocristalinos, conectados en serie, con potencia nominal de 500 Wp cada uno. Este campo garantiza la entrega de energía en corriente continua a baja tensión, adecuada para la alimentación directa del variador de frecuencia.</w:t>
+        <w:t xml:space="preserve">Constituido por un arreglo de ocho (8) paneles solares monocristalinos, conectados en serie, con potencia nominal de 500 </w:t>
+      </w:r>
+      <w:proofErr w:type="spellStart"/>
+      <w:r>
+        <w:t>Wp</w:t>
+      </w:r>
+      <w:proofErr w:type="spellEnd"/>
+      <w:r>
+        <w:t xml:space="preserve"> cada uno. Este campo garantiza la entrega de energía en corriente continua a baja tensión, adecuada para la alimentación directa del variador de frecuencia.</w:t>
       </w:r>
     </w:p>
     <w:p/>
@@ -6436,6 +7664,7 @@
         </w:numPr>
       </w:pPr>
       <w:r>
+        <w:lastRenderedPageBreak/>
         <w:t>Un sensor tipo flotador, encargado de detectar el llenado y vaciado del tanque.</w:t>
       </w:r>
     </w:p>
@@ -6484,7 +7713,15 @@
         </w:numPr>
       </w:pPr>
       <w:r>
-        <w:t>Bomba de 0.5 HP que alimenta el cavitador.</w:t>
+        <w:t xml:space="preserve">Bomba de 0.5 HP que alimenta el </w:t>
+      </w:r>
+      <w:proofErr w:type="spellStart"/>
+      <w:r>
+        <w:t>cavitador</w:t>
+      </w:r>
+      <w:proofErr w:type="spellEnd"/>
+      <w:r>
+        <w:t>.</w:t>
       </w:r>
     </w:p>
     <w:p>
@@ -6496,7 +7733,15 @@
         </w:numPr>
       </w:pPr>
       <w:r>
-        <w:t>Motor del cavitador de 1 HP, responsable del proceso de implosión de burbujas y tratamiento del agua.</w:t>
+        <w:t xml:space="preserve">Motor del </w:t>
+      </w:r>
+      <w:proofErr w:type="spellStart"/>
+      <w:r>
+        <w:t>cavitador</w:t>
+      </w:r>
+      <w:proofErr w:type="spellEnd"/>
+      <w:r>
+        <w:t xml:space="preserve"> de 1 HP, responsable del proceso de implosión de burbujas y tratamiento del agua.</w:t>
       </w:r>
     </w:p>
     <w:p>
@@ -6578,7 +7823,6 @@
               <w:bottom w:val="single" w:sz="4" w:space="0" w:color="auto"/>
               <w:right w:val="single" w:sz="4" w:space="0" w:color="auto"/>
             </w:tcBorders>
-            <w:shd w:val="clear" w:color="auto" w:fill="auto"/>
             <w:vAlign w:val="center"/>
             <w:hideMark/>
           </w:tcPr>
@@ -6619,7 +7863,6 @@
               <w:bottom w:val="single" w:sz="4" w:space="0" w:color="auto"/>
               <w:right w:val="single" w:sz="4" w:space="0" w:color="auto"/>
             </w:tcBorders>
-            <w:shd w:val="clear" w:color="auto" w:fill="auto"/>
             <w:vAlign w:val="center"/>
             <w:hideMark/>
           </w:tcPr>
@@ -6660,7 +7903,6 @@
               <w:bottom w:val="single" w:sz="4" w:space="0" w:color="auto"/>
               <w:right w:val="single" w:sz="4" w:space="0" w:color="auto"/>
             </w:tcBorders>
-            <w:shd w:val="clear" w:color="auto" w:fill="auto"/>
             <w:vAlign w:val="center"/>
             <w:hideMark/>
           </w:tcPr>
@@ -6707,7 +7949,6 @@
               <w:bottom w:val="single" w:sz="4" w:space="0" w:color="auto"/>
               <w:right w:val="single" w:sz="4" w:space="0" w:color="auto"/>
             </w:tcBorders>
-            <w:shd w:val="clear" w:color="auto" w:fill="auto"/>
             <w:vAlign w:val="center"/>
             <w:hideMark/>
           </w:tcPr>
@@ -6743,7 +7984,6 @@
               <w:bottom w:val="single" w:sz="4" w:space="0" w:color="auto"/>
               <w:right w:val="single" w:sz="4" w:space="0" w:color="auto"/>
             </w:tcBorders>
-            <w:shd w:val="clear" w:color="auto" w:fill="auto"/>
             <w:vAlign w:val="center"/>
             <w:hideMark/>
           </w:tcPr>
@@ -6779,7 +8019,6 @@
               <w:bottom w:val="single" w:sz="4" w:space="0" w:color="auto"/>
               <w:right w:val="single" w:sz="4" w:space="0" w:color="auto"/>
             </w:tcBorders>
-            <w:shd w:val="clear" w:color="auto" w:fill="auto"/>
             <w:vAlign w:val="center"/>
             <w:hideMark/>
           </w:tcPr>
@@ -6821,7 +8060,6 @@
               <w:bottom w:val="single" w:sz="4" w:space="0" w:color="auto"/>
               <w:right w:val="single" w:sz="4" w:space="0" w:color="auto"/>
             </w:tcBorders>
-            <w:shd w:val="clear" w:color="auto" w:fill="auto"/>
             <w:vAlign w:val="center"/>
             <w:hideMark/>
           </w:tcPr>
@@ -6857,7 +8095,6 @@
               <w:bottom w:val="single" w:sz="4" w:space="0" w:color="auto"/>
               <w:right w:val="single" w:sz="4" w:space="0" w:color="auto"/>
             </w:tcBorders>
-            <w:shd w:val="clear" w:color="auto" w:fill="auto"/>
             <w:vAlign w:val="center"/>
             <w:hideMark/>
           </w:tcPr>
@@ -6880,7 +8117,29 @@
                 <w:lang w:eastAsia="es-CO"/>
                 <w14:ligatures w14:val="none"/>
               </w:rPr>
-              <w:t>450 Wp (típico)</w:t>
+              <w:t xml:space="preserve">450 </w:t>
+            </w:r>
+            <w:proofErr w:type="spellStart"/>
+            <w:r>
+              <w:rPr>
+                <w:rFonts w:ascii="Aptos Narrow" w:eastAsia="Times New Roman" w:hAnsi="Aptos Narrow" w:cs="Times New Roman"/>
+                <w:color w:val="000000"/>
+                <w:kern w:val="0"/>
+                <w:lang w:eastAsia="es-CO"/>
+                <w14:ligatures w14:val="none"/>
+              </w:rPr>
+              <w:t>Wp</w:t>
+            </w:r>
+            <w:proofErr w:type="spellEnd"/>
+            <w:r>
+              <w:rPr>
+                <w:rFonts w:ascii="Aptos Narrow" w:eastAsia="Times New Roman" w:hAnsi="Aptos Narrow" w:cs="Times New Roman"/>
+                <w:color w:val="000000"/>
+                <w:kern w:val="0"/>
+                <w:lang w:eastAsia="es-CO"/>
+                <w14:ligatures w14:val="none"/>
+              </w:rPr>
+              <w:t xml:space="preserve"> (típico)</w:t>
             </w:r>
           </w:p>
         </w:tc>
@@ -6893,7 +8152,6 @@
               <w:bottom w:val="single" w:sz="4" w:space="0" w:color="auto"/>
               <w:right w:val="single" w:sz="4" w:space="0" w:color="auto"/>
             </w:tcBorders>
-            <w:shd w:val="clear" w:color="auto" w:fill="auto"/>
             <w:vAlign w:val="center"/>
             <w:hideMark/>
           </w:tcPr>
@@ -6935,7 +8193,6 @@
               <w:bottom w:val="single" w:sz="4" w:space="0" w:color="auto"/>
               <w:right w:val="single" w:sz="4" w:space="0" w:color="auto"/>
             </w:tcBorders>
-            <w:shd w:val="clear" w:color="auto" w:fill="auto"/>
             <w:vAlign w:val="center"/>
             <w:hideMark/>
           </w:tcPr>
@@ -6971,7 +8228,6 @@
               <w:bottom w:val="single" w:sz="4" w:space="0" w:color="auto"/>
               <w:right w:val="single" w:sz="4" w:space="0" w:color="auto"/>
             </w:tcBorders>
-            <w:shd w:val="clear" w:color="auto" w:fill="auto"/>
             <w:vAlign w:val="center"/>
             <w:hideMark/>
           </w:tcPr>
@@ -6994,8 +8250,20 @@
                 <w:lang w:eastAsia="es-CO"/>
                 <w14:ligatures w14:val="none"/>
               </w:rPr>
-              <w:t>3.6 kWp</w:t>
-            </w:r>
+              <w:t xml:space="preserve">3.6 </w:t>
+            </w:r>
+            <w:proofErr w:type="spellStart"/>
+            <w:r>
+              <w:rPr>
+                <w:rFonts w:ascii="Aptos Narrow" w:eastAsia="Times New Roman" w:hAnsi="Aptos Narrow" w:cs="Times New Roman"/>
+                <w:color w:val="000000"/>
+                <w:kern w:val="0"/>
+                <w:lang w:eastAsia="es-CO"/>
+                <w14:ligatures w14:val="none"/>
+              </w:rPr>
+              <w:t>kWp</w:t>
+            </w:r>
+            <w:proofErr w:type="spellEnd"/>
           </w:p>
         </w:tc>
         <w:tc>
@@ -7007,7 +8275,6 @@
               <w:bottom w:val="single" w:sz="4" w:space="0" w:color="auto"/>
               <w:right w:val="single" w:sz="4" w:space="0" w:color="auto"/>
             </w:tcBorders>
-            <w:shd w:val="clear" w:color="auto" w:fill="auto"/>
             <w:vAlign w:val="center"/>
             <w:hideMark/>
           </w:tcPr>
@@ -7030,8 +8297,20 @@
                 <w:lang w:eastAsia="es-CO"/>
                 <w14:ligatures w14:val="none"/>
               </w:rPr>
-              <w:t>8 × 450 Wp</w:t>
-            </w:r>
+              <w:t xml:space="preserve">8 × 450 </w:t>
+            </w:r>
+            <w:proofErr w:type="spellStart"/>
+            <w:r>
+              <w:rPr>
+                <w:rFonts w:ascii="Aptos Narrow" w:eastAsia="Times New Roman" w:hAnsi="Aptos Narrow" w:cs="Times New Roman"/>
+                <w:color w:val="000000"/>
+                <w:kern w:val="0"/>
+                <w:lang w:eastAsia="es-CO"/>
+                <w14:ligatures w14:val="none"/>
+              </w:rPr>
+              <w:t>Wp</w:t>
+            </w:r>
+            <w:proofErr w:type="spellEnd"/>
           </w:p>
         </w:tc>
       </w:tr>
@@ -7049,7 +8328,6 @@
               <w:bottom w:val="single" w:sz="4" w:space="0" w:color="auto"/>
               <w:right w:val="single" w:sz="4" w:space="0" w:color="auto"/>
             </w:tcBorders>
-            <w:shd w:val="clear" w:color="auto" w:fill="auto"/>
             <w:vAlign w:val="center"/>
             <w:hideMark/>
           </w:tcPr>
@@ -7072,7 +8350,29 @@
                 <w:lang w:eastAsia="es-CO"/>
                 <w14:ligatures w14:val="none"/>
               </w:rPr>
-              <w:t>Tensión máxima en serie (Vmp)</w:t>
+              <w:t>Tensión máxima en serie (</w:t>
+            </w:r>
+            <w:proofErr w:type="spellStart"/>
+            <w:r>
+              <w:rPr>
+                <w:rFonts w:ascii="Aptos Narrow" w:eastAsia="Times New Roman" w:hAnsi="Aptos Narrow" w:cs="Times New Roman"/>
+                <w:color w:val="000000"/>
+                <w:kern w:val="0"/>
+                <w:lang w:eastAsia="es-CO"/>
+                <w14:ligatures w14:val="none"/>
+              </w:rPr>
+              <w:t>Vmp</w:t>
+            </w:r>
+            <w:proofErr w:type="spellEnd"/>
+            <w:r>
+              <w:rPr>
+                <w:rFonts w:ascii="Aptos Narrow" w:eastAsia="Times New Roman" w:hAnsi="Aptos Narrow" w:cs="Times New Roman"/>
+                <w:color w:val="000000"/>
+                <w:kern w:val="0"/>
+                <w:lang w:eastAsia="es-CO"/>
+                <w14:ligatures w14:val="none"/>
+              </w:rPr>
+              <w:t>)</w:t>
             </w:r>
           </w:p>
         </w:tc>
@@ -7085,7 +8385,6 @@
               <w:bottom w:val="single" w:sz="4" w:space="0" w:color="auto"/>
               <w:right w:val="single" w:sz="4" w:space="0" w:color="auto"/>
             </w:tcBorders>
-            <w:shd w:val="clear" w:color="auto" w:fill="auto"/>
             <w:vAlign w:val="center"/>
             <w:hideMark/>
           </w:tcPr>
@@ -7121,7 +8420,6 @@
               <w:bottom w:val="single" w:sz="4" w:space="0" w:color="auto"/>
               <w:right w:val="single" w:sz="4" w:space="0" w:color="auto"/>
             </w:tcBorders>
-            <w:shd w:val="clear" w:color="auto" w:fill="auto"/>
             <w:vAlign w:val="center"/>
             <w:hideMark/>
           </w:tcPr>
@@ -7163,7 +8461,6 @@
               <w:bottom w:val="single" w:sz="4" w:space="0" w:color="auto"/>
               <w:right w:val="single" w:sz="4" w:space="0" w:color="auto"/>
             </w:tcBorders>
-            <w:shd w:val="clear" w:color="auto" w:fill="auto"/>
             <w:vAlign w:val="center"/>
             <w:hideMark/>
           </w:tcPr>
@@ -7199,7 +8496,6 @@
               <w:bottom w:val="single" w:sz="4" w:space="0" w:color="auto"/>
               <w:right w:val="single" w:sz="4" w:space="0" w:color="auto"/>
             </w:tcBorders>
-            <w:shd w:val="clear" w:color="auto" w:fill="auto"/>
             <w:vAlign w:val="center"/>
             <w:hideMark/>
           </w:tcPr>
@@ -7235,7 +8531,6 @@
               <w:bottom w:val="single" w:sz="4" w:space="0" w:color="auto"/>
               <w:right w:val="single" w:sz="4" w:space="0" w:color="auto"/>
             </w:tcBorders>
-            <w:shd w:val="clear" w:color="auto" w:fill="auto"/>
             <w:vAlign w:val="center"/>
             <w:hideMark/>
           </w:tcPr>
@@ -7330,7 +8625,6 @@
         <w:tc>
           <w:tcPr>
             <w:tcW w:w="3325" w:type="dxa"/>
-            <w:shd w:val="clear" w:color="auto" w:fill="auto"/>
             <w:noWrap/>
             <w:vAlign w:val="bottom"/>
             <w:hideMark/>
@@ -7354,6 +8648,7 @@
                 <w:lang w:eastAsia="es-CO"/>
                 <w14:ligatures w14:val="none"/>
               </w:rPr>
+              <w:lastRenderedPageBreak/>
               <w:t>Parámetro</w:t>
             </w:r>
           </w:p>
@@ -7361,7 +8656,6 @@
         <w:tc>
           <w:tcPr>
             <w:tcW w:w="2618" w:type="dxa"/>
-            <w:shd w:val="clear" w:color="auto" w:fill="auto"/>
             <w:noWrap/>
             <w:vAlign w:val="bottom"/>
             <w:hideMark/>
@@ -7392,7 +8686,6 @@
         <w:tc>
           <w:tcPr>
             <w:tcW w:w="2618" w:type="dxa"/>
-            <w:shd w:val="clear" w:color="auto" w:fill="auto"/>
             <w:noWrap/>
             <w:vAlign w:val="bottom"/>
             <w:hideMark/>
@@ -7429,7 +8722,6 @@
         <w:tc>
           <w:tcPr>
             <w:tcW w:w="3325" w:type="dxa"/>
-            <w:shd w:val="clear" w:color="auto" w:fill="auto"/>
             <w:noWrap/>
             <w:vAlign w:val="bottom"/>
             <w:hideMark/>
@@ -7460,7 +8752,6 @@
         <w:tc>
           <w:tcPr>
             <w:tcW w:w="2618" w:type="dxa"/>
-            <w:shd w:val="clear" w:color="auto" w:fill="auto"/>
             <w:noWrap/>
             <w:vAlign w:val="bottom"/>
             <w:hideMark/>
@@ -7491,7 +8782,6 @@
         <w:tc>
           <w:tcPr>
             <w:tcW w:w="2618" w:type="dxa"/>
-            <w:shd w:val="clear" w:color="auto" w:fill="auto"/>
             <w:noWrap/>
             <w:vAlign w:val="bottom"/>
             <w:hideMark/>
@@ -7528,7 +8818,6 @@
         <w:tc>
           <w:tcPr>
             <w:tcW w:w="3325" w:type="dxa"/>
-            <w:shd w:val="clear" w:color="auto" w:fill="auto"/>
             <w:noWrap/>
             <w:vAlign w:val="bottom"/>
             <w:hideMark/>
@@ -7559,7 +8848,6 @@
         <w:tc>
           <w:tcPr>
             <w:tcW w:w="2618" w:type="dxa"/>
-            <w:shd w:val="clear" w:color="auto" w:fill="auto"/>
             <w:noWrap/>
             <w:vAlign w:val="bottom"/>
             <w:hideMark/>
@@ -7590,7 +8878,6 @@
         <w:tc>
           <w:tcPr>
             <w:tcW w:w="2618" w:type="dxa"/>
-            <w:shd w:val="clear" w:color="auto" w:fill="auto"/>
             <w:noWrap/>
             <w:vAlign w:val="bottom"/>
             <w:hideMark/>
@@ -7627,7 +8914,6 @@
         <w:tc>
           <w:tcPr>
             <w:tcW w:w="3325" w:type="dxa"/>
-            <w:shd w:val="clear" w:color="auto" w:fill="auto"/>
             <w:noWrap/>
             <w:vAlign w:val="bottom"/>
             <w:hideMark/>
@@ -7658,7 +8944,6 @@
         <w:tc>
           <w:tcPr>
             <w:tcW w:w="2618" w:type="dxa"/>
-            <w:shd w:val="clear" w:color="auto" w:fill="auto"/>
             <w:noWrap/>
             <w:vAlign w:val="bottom"/>
             <w:hideMark/>
@@ -7689,7 +8974,6 @@
         <w:tc>
           <w:tcPr>
             <w:tcW w:w="2618" w:type="dxa"/>
-            <w:shd w:val="clear" w:color="auto" w:fill="auto"/>
             <w:noWrap/>
             <w:vAlign w:val="bottom"/>
             <w:hideMark/>
@@ -7726,7 +9010,6 @@
         <w:tc>
           <w:tcPr>
             <w:tcW w:w="3325" w:type="dxa"/>
-            <w:shd w:val="clear" w:color="auto" w:fill="auto"/>
             <w:noWrap/>
             <w:vAlign w:val="bottom"/>
             <w:hideMark/>
@@ -7757,7 +9040,6 @@
         <w:tc>
           <w:tcPr>
             <w:tcW w:w="2618" w:type="dxa"/>
-            <w:shd w:val="clear" w:color="auto" w:fill="auto"/>
             <w:noWrap/>
             <w:vAlign w:val="bottom"/>
             <w:hideMark/>
@@ -7788,7 +9070,6 @@
         <w:tc>
           <w:tcPr>
             <w:tcW w:w="2618" w:type="dxa"/>
-            <w:shd w:val="clear" w:color="auto" w:fill="auto"/>
             <w:noWrap/>
             <w:vAlign w:val="bottom"/>
             <w:hideMark/>
@@ -7825,7 +9106,6 @@
         <w:tc>
           <w:tcPr>
             <w:tcW w:w="3325" w:type="dxa"/>
-            <w:shd w:val="clear" w:color="auto" w:fill="auto"/>
             <w:noWrap/>
             <w:vAlign w:val="bottom"/>
             <w:hideMark/>
@@ -7856,7 +9136,6 @@
         <w:tc>
           <w:tcPr>
             <w:tcW w:w="2618" w:type="dxa"/>
-            <w:shd w:val="clear" w:color="auto" w:fill="auto"/>
             <w:noWrap/>
             <w:vAlign w:val="bottom"/>
             <w:hideMark/>
@@ -7880,14 +9159,25 @@
                 <w:lang w:eastAsia="es-CO"/>
                 <w14:ligatures w14:val="none"/>
               </w:rPr>
-              <w:t>12 A</w:t>
-            </w:r>
+              <w:t xml:space="preserve">12 </w:t>
+            </w:r>
+            <w:proofErr w:type="gramStart"/>
+            <w:r>
+              <w:rPr>
+                <w:rFonts w:ascii="Aptos Narrow" w:eastAsia="Times New Roman" w:hAnsi="Aptos Narrow" w:cs="Times New Roman"/>
+                <w:color w:val="000000"/>
+                <w:kern w:val="0"/>
+                <w:lang w:eastAsia="es-CO"/>
+                <w14:ligatures w14:val="none"/>
+              </w:rPr>
+              <w:t>A</w:t>
+            </w:r>
+            <w:proofErr w:type="gramEnd"/>
           </w:p>
         </w:tc>
         <w:tc>
           <w:tcPr>
             <w:tcW w:w="2618" w:type="dxa"/>
-            <w:shd w:val="clear" w:color="auto" w:fill="auto"/>
             <w:noWrap/>
             <w:vAlign w:val="bottom"/>
             <w:hideMark/>
@@ -7911,8 +9201,20 @@
                 <w:lang w:eastAsia="es-CO"/>
                 <w14:ligatures w14:val="none"/>
               </w:rPr>
-              <w:t>12 A</w:t>
-            </w:r>
+              <w:t xml:space="preserve">12 </w:t>
+            </w:r>
+            <w:proofErr w:type="gramStart"/>
+            <w:r>
+              <w:rPr>
+                <w:rFonts w:ascii="Aptos Narrow" w:eastAsia="Times New Roman" w:hAnsi="Aptos Narrow" w:cs="Times New Roman"/>
+                <w:color w:val="000000"/>
+                <w:kern w:val="0"/>
+                <w:lang w:eastAsia="es-CO"/>
+                <w14:ligatures w14:val="none"/>
+              </w:rPr>
+              <w:t>A</w:t>
+            </w:r>
+            <w:proofErr w:type="gramEnd"/>
           </w:p>
         </w:tc>
       </w:tr>
@@ -7924,7 +9226,6 @@
         <w:tc>
           <w:tcPr>
             <w:tcW w:w="3325" w:type="dxa"/>
-            <w:shd w:val="clear" w:color="auto" w:fill="auto"/>
             <w:noWrap/>
             <w:vAlign w:val="bottom"/>
             <w:hideMark/>
@@ -7955,7 +9256,6 @@
         <w:tc>
           <w:tcPr>
             <w:tcW w:w="2618" w:type="dxa"/>
-            <w:shd w:val="clear" w:color="auto" w:fill="auto"/>
             <w:noWrap/>
             <w:vAlign w:val="bottom"/>
             <w:hideMark/>
@@ -7986,7 +9286,6 @@
         <w:tc>
           <w:tcPr>
             <w:tcW w:w="2618" w:type="dxa"/>
-            <w:shd w:val="clear" w:color="auto" w:fill="auto"/>
             <w:noWrap/>
             <w:vAlign w:val="bottom"/>
             <w:hideMark/>
@@ -8023,7 +9322,6 @@
         <w:tc>
           <w:tcPr>
             <w:tcW w:w="3325" w:type="dxa"/>
-            <w:shd w:val="clear" w:color="auto" w:fill="auto"/>
             <w:noWrap/>
             <w:vAlign w:val="bottom"/>
             <w:hideMark/>
@@ -8054,7 +9352,6 @@
         <w:tc>
           <w:tcPr>
             <w:tcW w:w="2618" w:type="dxa"/>
-            <w:shd w:val="clear" w:color="auto" w:fill="auto"/>
             <w:noWrap/>
             <w:vAlign w:val="bottom"/>
             <w:hideMark/>
@@ -8085,7 +9382,6 @@
         <w:tc>
           <w:tcPr>
             <w:tcW w:w="2618" w:type="dxa"/>
-            <w:shd w:val="clear" w:color="auto" w:fill="auto"/>
             <w:noWrap/>
             <w:vAlign w:val="bottom"/>
             <w:hideMark/>
@@ -8181,7 +9477,6 @@
         <w:tc>
           <w:tcPr>
             <w:tcW w:w="2780" w:type="dxa"/>
-            <w:shd w:val="clear" w:color="auto" w:fill="auto"/>
             <w:noWrap/>
             <w:vAlign w:val="center"/>
             <w:hideMark/>
@@ -8221,7 +9516,6 @@
         <w:tc>
           <w:tcPr>
             <w:tcW w:w="1400" w:type="dxa"/>
-            <w:shd w:val="clear" w:color="auto" w:fill="auto"/>
             <w:noWrap/>
             <w:vAlign w:val="center"/>
             <w:hideMark/>
@@ -8261,7 +9555,6 @@
         <w:tc>
           <w:tcPr>
             <w:tcW w:w="1420" w:type="dxa"/>
-            <w:shd w:val="clear" w:color="auto" w:fill="auto"/>
             <w:noWrap/>
             <w:vAlign w:val="center"/>
             <w:hideMark/>
@@ -8301,7 +9594,6 @@
         <w:tc>
           <w:tcPr>
             <w:tcW w:w="2740" w:type="dxa"/>
-            <w:shd w:val="clear" w:color="auto" w:fill="auto"/>
             <w:noWrap/>
             <w:vAlign w:val="center"/>
             <w:hideMark/>
@@ -8346,7 +9638,6 @@
         <w:tc>
           <w:tcPr>
             <w:tcW w:w="2780" w:type="dxa"/>
-            <w:shd w:val="clear" w:color="auto" w:fill="auto"/>
             <w:noWrap/>
             <w:vAlign w:val="center"/>
             <w:hideMark/>
@@ -8364,6 +9655,7 @@
                 <w14:ligatures w14:val="none"/>
               </w:rPr>
             </w:pPr>
+            <w:proofErr w:type="spellStart"/>
             <w:r>
               <w:rPr>
                 <w:rFonts w:ascii="Aptos Narrow" w:eastAsia="Times New Roman" w:hAnsi="Aptos Narrow" w:cs="Times New Roman"/>
@@ -8374,14 +9666,26 @@
                 <w:lang w:eastAsia="es-CO"/>
                 <w14:ligatures w14:val="none"/>
               </w:rPr>
-              <w:t>Cavitador (motor asíncrono)</w:t>
+              <w:t>Cavitador</w:t>
+            </w:r>
+            <w:proofErr w:type="spellEnd"/>
+            <w:r>
+              <w:rPr>
+                <w:rFonts w:ascii="Aptos Narrow" w:eastAsia="Times New Roman" w:hAnsi="Aptos Narrow" w:cs="Times New Roman"/>
+                <w:color w:val="000000"/>
+                <w:kern w:val="0"/>
+                <w:sz w:val="22"/>
+                <w:szCs w:val="22"/>
+                <w:lang w:eastAsia="es-CO"/>
+                <w14:ligatures w14:val="none"/>
+              </w:rPr>
+              <w:t xml:space="preserve"> (motor asíncrono)</w:t>
             </w:r>
           </w:p>
         </w:tc>
         <w:tc>
           <w:tcPr>
             <w:tcW w:w="1400" w:type="dxa"/>
-            <w:shd w:val="clear" w:color="auto" w:fill="auto"/>
             <w:noWrap/>
             <w:vAlign w:val="center"/>
             <w:hideMark/>
@@ -8416,7 +9720,6 @@
         <w:tc>
           <w:tcPr>
             <w:tcW w:w="1420" w:type="dxa"/>
-            <w:shd w:val="clear" w:color="auto" w:fill="auto"/>
             <w:noWrap/>
             <w:vAlign w:val="center"/>
             <w:hideMark/>
@@ -8451,7 +9754,6 @@
         <w:tc>
           <w:tcPr>
             <w:tcW w:w="2740" w:type="dxa"/>
-            <w:shd w:val="clear" w:color="auto" w:fill="auto"/>
             <w:noWrap/>
             <w:vAlign w:val="center"/>
             <w:hideMark/>
@@ -8491,7 +9793,6 @@
         <w:tc>
           <w:tcPr>
             <w:tcW w:w="2780" w:type="dxa"/>
-            <w:shd w:val="clear" w:color="auto" w:fill="auto"/>
             <w:noWrap/>
             <w:vAlign w:val="center"/>
             <w:hideMark/>
@@ -8526,7 +9827,6 @@
         <w:tc>
           <w:tcPr>
             <w:tcW w:w="1400" w:type="dxa"/>
-            <w:shd w:val="clear" w:color="auto" w:fill="auto"/>
             <w:noWrap/>
             <w:vAlign w:val="center"/>
             <w:hideMark/>
@@ -8561,7 +9861,6 @@
         <w:tc>
           <w:tcPr>
             <w:tcW w:w="1420" w:type="dxa"/>
-            <w:shd w:val="clear" w:color="auto" w:fill="auto"/>
             <w:noWrap/>
             <w:vAlign w:val="center"/>
             <w:hideMark/>
@@ -8596,7 +9895,6 @@
         <w:tc>
           <w:tcPr>
             <w:tcW w:w="2740" w:type="dxa"/>
-            <w:shd w:val="clear" w:color="auto" w:fill="auto"/>
             <w:noWrap/>
             <w:vAlign w:val="center"/>
             <w:hideMark/>
@@ -8636,7 +9934,6 @@
         <w:tc>
           <w:tcPr>
             <w:tcW w:w="2780" w:type="dxa"/>
-            <w:shd w:val="clear" w:color="auto" w:fill="auto"/>
             <w:noWrap/>
             <w:vAlign w:val="center"/>
             <w:hideMark/>
@@ -8671,7 +9968,6 @@
         <w:tc>
           <w:tcPr>
             <w:tcW w:w="1400" w:type="dxa"/>
-            <w:shd w:val="clear" w:color="auto" w:fill="auto"/>
             <w:noWrap/>
             <w:vAlign w:val="center"/>
             <w:hideMark/>
@@ -8706,7 +10002,6 @@
         <w:tc>
           <w:tcPr>
             <w:tcW w:w="1420" w:type="dxa"/>
-            <w:shd w:val="clear" w:color="auto" w:fill="auto"/>
             <w:noWrap/>
             <w:vAlign w:val="center"/>
             <w:hideMark/>
@@ -8741,7 +10036,6 @@
         <w:tc>
           <w:tcPr>
             <w:tcW w:w="2740" w:type="dxa"/>
-            <w:shd w:val="clear" w:color="auto" w:fill="auto"/>
             <w:noWrap/>
             <w:vAlign w:val="center"/>
             <w:hideMark/>
@@ -8781,7 +10075,6 @@
         <w:tc>
           <w:tcPr>
             <w:tcW w:w="2780" w:type="dxa"/>
-            <w:shd w:val="clear" w:color="auto" w:fill="auto"/>
             <w:noWrap/>
             <w:vAlign w:val="center"/>
             <w:hideMark/>
@@ -8820,7 +10113,6 @@
         <w:tc>
           <w:tcPr>
             <w:tcW w:w="1400" w:type="dxa"/>
-            <w:shd w:val="clear" w:color="auto" w:fill="auto"/>
             <w:noWrap/>
             <w:vAlign w:val="center"/>
             <w:hideMark/>
@@ -8855,7 +10147,6 @@
         <w:tc>
           <w:tcPr>
             <w:tcW w:w="1420" w:type="dxa"/>
-            <w:shd w:val="clear" w:color="auto" w:fill="auto"/>
             <w:noWrap/>
             <w:vAlign w:val="center"/>
             <w:hideMark/>
@@ -8894,7 +10185,6 @@
         <w:tc>
           <w:tcPr>
             <w:tcW w:w="2740" w:type="dxa"/>
-            <w:shd w:val="clear" w:color="auto" w:fill="auto"/>
             <w:noWrap/>
             <w:vAlign w:val="center"/>
             <w:hideMark/>
@@ -8965,7 +10255,15 @@
     </w:p>
     <w:p>
       <w:r>
-        <w:t>El arreglo FV (3.6 kWp) garantiza margen suficiente para alimentar las tres cargas en condiciones nominales de irradiancia. El variador BPD opera en modo directo con protección por baja irradiancia (modo hibernación) y conmutación automática a red en caso de déficit energético.</w:t>
+        <w:t xml:space="preserve">El arreglo FV (3.6 </w:t>
+      </w:r>
+      <w:proofErr w:type="spellStart"/>
+      <w:r>
+        <w:t>kWp</w:t>
+      </w:r>
+      <w:proofErr w:type="spellEnd"/>
+      <w:r>
+        <w:t>) garantiza margen suficiente para alimentar las tres cargas en condiciones nominales de irradiancia. El variador BPD opera en modo directo con protección por baja irradiancia (modo hibernación) y conmutación automática a red en caso de déficit energético.</w:t>
       </w:r>
     </w:p>
     <w:p>
@@ -9024,7 +10322,15 @@
         <w:t>temporizador secuencial (10 s)</w:t>
       </w:r>
       <w:r>
-        <w:t xml:space="preserve"> para evitar arranques simultáneos de cavitador y bomba de flujo, limitando picos de corriente.</w:t>
+        <w:t xml:space="preserve"> para evitar arranques simultáneos de </w:t>
+      </w:r>
+      <w:proofErr w:type="spellStart"/>
+      <w:r>
+        <w:t>cavitador</w:t>
+      </w:r>
+      <w:proofErr w:type="spellEnd"/>
+      <w:r>
+        <w:t xml:space="preserve"> y bomba de flujo, limitando picos de corriente.</w:t>
       </w:r>
     </w:p>
     <w:p>
@@ -9036,7 +10342,23 @@
         <w:spacing w:after="0"/>
       </w:pPr>
       <w:r>
-        <w:t>El BPD integra protección contra sobretensión, subtensión, sobrecorriente, fallo de conexión FV y monitoreo de nivel de agua (funciones P15.11–P15.19).</w:t>
+        <w:t xml:space="preserve">El BPD integra protección contra sobretensión, </w:t>
+      </w:r>
+      <w:proofErr w:type="spellStart"/>
+      <w:r>
+        <w:t>subtensión</w:t>
+      </w:r>
+      <w:proofErr w:type="spellEnd"/>
+      <w:r>
+        <w:t xml:space="preserve">, </w:t>
+      </w:r>
+      <w:proofErr w:type="spellStart"/>
+      <w:r>
+        <w:t>sobrecorriente</w:t>
+      </w:r>
+      <w:proofErr w:type="spellEnd"/>
+      <w:r>
+        <w:t>, fallo de conexión FV y monitoreo de nivel de agua (funciones P15.11–P15.19).</w:t>
       </w:r>
     </w:p>
     <w:p>
@@ -9072,14 +10394,34 @@
       </w:pPr>
       <w:bookmarkStart w:id="28" w:name="_Toc209712947"/>
       <w:r>
-        <w:t>Dimensionamiento de potencia para tres motores (cavitador, bomba de flujo constante, bomba de retorno)</w:t>
+        <w:t>Dimensionamiento de potencia para tres motores (</w:t>
+      </w:r>
+      <w:proofErr w:type="spellStart"/>
+      <w:r>
+        <w:t>cavitador</w:t>
+      </w:r>
+      <w:proofErr w:type="spellEnd"/>
+      <w:r>
+        <w:t>, bomba de flujo constante, bomba de retorno)</w:t>
       </w:r>
       <w:bookmarkEnd w:id="28"/>
     </w:p>
     <w:p/>
     <w:p>
       <w:r>
-        <w:t>El sistema de tratamiento requiere la operación coordinada de tres motores eléctricos: el cavitador, la bomba de flujo constante y la bomba de retorno. A continuación, se presenta el dimensionamiento de cada equipo con base en su potencia nominal, tensión de operación y estimaciones de eficiencia.</w:t>
+        <w:t xml:space="preserve">El sistema de tratamiento requiere la operación coordinada de tres motores eléctricos: el </w:t>
+      </w:r>
+      <w:proofErr w:type="spellStart"/>
+      <w:r>
+        <w:t>cavitador</w:t>
+      </w:r>
+      <w:proofErr w:type="spellEnd"/>
+      <w:r>
+        <w:t xml:space="preserve">, la bomba de flujo constante y la bomba de retorno. A </w:t>
+      </w:r>
+      <w:r>
+        <w:lastRenderedPageBreak/>
+        <w:t>continuación, se presenta el dimensionamiento de cada equipo con base en su potencia nominal, tensión de operación y estimaciones de eficiencia.</w:t>
       </w:r>
     </w:p>
     <w:p/>
@@ -9128,7 +10470,6 @@
               <w:bottom w:val="single" w:sz="4" w:space="0" w:color="auto"/>
               <w:right w:val="single" w:sz="4" w:space="0" w:color="auto"/>
             </w:tcBorders>
-            <w:shd w:val="clear" w:color="auto" w:fill="auto"/>
             <w:vAlign w:val="center"/>
             <w:hideMark/>
           </w:tcPr>
@@ -9173,7 +10514,6 @@
               <w:bottom w:val="single" w:sz="4" w:space="0" w:color="auto"/>
               <w:right w:val="single" w:sz="4" w:space="0" w:color="auto"/>
             </w:tcBorders>
-            <w:shd w:val="clear" w:color="auto" w:fill="auto"/>
             <w:vAlign w:val="center"/>
             <w:hideMark/>
           </w:tcPr>
@@ -9218,7 +10558,6 @@
               <w:bottom w:val="single" w:sz="4" w:space="0" w:color="auto"/>
               <w:right w:val="single" w:sz="4" w:space="0" w:color="auto"/>
             </w:tcBorders>
-            <w:shd w:val="clear" w:color="auto" w:fill="auto"/>
             <w:vAlign w:val="center"/>
             <w:hideMark/>
           </w:tcPr>
@@ -9263,7 +10602,6 @@
               <w:bottom w:val="single" w:sz="4" w:space="0" w:color="auto"/>
               <w:right w:val="single" w:sz="4" w:space="0" w:color="auto"/>
             </w:tcBorders>
-            <w:shd w:val="clear" w:color="auto" w:fill="auto"/>
             <w:vAlign w:val="center"/>
             <w:hideMark/>
           </w:tcPr>
@@ -9308,7 +10646,6 @@
               <w:bottom w:val="single" w:sz="4" w:space="0" w:color="auto"/>
               <w:right w:val="single" w:sz="4" w:space="0" w:color="auto"/>
             </w:tcBorders>
-            <w:shd w:val="clear" w:color="auto" w:fill="auto"/>
             <w:vAlign w:val="center"/>
             <w:hideMark/>
           </w:tcPr>
@@ -9353,7 +10690,6 @@
               <w:bottom w:val="single" w:sz="4" w:space="0" w:color="auto"/>
               <w:right w:val="single" w:sz="4" w:space="0" w:color="auto"/>
             </w:tcBorders>
-            <w:shd w:val="clear" w:color="auto" w:fill="auto"/>
             <w:vAlign w:val="center"/>
             <w:hideMark/>
           </w:tcPr>
@@ -9403,7 +10739,6 @@
               <w:bottom w:val="single" w:sz="4" w:space="0" w:color="auto"/>
               <w:right w:val="single" w:sz="4" w:space="0" w:color="auto"/>
             </w:tcBorders>
-            <w:shd w:val="clear" w:color="auto" w:fill="auto"/>
             <w:noWrap/>
             <w:vAlign w:val="center"/>
             <w:hideMark/>
@@ -9421,6 +10756,7 @@
                 <w14:ligatures w14:val="none"/>
               </w:rPr>
             </w:pPr>
+            <w:proofErr w:type="spellStart"/>
             <w:r>
               <w:rPr>
                 <w:rFonts w:ascii="Aptos Narrow" w:eastAsia="Times New Roman" w:hAnsi="Aptos Narrow" w:cs="Times New Roman"/>
@@ -9433,6 +10769,7 @@
               </w:rPr>
               <w:t>Cavitador</w:t>
             </w:r>
+            <w:proofErr w:type="spellEnd"/>
           </w:p>
         </w:tc>
         <w:tc>
@@ -9444,7 +10781,6 @@
               <w:bottom w:val="single" w:sz="4" w:space="0" w:color="auto"/>
               <w:right w:val="single" w:sz="4" w:space="0" w:color="auto"/>
             </w:tcBorders>
-            <w:shd w:val="clear" w:color="auto" w:fill="auto"/>
             <w:noWrap/>
             <w:vAlign w:val="center"/>
             <w:hideMark/>
@@ -9485,7 +10821,6 @@
               <w:bottom w:val="single" w:sz="4" w:space="0" w:color="auto"/>
               <w:right w:val="single" w:sz="4" w:space="0" w:color="auto"/>
             </w:tcBorders>
-            <w:shd w:val="clear" w:color="auto" w:fill="auto"/>
             <w:noWrap/>
             <w:vAlign w:val="center"/>
             <w:hideMark/>
@@ -9526,7 +10861,6 @@
               <w:bottom w:val="single" w:sz="4" w:space="0" w:color="auto"/>
               <w:right w:val="single" w:sz="4" w:space="0" w:color="auto"/>
             </w:tcBorders>
-            <w:shd w:val="clear" w:color="auto" w:fill="auto"/>
             <w:noWrap/>
             <w:vAlign w:val="center"/>
             <w:hideMark/>
@@ -9567,7 +10901,6 @@
               <w:bottom w:val="single" w:sz="4" w:space="0" w:color="auto"/>
               <w:right w:val="single" w:sz="4" w:space="0" w:color="auto"/>
             </w:tcBorders>
-            <w:shd w:val="clear" w:color="auto" w:fill="auto"/>
             <w:noWrap/>
             <w:vAlign w:val="center"/>
             <w:hideMark/>
@@ -9608,7 +10941,6 @@
               <w:bottom w:val="single" w:sz="4" w:space="0" w:color="auto"/>
               <w:right w:val="single" w:sz="4" w:space="0" w:color="auto"/>
             </w:tcBorders>
-            <w:shd w:val="clear" w:color="auto" w:fill="auto"/>
             <w:noWrap/>
             <w:vAlign w:val="center"/>
             <w:hideMark/>
@@ -9655,7 +10987,6 @@
               <w:bottom w:val="single" w:sz="4" w:space="0" w:color="auto"/>
               <w:right w:val="single" w:sz="4" w:space="0" w:color="auto"/>
             </w:tcBorders>
-            <w:shd w:val="clear" w:color="auto" w:fill="auto"/>
             <w:noWrap/>
             <w:vAlign w:val="center"/>
             <w:hideMark/>
@@ -9696,7 +11027,6 @@
               <w:bottom w:val="single" w:sz="4" w:space="0" w:color="auto"/>
               <w:right w:val="single" w:sz="4" w:space="0" w:color="auto"/>
             </w:tcBorders>
-            <w:shd w:val="clear" w:color="auto" w:fill="auto"/>
             <w:noWrap/>
             <w:vAlign w:val="center"/>
             <w:hideMark/>
@@ -9737,7 +11067,6 @@
               <w:bottom w:val="single" w:sz="4" w:space="0" w:color="auto"/>
               <w:right w:val="single" w:sz="4" w:space="0" w:color="auto"/>
             </w:tcBorders>
-            <w:shd w:val="clear" w:color="auto" w:fill="auto"/>
             <w:noWrap/>
             <w:vAlign w:val="center"/>
             <w:hideMark/>
@@ -9778,7 +11107,6 @@
               <w:bottom w:val="single" w:sz="4" w:space="0" w:color="auto"/>
               <w:right w:val="single" w:sz="4" w:space="0" w:color="auto"/>
             </w:tcBorders>
-            <w:shd w:val="clear" w:color="auto" w:fill="auto"/>
             <w:noWrap/>
             <w:vAlign w:val="center"/>
             <w:hideMark/>
@@ -9819,7 +11147,6 @@
               <w:bottom w:val="single" w:sz="4" w:space="0" w:color="auto"/>
               <w:right w:val="single" w:sz="4" w:space="0" w:color="auto"/>
             </w:tcBorders>
-            <w:shd w:val="clear" w:color="auto" w:fill="auto"/>
             <w:noWrap/>
             <w:vAlign w:val="center"/>
             <w:hideMark/>
@@ -9860,7 +11187,6 @@
               <w:bottom w:val="single" w:sz="4" w:space="0" w:color="auto"/>
               <w:right w:val="single" w:sz="4" w:space="0" w:color="auto"/>
             </w:tcBorders>
-            <w:shd w:val="clear" w:color="auto" w:fill="auto"/>
             <w:noWrap/>
             <w:vAlign w:val="center"/>
             <w:hideMark/>
@@ -9907,7 +11233,6 @@
               <w:bottom w:val="single" w:sz="4" w:space="0" w:color="auto"/>
               <w:right w:val="single" w:sz="4" w:space="0" w:color="auto"/>
             </w:tcBorders>
-            <w:shd w:val="clear" w:color="auto" w:fill="auto"/>
             <w:noWrap/>
             <w:vAlign w:val="center"/>
             <w:hideMark/>
@@ -9948,7 +11273,6 @@
               <w:bottom w:val="single" w:sz="4" w:space="0" w:color="auto"/>
               <w:right w:val="single" w:sz="4" w:space="0" w:color="auto"/>
             </w:tcBorders>
-            <w:shd w:val="clear" w:color="auto" w:fill="auto"/>
             <w:noWrap/>
             <w:vAlign w:val="center"/>
             <w:hideMark/>
@@ -9989,7 +11313,6 @@
               <w:bottom w:val="single" w:sz="4" w:space="0" w:color="auto"/>
               <w:right w:val="single" w:sz="4" w:space="0" w:color="auto"/>
             </w:tcBorders>
-            <w:shd w:val="clear" w:color="auto" w:fill="auto"/>
             <w:noWrap/>
             <w:vAlign w:val="center"/>
             <w:hideMark/>
@@ -10030,7 +11353,6 @@
               <w:bottom w:val="single" w:sz="4" w:space="0" w:color="auto"/>
               <w:right w:val="single" w:sz="4" w:space="0" w:color="auto"/>
             </w:tcBorders>
-            <w:shd w:val="clear" w:color="auto" w:fill="auto"/>
             <w:noWrap/>
             <w:vAlign w:val="center"/>
             <w:hideMark/>
@@ -10071,7 +11393,6 @@
               <w:bottom w:val="single" w:sz="4" w:space="0" w:color="auto"/>
               <w:right w:val="single" w:sz="4" w:space="0" w:color="auto"/>
             </w:tcBorders>
-            <w:shd w:val="clear" w:color="auto" w:fill="auto"/>
             <w:noWrap/>
             <w:vAlign w:val="center"/>
             <w:hideMark/>
@@ -10112,7 +11433,6 @@
               <w:bottom w:val="single" w:sz="4" w:space="0" w:color="auto"/>
               <w:right w:val="single" w:sz="4" w:space="0" w:color="auto"/>
             </w:tcBorders>
-            <w:shd w:val="clear" w:color="auto" w:fill="auto"/>
             <w:noWrap/>
             <w:vAlign w:val="center"/>
             <w:hideMark/>
@@ -10159,7 +11479,6 @@
               <w:bottom w:val="single" w:sz="4" w:space="0" w:color="auto"/>
               <w:right w:val="single" w:sz="4" w:space="0" w:color="auto"/>
             </w:tcBorders>
-            <w:shd w:val="clear" w:color="auto" w:fill="auto"/>
             <w:noWrap/>
             <w:vAlign w:val="center"/>
             <w:hideMark/>
@@ -10204,7 +11523,6 @@
               <w:bottom w:val="single" w:sz="4" w:space="0" w:color="auto"/>
               <w:right w:val="single" w:sz="4" w:space="0" w:color="auto"/>
             </w:tcBorders>
-            <w:shd w:val="clear" w:color="auto" w:fill="auto"/>
             <w:noWrap/>
             <w:vAlign w:val="center"/>
             <w:hideMark/>
@@ -10249,7 +11567,6 @@
               <w:bottom w:val="single" w:sz="4" w:space="0" w:color="auto"/>
               <w:right w:val="single" w:sz="4" w:space="0" w:color="auto"/>
             </w:tcBorders>
-            <w:shd w:val="clear" w:color="auto" w:fill="auto"/>
             <w:noWrap/>
             <w:vAlign w:val="center"/>
             <w:hideMark/>
@@ -10294,7 +11611,6 @@
               <w:bottom w:val="single" w:sz="4" w:space="0" w:color="auto"/>
               <w:right w:val="single" w:sz="4" w:space="0" w:color="auto"/>
             </w:tcBorders>
-            <w:shd w:val="clear" w:color="auto" w:fill="auto"/>
             <w:noWrap/>
             <w:vAlign w:val="center"/>
             <w:hideMark/>
@@ -10335,7 +11651,6 @@
               <w:bottom w:val="single" w:sz="4" w:space="0" w:color="auto"/>
               <w:right w:val="single" w:sz="4" w:space="0" w:color="auto"/>
             </w:tcBorders>
-            <w:shd w:val="clear" w:color="auto" w:fill="auto"/>
             <w:noWrap/>
             <w:vAlign w:val="center"/>
             <w:hideMark/>
@@ -10380,7 +11695,6 @@
               <w:bottom w:val="single" w:sz="4" w:space="0" w:color="auto"/>
               <w:right w:val="single" w:sz="4" w:space="0" w:color="auto"/>
             </w:tcBorders>
-            <w:shd w:val="clear" w:color="auto" w:fill="auto"/>
             <w:noWrap/>
             <w:vAlign w:val="center"/>
             <w:hideMark/>
@@ -10454,6 +11768,8 @@
       <w:pPr>
         <w:pStyle w:val="Descripcin"/>
       </w:pPr>
+      <w:bookmarkStart w:id="31" w:name="_Toc209716476"/>
+      <w:bookmarkStart w:id="32" w:name="_Ref209716549"/>
       <w:r>
         <w:t xml:space="preserve">Figura </w:t>
       </w:r>
@@ -10475,12 +11791,26 @@
       <w:r>
         <w:fldChar w:fldCharType="end"/>
       </w:r>
+      <w:bookmarkEnd w:id="32"/>
       <w:r>
         <w:t xml:space="preserve"> </w:t>
       </w:r>
       <w:r>
-        <w:t>Flujo de potencia desde los paneles solares hasta el sistema de tratamie</w:t>
-      </w:r>
+        <w:t>Flujo de potencia</w:t>
+      </w:r>
+      <w:r>
+        <w:t xml:space="preserve">: </w:t>
+      </w:r>
+      <w:r>
+        <w:t xml:space="preserve">paneles solares hasta el sistema de </w:t>
+      </w:r>
+      <w:r>
+        <w:t>tratami</w:t>
+      </w:r>
+      <w:r>
+        <w:t>ento</w:t>
+      </w:r>
+      <w:bookmarkEnd w:id="31"/>
     </w:p>
     <w:p>
       <w:pPr>
@@ -10547,24 +11877,33 @@
     </w:p>
     <w:p>
       <w:pPr>
-        <w:pStyle w:val="Descripcin"/>
+        <w:rPr>
+          <w:sz w:val="16"/>
+          <w:szCs w:val="16"/>
+        </w:rPr>
       </w:pPr>
       <w:r>
         <w:rPr>
           <w:b/>
           <w:bCs/>
+          <w:sz w:val="18"/>
+          <w:szCs w:val="18"/>
         </w:rPr>
         <w:t>Nota:</w:t>
       </w:r>
       <w:r>
         <w:rPr>
-          <w:b/>
-          <w:bCs/>
+          <w:sz w:val="18"/>
+          <w:szCs w:val="18"/>
         </w:rPr>
-        <w:t xml:space="preserve"> </w:t>
-      </w:r>
-      <w:r>
-        <w:t>El diagrama muestra la distribución de la potencia generada por el campo fotovoltaico (4000 W), la entrega del inversor (3800 W), las pérdidas por conversión (200 W) y la potencia destinada al sistema de cavitación y bombeo (1120 W). Se observa un excedente de 2680 W disponible, lo cual confirma que el arreglo fotovoltaico proporciona un margen suficiente para garantizar la operación estable del sistema.</w:t>
+        <w:t xml:space="preserve"> El diagrama muestra la distribución de la potencia generada por el campo fotovoltaico (4000 W), la entrega del inversor (3800 W), las pérdidas por conversión (200 W) y la potencia destinada al sistema de cavitación y bombeo (1120 W). Se observa un excedente de 2680 W disponible, lo cual confirma que el arreglo fotovoltaico proporciona un margen suficiente para garantizar la operación estable del sistema</w:t>
+      </w:r>
+      <w:r>
+        <w:rPr>
+          <w:sz w:val="16"/>
+          <w:szCs w:val="16"/>
+        </w:rPr>
+        <w:t>.</w:t>
       </w:r>
     </w:p>
     <w:p>
@@ -10575,13 +11914,70 @@
           <w:numId w:val="24"/>
         </w:numPr>
       </w:pPr>
-      <w:bookmarkStart w:id="31" w:name="_Toc209712949"/>
-      <w:r>
+      <w:bookmarkStart w:id="33" w:name="_Toc209712949"/>
+      <w:r>
+        <w:lastRenderedPageBreak/>
         <w:t>Caja de automatización: esquemático, lista de materiales y criterios de montaje</w:t>
       </w:r>
-      <w:bookmarkEnd w:id="31"/>
+      <w:bookmarkEnd w:id="33"/>
     </w:p>
     <w:p/>
+    <w:p>
+      <w:r>
+        <w:t>La caja de automatización constituye el núcleo de control y protección del sistema de bombeo solar. En ella se integran los dispositivos encargados de gestionar la conversión energética garantizar la seguridad eléctrica y coordinar la operación de mod de motores. El diseño se realiza considerando criterios de confiabilidad facilidad de operación incumplimiento de la norma vigente (RETIE y estándares IEC)</w:t>
+      </w:r>
+    </w:p>
+    <w:p>
+      <w:pPr>
+        <w:pStyle w:val="Ttulo2"/>
+        <w:numPr>
+          <w:ilvl w:val="2"/>
+          <w:numId w:val="24"/>
+        </w:numPr>
+      </w:pPr>
+      <w:bookmarkStart w:id="34" w:name="_Toc209712950"/>
+      <w:r>
+        <w:t>Esquemático eléctrico</w:t>
+      </w:r>
+    </w:p>
+    <w:p>
+      <w:r>
+        <w:t>Esquemático general de la caja se muestra en la</w:t>
+      </w:r>
+      <w:r>
+        <w:t xml:space="preserve"> </w:t>
+      </w:r>
+      <w:r>
+        <w:fldChar w:fldCharType="begin"/>
+      </w:r>
+      <w:r>
+        <w:instrText xml:space="preserve"> REF _Ref209716549 \h </w:instrText>
+      </w:r>
+      <w:r>
+        <w:fldChar w:fldCharType="separate"/>
+      </w:r>
+      <w:r>
+        <w:t xml:space="preserve">Figura </w:t>
+      </w:r>
+      <w:r>
+        <w:rPr>
+          <w:noProof/>
+        </w:rPr>
+        <w:t>3</w:t>
+      </w:r>
+      <w:r>
+        <w:fldChar w:fldCharType="end"/>
+      </w:r>
+      <w:r>
+        <w:t>.</w:t>
+      </w:r>
+      <w:r>
+        <w:t xml:space="preserve"> </w:t>
+      </w:r>
+      <w:r>
+        <w:t xml:space="preserve"> </w:t>
+      </w:r>
+    </w:p>
     <w:p>
       <w:pPr>
         <w:pStyle w:val="Ttulo2"/>
@@ -10590,11 +11986,18 @@
           <w:numId w:val="24"/>
         </w:numPr>
       </w:pPr>
-      <w:bookmarkStart w:id="32" w:name="_Toc209712950"/>
-      <w:r>
-        <w:t>Diseño mecánico (soportes de paneles, tuberías y cavitador)</w:t>
-      </w:r>
-      <w:bookmarkEnd w:id="32"/>
+      <w:r>
+        <w:t xml:space="preserve">Diseño mecánico (soportes de paneles, tuberías y </w:t>
+      </w:r>
+      <w:proofErr w:type="spellStart"/>
+      <w:r>
+        <w:t>cavitador</w:t>
+      </w:r>
+      <w:proofErr w:type="spellEnd"/>
+      <w:r>
+        <w:t>)</w:t>
+      </w:r>
+      <w:bookmarkEnd w:id="34"/>
     </w:p>
     <w:p/>
     <w:p>
@@ -10610,11 +12013,12 @@
           <w:numId w:val="24"/>
         </w:numPr>
       </w:pPr>
-      <w:bookmarkStart w:id="33" w:name="_Toc209712951"/>
-      <w:r>
+      <w:bookmarkStart w:id="35" w:name="_Toc209712951"/>
+      <w:r>
+        <w:lastRenderedPageBreak/>
         <w:t>Metodología y Cronograma</w:t>
       </w:r>
-      <w:bookmarkEnd w:id="33"/>
+      <w:bookmarkEnd w:id="35"/>
     </w:p>
     <w:p>
       <w:pPr>
@@ -10624,11 +12028,11 @@
           <w:numId w:val="24"/>
         </w:numPr>
       </w:pPr>
-      <w:bookmarkStart w:id="34" w:name="_Toc209712952"/>
+      <w:bookmarkStart w:id="36" w:name="_Toc209712952"/>
       <w:r>
         <w:t>Fases del proyecto</w:t>
       </w:r>
-      <w:bookmarkEnd w:id="34"/>
+      <w:bookmarkEnd w:id="36"/>
     </w:p>
     <w:p>
       <w:pPr>
@@ -10638,11 +12042,11 @@
           <w:numId w:val="24"/>
         </w:numPr>
       </w:pPr>
-      <w:bookmarkStart w:id="35" w:name="_Toc209712953"/>
+      <w:bookmarkStart w:id="37" w:name="_Toc209712953"/>
       <w:r>
         <w:t>Cronograma de actividades (24 semanas)</w:t>
       </w:r>
-      <w:bookmarkEnd w:id="35"/>
+      <w:bookmarkEnd w:id="37"/>
     </w:p>
     <w:p>
       <w:pPr>
@@ -10665,11 +12069,12 @@
           <w:numId w:val="24"/>
         </w:numPr>
       </w:pPr>
-      <w:bookmarkStart w:id="36" w:name="_Toc209712954"/>
-      <w:r>
+      <w:bookmarkStart w:id="38" w:name="_Toc209712954"/>
+      <w:r>
+        <w:lastRenderedPageBreak/>
         <w:t>Resultados Experimentales y Pruebas en Laboratorio</w:t>
       </w:r>
-      <w:bookmarkEnd w:id="36"/>
+      <w:bookmarkEnd w:id="38"/>
     </w:p>
     <w:p>
       <w:pPr>
@@ -10679,11 +12084,11 @@
           <w:numId w:val="24"/>
         </w:numPr>
       </w:pPr>
-      <w:bookmarkStart w:id="37" w:name="_Toc209712955"/>
+      <w:bookmarkStart w:id="39" w:name="_Toc209712955"/>
       <w:r>
         <w:t>Mediciones eléctricas</w:t>
       </w:r>
-      <w:bookmarkEnd w:id="37"/>
+      <w:bookmarkEnd w:id="39"/>
     </w:p>
     <w:p>
       <w:pPr>
@@ -10693,11 +12098,11 @@
           <w:numId w:val="24"/>
         </w:numPr>
       </w:pPr>
-      <w:bookmarkStart w:id="38" w:name="_Toc209712956"/>
+      <w:bookmarkStart w:id="40" w:name="_Toc209712956"/>
       <w:r>
         <w:t>Curvas I-V de los paneles solares</w:t>
       </w:r>
-      <w:bookmarkEnd w:id="38"/>
+      <w:bookmarkEnd w:id="40"/>
     </w:p>
     <w:p>
       <w:pPr>
@@ -10707,11 +12112,11 @@
           <w:numId w:val="24"/>
         </w:numPr>
       </w:pPr>
-      <w:bookmarkStart w:id="39" w:name="_Toc209712957"/>
+      <w:bookmarkStart w:id="41" w:name="_Toc209712957"/>
       <w:r>
         <w:t>Consumo de los motores</w:t>
       </w:r>
-      <w:bookmarkEnd w:id="39"/>
+      <w:bookmarkEnd w:id="41"/>
     </w:p>
     <w:p>
       <w:pPr>
@@ -10721,11 +12126,11 @@
           <w:numId w:val="24"/>
         </w:numPr>
       </w:pPr>
-      <w:bookmarkStart w:id="40" w:name="_Toc209712958"/>
+      <w:bookmarkStart w:id="42" w:name="_Toc209712958"/>
       <w:r>
         <w:t>Pruebas de tratamiento de agua (turbidez, TSS, COD/BOD, coliformes, rendimiento de cavitación, etc.)</w:t>
       </w:r>
-      <w:bookmarkEnd w:id="40"/>
+      <w:bookmarkEnd w:id="42"/>
     </w:p>
     <w:p/>
     <w:p>
@@ -10736,11 +12141,11 @@
           <w:numId w:val="24"/>
         </w:numPr>
       </w:pPr>
-      <w:bookmarkStart w:id="41" w:name="_Toc209712959"/>
+      <w:bookmarkStart w:id="43" w:name="_Toc209712959"/>
       <w:r>
         <w:t>Implementación en Sitio y Validación Final</w:t>
       </w:r>
-      <w:bookmarkEnd w:id="41"/>
+      <w:bookmarkEnd w:id="43"/>
     </w:p>
     <w:p>
       <w:pPr>
@@ -10750,11 +12155,11 @@
           <w:numId w:val="24"/>
         </w:numPr>
       </w:pPr>
-      <w:bookmarkStart w:id="42" w:name="_Toc209712960"/>
+      <w:bookmarkStart w:id="44" w:name="_Toc209712960"/>
       <w:r>
         <w:t>Instalación en trapiche panelero</w:t>
       </w:r>
-      <w:bookmarkEnd w:id="42"/>
+      <w:bookmarkEnd w:id="44"/>
     </w:p>
     <w:p>
       <w:pPr>
@@ -10764,11 +12169,11 @@
           <w:numId w:val="24"/>
         </w:numPr>
       </w:pPr>
-      <w:bookmarkStart w:id="43" w:name="_Toc209712961"/>
+      <w:bookmarkStart w:id="45" w:name="_Toc209712961"/>
       <w:r>
         <w:t>Pruebas de autonomía de 4 horas</w:t>
       </w:r>
-      <w:bookmarkEnd w:id="43"/>
+      <w:bookmarkEnd w:id="45"/>
     </w:p>
     <w:p>
       <w:pPr>
@@ -10778,11 +12183,11 @@
           <w:numId w:val="24"/>
         </w:numPr>
       </w:pPr>
-      <w:bookmarkStart w:id="44" w:name="_Toc209712962"/>
+      <w:bookmarkStart w:id="46" w:name="_Toc209712962"/>
       <w:r>
         <w:t>Ajustes técnicos y puesta en marcha</w:t>
       </w:r>
-      <w:bookmarkEnd w:id="44"/>
+      <w:bookmarkEnd w:id="46"/>
     </w:p>
     <w:p>
       <w:pPr>
@@ -10805,11 +12210,12 @@
           <w:numId w:val="24"/>
         </w:numPr>
       </w:pPr>
-      <w:bookmarkStart w:id="45" w:name="_Toc209712963"/>
-      <w:r>
+      <w:bookmarkStart w:id="47" w:name="_Toc209712963"/>
+      <w:r>
+        <w:lastRenderedPageBreak/>
         <w:t>Manuales de Operación y Mantenimiento</w:t>
       </w:r>
-      <w:bookmarkEnd w:id="45"/>
+      <w:bookmarkEnd w:id="47"/>
     </w:p>
     <w:p>
       <w:pPr>
@@ -10819,11 +12225,11 @@
           <w:numId w:val="24"/>
         </w:numPr>
       </w:pPr>
-      <w:bookmarkStart w:id="46" w:name="_Toc209712964"/>
+      <w:bookmarkStart w:id="48" w:name="_Toc209712964"/>
       <w:r>
         <w:t>Manual de usuario para el personal del trapiche</w:t>
       </w:r>
-      <w:bookmarkEnd w:id="46"/>
+      <w:bookmarkEnd w:id="48"/>
     </w:p>
     <w:p>
       <w:pPr>
@@ -10833,11 +12239,11 @@
           <w:numId w:val="24"/>
         </w:numPr>
       </w:pPr>
-      <w:bookmarkStart w:id="47" w:name="_Toc209712965"/>
+      <w:bookmarkStart w:id="49" w:name="_Toc209712965"/>
       <w:r>
         <w:t>Manual técnico de operación y mantenimiento</w:t>
       </w:r>
-      <w:bookmarkEnd w:id="47"/>
+      <w:bookmarkEnd w:id="49"/>
     </w:p>
     <w:p>
       <w:pPr>
@@ -10860,11 +12266,12 @@
           <w:numId w:val="24"/>
         </w:numPr>
       </w:pPr>
-      <w:bookmarkStart w:id="48" w:name="_Toc209712966"/>
-      <w:r>
+      <w:bookmarkStart w:id="50" w:name="_Toc209712966"/>
+      <w:r>
+        <w:lastRenderedPageBreak/>
         <w:t>Anexos</w:t>
       </w:r>
-      <w:bookmarkEnd w:id="48"/>
+      <w:bookmarkEnd w:id="50"/>
     </w:p>
     <w:p>
       <w:pPr>
@@ -10874,11 +12281,11 @@
           <w:numId w:val="24"/>
         </w:numPr>
       </w:pPr>
-      <w:bookmarkStart w:id="49" w:name="_Toc209712967"/>
+      <w:bookmarkStart w:id="51" w:name="_Toc209712967"/>
       <w:r>
         <w:t>Fotografías documentadas</w:t>
       </w:r>
-      <w:bookmarkEnd w:id="49"/>
+      <w:bookmarkEnd w:id="51"/>
     </w:p>
     <w:p>
       <w:pPr>
@@ -10888,11 +12295,16 @@
           <w:numId w:val="24"/>
         </w:numPr>
       </w:pPr>
-      <w:bookmarkStart w:id="50" w:name="_Toc209712968"/>
-      <w:r>
-        <w:t>Datasheets y hojas técnicas</w:t>
-      </w:r>
-      <w:bookmarkEnd w:id="50"/>
+      <w:bookmarkStart w:id="52" w:name="_Toc209712968"/>
+      <w:proofErr w:type="spellStart"/>
+      <w:r>
+        <w:t>Datasheets</w:t>
+      </w:r>
+      <w:proofErr w:type="spellEnd"/>
+      <w:r>
+        <w:t xml:space="preserve"> y hojas técnicas</w:t>
+      </w:r>
+      <w:bookmarkEnd w:id="52"/>
     </w:p>
     <w:p>
       <w:pPr>
@@ -10902,11 +12314,11 @@
           <w:numId w:val="24"/>
         </w:numPr>
       </w:pPr>
-      <w:bookmarkStart w:id="51" w:name="_Toc209712969"/>
+      <w:bookmarkStart w:id="53" w:name="_Toc209712969"/>
       <w:r>
         <w:t>Códigos/firmware de automatización</w:t>
       </w:r>
-      <w:bookmarkEnd w:id="51"/>
+      <w:bookmarkEnd w:id="53"/>
     </w:p>
     <w:p>
       <w:pPr>
@@ -10916,11 +12328,11 @@
           <w:numId w:val="24"/>
         </w:numPr>
       </w:pPr>
-      <w:bookmarkStart w:id="52" w:name="_Toc209712970"/>
+      <w:bookmarkStart w:id="54" w:name="_Toc209712970"/>
       <w:r>
         <w:t>Planos eléctricos y mecánicos</w:t>
       </w:r>
-      <w:bookmarkEnd w:id="52"/>
+      <w:bookmarkEnd w:id="54"/>
     </w:p>
     <w:p>
       <w:pPr>
@@ -10930,11 +12342,11 @@
           <w:numId w:val="24"/>
         </w:numPr>
       </w:pPr>
-      <w:bookmarkStart w:id="53" w:name="_Toc209712971"/>
+      <w:bookmarkStart w:id="55" w:name="_Toc209712971"/>
       <w:r>
         <w:t>Certificados y facturas</w:t>
       </w:r>
-      <w:bookmarkEnd w:id="53"/>
+      <w:bookmarkEnd w:id="55"/>
     </w:p>
     <w:p>
       <w:pPr>
@@ -10944,11 +12356,11 @@
           <w:numId w:val="24"/>
         </w:numPr>
       </w:pPr>
-      <w:bookmarkStart w:id="54" w:name="_Toc209712972"/>
+      <w:bookmarkStart w:id="56" w:name="_Toc209712972"/>
       <w:r>
         <w:t>Registro de entregas y actas de socialización</w:t>
       </w:r>
-      <w:bookmarkEnd w:id="54"/>
+      <w:bookmarkEnd w:id="56"/>
     </w:p>
     <w:p>
       <w:pPr>
@@ -10974,14 +12386,15 @@
           <w:rStyle w:val="Ttulo1Car"/>
         </w:rPr>
       </w:pPr>
-      <w:bookmarkStart w:id="55" w:name="_Toc209712973"/>
+      <w:bookmarkStart w:id="57" w:name="_Toc209712973"/>
       <w:r>
         <w:rPr>
           <w:rStyle w:val="Ttulo1Car"/>
         </w:rPr>
+        <w:lastRenderedPageBreak/>
         <w:t>Referencias Bibliográficas</w:t>
       </w:r>
-      <w:bookmarkEnd w:id="55"/>
+      <w:bookmarkEnd w:id="57"/>
     </w:p>
     <w:p>
       <w:pPr>
@@ -10990,13 +12403,31 @@
       <w:r>
         <w:t xml:space="preserve">Gutiérrez-Mosquera, L. F., Arias-Giraldo, S., &amp; Cardona-Naranjo, D. F. (2019). Cavitación hidrodinámica: un enfoque desde la ingeniería y la agroindustria. </w:t>
       </w:r>
+      <w:proofErr w:type="spellStart"/>
       <w:r>
         <w:rPr>
           <w:i/>
           <w:iCs/>
         </w:rPr>
-        <w:t>Scientia Et Technica</w:t>
-      </w:r>
+        <w:t>Scientia</w:t>
+      </w:r>
+      <w:proofErr w:type="spellEnd"/>
+      <w:r>
+        <w:rPr>
+          <w:i/>
+          <w:iCs/>
+        </w:rPr>
+        <w:t xml:space="preserve"> Et </w:t>
+      </w:r>
+      <w:proofErr w:type="spellStart"/>
+      <w:r>
+        <w:rPr>
+          <w:i/>
+          <w:iCs/>
+        </w:rPr>
+        <w:t>Technica</w:t>
+      </w:r>
+      <w:proofErr w:type="spellEnd"/>
       <w:r>
         <w:t>, 24(2), 283–304. Universidad Tecnológica de</w:t>
       </w:r>
@@ -11023,18 +12454,89 @@
       <w:pPr>
         <w:jc w:val="both"/>
       </w:pPr>
-      <w:r>
-        <w:t xml:space="preserve">Philipps, S., &amp; Warmuth, W. (2025, mayo 29). </w:t>
-      </w:r>
+      <w:proofErr w:type="spellStart"/>
+      <w:r>
+        <w:t>Philipps</w:t>
+      </w:r>
+      <w:proofErr w:type="spellEnd"/>
+      <w:r>
+        <w:t xml:space="preserve">, S., &amp; </w:t>
+      </w:r>
+      <w:proofErr w:type="spellStart"/>
+      <w:r>
+        <w:t>Warmuth</w:t>
+      </w:r>
+      <w:proofErr w:type="spellEnd"/>
+      <w:r>
+        <w:t xml:space="preserve">, W. (2025, mayo 29). </w:t>
+      </w:r>
+      <w:proofErr w:type="spellStart"/>
       <w:r>
         <w:rPr>
           <w:i/>
           <w:iCs/>
         </w:rPr>
-        <w:t>Photovoltaics report</w:t>
-      </w:r>
-      <w:r>
-        <w:t xml:space="preserve">. Fraunhofer Institute for Solar Energy Systems ISE &amp; PSE Projects GmbH. </w:t>
+        <w:t>Photovoltaics</w:t>
+      </w:r>
+      <w:proofErr w:type="spellEnd"/>
+      <w:r>
+        <w:rPr>
+          <w:i/>
+          <w:iCs/>
+        </w:rPr>
+        <w:t xml:space="preserve"> </w:t>
+      </w:r>
+      <w:proofErr w:type="spellStart"/>
+      <w:r>
+        <w:rPr>
+          <w:i/>
+          <w:iCs/>
+        </w:rPr>
+        <w:t>report</w:t>
+      </w:r>
+      <w:proofErr w:type="spellEnd"/>
+      <w:r>
+        <w:t xml:space="preserve">. Fraunhofer </w:t>
+      </w:r>
+      <w:proofErr w:type="spellStart"/>
+      <w:r>
+        <w:t>Institute</w:t>
+      </w:r>
+      <w:proofErr w:type="spellEnd"/>
+      <w:r>
+        <w:t xml:space="preserve"> </w:t>
+      </w:r>
+      <w:proofErr w:type="spellStart"/>
+      <w:r>
+        <w:t>for</w:t>
+      </w:r>
+      <w:proofErr w:type="spellEnd"/>
+      <w:r>
+        <w:t xml:space="preserve"> Solar Energy </w:t>
+      </w:r>
+      <w:proofErr w:type="spellStart"/>
+      <w:r>
+        <w:t>Systems</w:t>
+      </w:r>
+      <w:proofErr w:type="spellEnd"/>
+      <w:r>
+        <w:t xml:space="preserve"> ISE &amp; PSE </w:t>
+      </w:r>
+      <w:proofErr w:type="spellStart"/>
+      <w:r>
+        <w:t>Projects</w:t>
+      </w:r>
+      <w:proofErr w:type="spellEnd"/>
+      <w:r>
+        <w:t xml:space="preserve"> </w:t>
+      </w:r>
+      <w:proofErr w:type="spellStart"/>
+      <w:r>
+        <w:t>GmbH</w:t>
+      </w:r>
+      <w:proofErr w:type="spellEnd"/>
+      <w:r>
+        <w:t xml:space="preserve">. </w:t>
       </w:r>
       <w:hyperlink r:id="rId10" w:tgtFrame="_new" w:history="1">
         <w:r>
@@ -11082,18 +12584,177 @@
         </w:rPr>
         <w:br/>
       </w:r>
-      <w:r>
-        <w:t xml:space="preserve">World Health Organization (WHO). (2006). </w:t>
-      </w:r>
+      <w:proofErr w:type="spellStart"/>
+      <w:r>
+        <w:t>World</w:t>
+      </w:r>
+      <w:proofErr w:type="spellEnd"/>
+      <w:r>
+        <w:t xml:space="preserve"> </w:t>
+      </w:r>
+      <w:proofErr w:type="spellStart"/>
+      <w:r>
+        <w:t>Health</w:t>
+      </w:r>
+      <w:proofErr w:type="spellEnd"/>
+      <w:r>
+        <w:t xml:space="preserve"> </w:t>
+      </w:r>
+      <w:proofErr w:type="spellStart"/>
+      <w:r>
+        <w:t>Organization</w:t>
+      </w:r>
+      <w:proofErr w:type="spellEnd"/>
+      <w:r>
+        <w:t xml:space="preserve"> (WHO). (2006). </w:t>
+      </w:r>
+      <w:proofErr w:type="spellStart"/>
       <w:r>
         <w:rPr>
           <w:i/>
           <w:iCs/>
         </w:rPr>
-        <w:t>Guidelines for the safe use of wastewater, excreta and greywater</w:t>
-      </w:r>
-      <w:r>
-        <w:t xml:space="preserve"> (Vol. 2: Wastewater use in agriculture). World Health Organization. </w:t>
+        <w:t>Guidelines</w:t>
+      </w:r>
+      <w:proofErr w:type="spellEnd"/>
+      <w:r>
+        <w:rPr>
+          <w:i/>
+          <w:iCs/>
+        </w:rPr>
+        <w:t xml:space="preserve"> </w:t>
+      </w:r>
+      <w:proofErr w:type="spellStart"/>
+      <w:r>
+        <w:rPr>
+          <w:i/>
+          <w:iCs/>
+        </w:rPr>
+        <w:t>for</w:t>
+      </w:r>
+      <w:proofErr w:type="spellEnd"/>
+      <w:r>
+        <w:rPr>
+          <w:i/>
+          <w:iCs/>
+        </w:rPr>
+        <w:t xml:space="preserve"> </w:t>
+      </w:r>
+      <w:proofErr w:type="spellStart"/>
+      <w:r>
+        <w:rPr>
+          <w:i/>
+          <w:iCs/>
+        </w:rPr>
+        <w:t>the</w:t>
+      </w:r>
+      <w:proofErr w:type="spellEnd"/>
+      <w:r>
+        <w:rPr>
+          <w:i/>
+          <w:iCs/>
+        </w:rPr>
+        <w:t xml:space="preserve"> </w:t>
+      </w:r>
+      <w:proofErr w:type="spellStart"/>
+      <w:r>
+        <w:rPr>
+          <w:i/>
+          <w:iCs/>
+        </w:rPr>
+        <w:t>safe</w:t>
+      </w:r>
+      <w:proofErr w:type="spellEnd"/>
+      <w:r>
+        <w:rPr>
+          <w:i/>
+          <w:iCs/>
+        </w:rPr>
+        <w:t xml:space="preserve"> use </w:t>
+      </w:r>
+      <w:proofErr w:type="spellStart"/>
+      <w:r>
+        <w:rPr>
+          <w:i/>
+          <w:iCs/>
+        </w:rPr>
+        <w:t>of</w:t>
+      </w:r>
+      <w:proofErr w:type="spellEnd"/>
+      <w:r>
+        <w:rPr>
+          <w:i/>
+          <w:iCs/>
+        </w:rPr>
+        <w:t xml:space="preserve"> </w:t>
+      </w:r>
+      <w:proofErr w:type="spellStart"/>
+      <w:r>
+        <w:rPr>
+          <w:i/>
+          <w:iCs/>
+        </w:rPr>
+        <w:t>wastewater</w:t>
+      </w:r>
+      <w:proofErr w:type="spellEnd"/>
+      <w:r>
+        <w:rPr>
+          <w:i/>
+          <w:iCs/>
+        </w:rPr>
+        <w:t xml:space="preserve">, excreta and </w:t>
+      </w:r>
+      <w:proofErr w:type="spellStart"/>
+      <w:r>
+        <w:rPr>
+          <w:i/>
+          <w:iCs/>
+        </w:rPr>
+        <w:t>greywater</w:t>
+      </w:r>
+      <w:proofErr w:type="spellEnd"/>
+      <w:r>
+        <w:t xml:space="preserve"> (Vol. 2: </w:t>
+      </w:r>
+      <w:proofErr w:type="spellStart"/>
+      <w:r>
+        <w:t>Wastewater</w:t>
+      </w:r>
+      <w:proofErr w:type="spellEnd"/>
+      <w:r>
+        <w:t xml:space="preserve"> use in </w:t>
+      </w:r>
+      <w:proofErr w:type="spellStart"/>
+      <w:r>
+        <w:t>agriculture</w:t>
+      </w:r>
+      <w:proofErr w:type="spellEnd"/>
+      <w:r>
+        <w:t xml:space="preserve">). </w:t>
+      </w:r>
+      <w:proofErr w:type="spellStart"/>
+      <w:r>
+        <w:t>World</w:t>
+      </w:r>
+      <w:proofErr w:type="spellEnd"/>
+      <w:r>
+        <w:t xml:space="preserve"> </w:t>
+      </w:r>
+      <w:proofErr w:type="spellStart"/>
+      <w:r>
+        <w:t>Health</w:t>
+      </w:r>
+      <w:proofErr w:type="spellEnd"/>
+      <w:r>
+        <w:t xml:space="preserve"> </w:t>
+      </w:r>
+      <w:proofErr w:type="spellStart"/>
+      <w:r>
+        <w:t>Organization</w:t>
+      </w:r>
+      <w:proofErr w:type="spellEnd"/>
+      <w:r>
+        <w:t xml:space="preserve">. </w:t>
       </w:r>
       <w:hyperlink r:id="rId11" w:tgtFrame="_new" w:history="1">
         <w:r>
@@ -11130,17 +12791,114 @@
       </w:r>
       <w:r>
         <w:br/>
-        <w:t xml:space="preserve">Food and Agriculture Organization (FAO). (2010). </w:t>
-      </w:r>
+      </w:r>
+      <w:proofErr w:type="spellStart"/>
+      <w:r>
+        <w:t>Food</w:t>
+      </w:r>
+      <w:proofErr w:type="spellEnd"/>
+      <w:r>
+        <w:t xml:space="preserve"> and </w:t>
+      </w:r>
+      <w:proofErr w:type="spellStart"/>
+      <w:r>
+        <w:t>Agriculture</w:t>
+      </w:r>
+      <w:proofErr w:type="spellEnd"/>
+      <w:r>
+        <w:t xml:space="preserve"> </w:t>
+      </w:r>
+      <w:proofErr w:type="spellStart"/>
+      <w:r>
+        <w:t>Organization</w:t>
+      </w:r>
+      <w:proofErr w:type="spellEnd"/>
+      <w:r>
+        <w:t xml:space="preserve"> (FAO). (2010). </w:t>
+      </w:r>
+      <w:proofErr w:type="spellStart"/>
       <w:r>
         <w:rPr>
           <w:i/>
           <w:iCs/>
         </w:rPr>
-        <w:t>Water quality for agriculture</w:t>
-      </w:r>
-      <w:r>
-        <w:t xml:space="preserve"> (FAO Irrigation and Drainage Paper 29, Rev. 1). FAO.</w:t>
+        <w:t>Water</w:t>
+      </w:r>
+      <w:proofErr w:type="spellEnd"/>
+      <w:r>
+        <w:rPr>
+          <w:i/>
+          <w:iCs/>
+        </w:rPr>
+        <w:t xml:space="preserve"> </w:t>
+      </w:r>
+      <w:proofErr w:type="spellStart"/>
+      <w:r>
+        <w:rPr>
+          <w:i/>
+          <w:iCs/>
+        </w:rPr>
+        <w:t>quality</w:t>
+      </w:r>
+      <w:proofErr w:type="spellEnd"/>
+      <w:r>
+        <w:rPr>
+          <w:i/>
+          <w:iCs/>
+        </w:rPr>
+        <w:t xml:space="preserve"> </w:t>
+      </w:r>
+      <w:proofErr w:type="spellStart"/>
+      <w:r>
+        <w:rPr>
+          <w:i/>
+          <w:iCs/>
+        </w:rPr>
+        <w:t>for</w:t>
+      </w:r>
+      <w:proofErr w:type="spellEnd"/>
+      <w:r>
+        <w:rPr>
+          <w:i/>
+          <w:iCs/>
+        </w:rPr>
+        <w:t xml:space="preserve"> </w:t>
+      </w:r>
+      <w:proofErr w:type="spellStart"/>
+      <w:r>
+        <w:rPr>
+          <w:i/>
+          <w:iCs/>
+        </w:rPr>
+        <w:t>agriculture</w:t>
+      </w:r>
+      <w:proofErr w:type="spellEnd"/>
+      <w:r>
+        <w:t xml:space="preserve"> (FAO </w:t>
+      </w:r>
+      <w:proofErr w:type="spellStart"/>
+      <w:r>
+        <w:t>Irrigation</w:t>
+      </w:r>
+      <w:proofErr w:type="spellEnd"/>
+      <w:r>
+        <w:t xml:space="preserve"> and </w:t>
+      </w:r>
+      <w:proofErr w:type="spellStart"/>
+      <w:r>
+        <w:t>Drainage</w:t>
+      </w:r>
+      <w:proofErr w:type="spellEnd"/>
+      <w:r>
+        <w:t xml:space="preserve"> </w:t>
+      </w:r>
+      <w:proofErr w:type="spellStart"/>
+      <w:r>
+        <w:t>Paper</w:t>
+      </w:r>
+      <w:proofErr w:type="spellEnd"/>
+      <w:r>
+        <w:t xml:space="preserve"> 29, Rev. 1). FAO.</w:t>
       </w:r>
     </w:p>
     <w:p>
@@ -11208,7 +12966,7 @@
 </file>
 
 <file path=word/numbering.xml><?xml version="1.0" encoding="utf-8"?>
-<w:numbering xmlns:wpc="http://schemas.microsoft.com/office/word/2010/wordprocessingCanvas" xmlns:cx="http://schemas.microsoft.com/office/drawing/2014/chartex" xmlns:cx1="http://schemas.microsoft.com/office/drawing/2015/9/8/chartex" xmlns:cx2="http://schemas.microsoft.com/office/drawing/2015/10/21/chartex" xmlns:cx3="http://schemas.microsoft.com/office/drawing/2016/5/9/chartex" xmlns:cx4="http://schemas.microsoft.com/office/drawing/2016/5/10/chartex" xmlns:cx5="http://schemas.microsoft.com/office/drawing/2016/5/11/chartex" xmlns:cx6="http://schemas.microsoft.com/office/drawing/2016/5/12/chartex" xmlns:cx7="http://schemas.microsoft.com/office/drawing/2016/5/13/chartex" xmlns:cx8="http://schemas.microsoft.com/office/drawing/2016/5/14/chartex" xmlns:mc="http://schemas.openxmlformats.org/markup-compatibility/2006" xmlns:aink="http://schemas.microsoft.com/office/drawing/2016/ink" xmlns:am3d="http://schemas.microsoft.com/office/drawing/2017/model3d" xmlns:o="urn:schemas-microsoft-com:office:office" xmlns:oel="http://schemas.microsoft.com/office/2019/extlst" xmlns:r="http://schemas.openxmlformats.org/officeDocument/2006/relationships" xmlns:m="http://schemas.openxmlformats.org/officeDocument/2006/math" xmlns:v="urn:schemas-microsoft-com:vml" xmlns:wp14="http://schemas.microsoft.com/office/word/2010/wordprocessingDrawing" xmlns:wp="http://schemas.openxmlformats.org/drawingml/2006/wordprocessingDrawing" xmlns:w10="urn:schemas-microsoft-com:office:word" xmlns:w="http://schemas.openxmlformats.org/wordprocessingml/2006/main" xmlns:w14="http://schemas.microsoft.com/office/word/2010/wordml" xmlns:w15="http://schemas.microsoft.com/office/word/2012/wordml" xmlns:w16cex="http://schemas.microsoft.com/office/word/2018/wordml/cex" xmlns:w16cid="http://schemas.microsoft.com/office/word/2016/wordml/cid" xmlns:w16="http://schemas.microsoft.com/office/word/2018/wordml" xmlns:w16sdtdh="http://schemas.microsoft.com/office/word/2020/wordml/sdtdatahash" xmlns:w16se="http://schemas.microsoft.com/office/word/2015/wordml/symex" xmlns:wpg="http://schemas.microsoft.com/office/word/2010/wordprocessingGroup" xmlns:wpi="http://schemas.microsoft.com/office/word/2010/wordprocessingInk" xmlns:wne="http://schemas.microsoft.com/office/word/2006/wordml" xmlns:wps="http://schemas.microsoft.com/office/word/2010/wordprocessingShape" mc:Ignorable="w14 w15 w16se w16cid w16 w16cex w16sdtdh wp14">
+<w:numbering xmlns:wpc="http://schemas.microsoft.com/office/word/2010/wordprocessingCanvas" xmlns:cx="http://schemas.microsoft.com/office/drawing/2014/chartex" xmlns:cx1="http://schemas.microsoft.com/office/drawing/2015/9/8/chartex" xmlns:cx2="http://schemas.microsoft.com/office/drawing/2015/10/21/chartex" xmlns:cx3="http://schemas.microsoft.com/office/drawing/2016/5/9/chartex" xmlns:cx4="http://schemas.microsoft.com/office/drawing/2016/5/10/chartex" xmlns:cx5="http://schemas.microsoft.com/office/drawing/2016/5/11/chartex" xmlns:cx6="http://schemas.microsoft.com/office/drawing/2016/5/12/chartex" xmlns:cx7="http://schemas.microsoft.com/office/drawing/2016/5/13/chartex" xmlns:cx8="http://schemas.microsoft.com/office/drawing/2016/5/14/chartex" xmlns:mc="http://schemas.openxmlformats.org/markup-compatibility/2006" xmlns:aink="http://schemas.microsoft.com/office/drawing/2016/ink" xmlns:am3d="http://schemas.microsoft.com/office/drawing/2017/model3d" xmlns:o="urn:schemas-microsoft-com:office:office" xmlns:oel="http://schemas.microsoft.com/office/2019/extlst" xmlns:r="http://schemas.openxmlformats.org/officeDocument/2006/relationships" xmlns:m="http://schemas.openxmlformats.org/officeDocument/2006/math" xmlns:v="urn:schemas-microsoft-com:vml" xmlns:wp14="http://schemas.microsoft.com/office/word/2010/wordprocessingDrawing" xmlns:wp="http://schemas.openxmlformats.org/drawingml/2006/wordprocessingDrawing" xmlns:w10="urn:schemas-microsoft-com:office:word" xmlns:w="http://schemas.openxmlformats.org/wordprocessingml/2006/main" xmlns:w14="http://schemas.microsoft.com/office/word/2010/wordml" xmlns:w15="http://schemas.microsoft.com/office/word/2012/wordml" xmlns:w16cex="http://schemas.microsoft.com/office/word/2018/wordml/cex" xmlns:w16cid="http://schemas.microsoft.com/office/word/2016/wordml/cid" xmlns:w16="http://schemas.microsoft.com/office/word/2018/wordml" xmlns:w16du="http://schemas.microsoft.com/office/word/2023/wordml/word16du" xmlns:w16sdtdh="http://schemas.microsoft.com/office/word/2020/wordml/sdtdatahash" xmlns:w16sdtfl="http://schemas.microsoft.com/office/word/2024/wordml/sdtformatlock" xmlns:w16se="http://schemas.microsoft.com/office/word/2015/wordml/symex" xmlns:wpg="http://schemas.microsoft.com/office/word/2010/wordprocessingGroup" xmlns:wpi="http://schemas.microsoft.com/office/word/2010/wordprocessingInk" xmlns:wne="http://schemas.microsoft.com/office/word/2006/wordml" xmlns:wps="http://schemas.microsoft.com/office/word/2010/wordprocessingShape" mc:Ignorable="w14 w15 w16se w16cid w16 w16cex w16sdtdh w16sdtfl w16du wp14">
   <w:abstractNum w:abstractNumId="0" w15:restartNumberingAfterBreak="0">
     <w:nsid w:val="00933BE2"/>
     <w:multiLevelType w:val="multilevel"/>
@@ -11359,6 +13117,92 @@
     </w:lvl>
   </w:abstractNum>
   <w:abstractNum w:abstractNumId="1" w15:restartNumberingAfterBreak="0">
+    <w:nsid w:val="033359A1"/>
+    <w:multiLevelType w:val="hybridMultilevel"/>
+    <w:tmpl w:val="7DEC6EE4"/>
+    <w:lvl w:ilvl="0" w:tplc="240A000F">
+      <w:start w:val="1"/>
+      <w:numFmt w:val="decimal"/>
+      <w:lvlText w:val="%1."/>
+      <w:lvlJc w:val="left"/>
+      <w:pPr>
+        <w:ind w:left="2138" w:hanging="360"/>
+      </w:pPr>
+    </w:lvl>
+    <w:lvl w:ilvl="1" w:tplc="240A0019" w:tentative="1">
+      <w:start w:val="1"/>
+      <w:numFmt w:val="lowerLetter"/>
+      <w:lvlText w:val="%2."/>
+      <w:lvlJc w:val="left"/>
+      <w:pPr>
+        <w:ind w:left="2858" w:hanging="360"/>
+      </w:pPr>
+    </w:lvl>
+    <w:lvl w:ilvl="2" w:tplc="240A001B" w:tentative="1">
+      <w:start w:val="1"/>
+      <w:numFmt w:val="lowerRoman"/>
+      <w:lvlText w:val="%3."/>
+      <w:lvlJc w:val="right"/>
+      <w:pPr>
+        <w:ind w:left="3578" w:hanging="180"/>
+      </w:pPr>
+    </w:lvl>
+    <w:lvl w:ilvl="3" w:tplc="240A000F" w:tentative="1">
+      <w:start w:val="1"/>
+      <w:numFmt w:val="decimal"/>
+      <w:lvlText w:val="%4."/>
+      <w:lvlJc w:val="left"/>
+      <w:pPr>
+        <w:ind w:left="4298" w:hanging="360"/>
+      </w:pPr>
+    </w:lvl>
+    <w:lvl w:ilvl="4" w:tplc="240A0019" w:tentative="1">
+      <w:start w:val="1"/>
+      <w:numFmt w:val="lowerLetter"/>
+      <w:lvlText w:val="%5."/>
+      <w:lvlJc w:val="left"/>
+      <w:pPr>
+        <w:ind w:left="5018" w:hanging="360"/>
+      </w:pPr>
+    </w:lvl>
+    <w:lvl w:ilvl="5" w:tplc="240A001B" w:tentative="1">
+      <w:start w:val="1"/>
+      <w:numFmt w:val="lowerRoman"/>
+      <w:lvlText w:val="%6."/>
+      <w:lvlJc w:val="right"/>
+      <w:pPr>
+        <w:ind w:left="5738" w:hanging="180"/>
+      </w:pPr>
+    </w:lvl>
+    <w:lvl w:ilvl="6" w:tplc="240A000F" w:tentative="1">
+      <w:start w:val="1"/>
+      <w:numFmt w:val="decimal"/>
+      <w:lvlText w:val="%7."/>
+      <w:lvlJc w:val="left"/>
+      <w:pPr>
+        <w:ind w:left="6458" w:hanging="360"/>
+      </w:pPr>
+    </w:lvl>
+    <w:lvl w:ilvl="7" w:tplc="240A0019" w:tentative="1">
+      <w:start w:val="1"/>
+      <w:numFmt w:val="lowerLetter"/>
+      <w:lvlText w:val="%8."/>
+      <w:lvlJc w:val="left"/>
+      <w:pPr>
+        <w:ind w:left="7178" w:hanging="360"/>
+      </w:pPr>
+    </w:lvl>
+    <w:lvl w:ilvl="8" w:tplc="240A001B" w:tentative="1">
+      <w:start w:val="1"/>
+      <w:numFmt w:val="lowerRoman"/>
+      <w:lvlText w:val="%9."/>
+      <w:lvlJc w:val="right"/>
+      <w:pPr>
+        <w:ind w:left="7898" w:hanging="180"/>
+      </w:pPr>
+    </w:lvl>
+  </w:abstractNum>
+  <w:abstractNum w:abstractNumId="2" w15:restartNumberingAfterBreak="0">
     <w:nsid w:val="05D91002"/>
     <w:multiLevelType w:val="hybridMultilevel"/>
     <w:tmpl w:val="B7469974"/>
@@ -11471,7 +13315,7 @@
       </w:rPr>
     </w:lvl>
   </w:abstractNum>
-  <w:abstractNum w:abstractNumId="2" w15:restartNumberingAfterBreak="0">
+  <w:abstractNum w:abstractNumId="3" w15:restartNumberingAfterBreak="0">
     <w:nsid w:val="0930185B"/>
     <w:multiLevelType w:val="hybridMultilevel"/>
     <w:tmpl w:val="2588271A"/>
@@ -11584,7 +13428,7 @@
       </w:rPr>
     </w:lvl>
   </w:abstractNum>
-  <w:abstractNum w:abstractNumId="3" w15:restartNumberingAfterBreak="0">
+  <w:abstractNum w:abstractNumId="4" w15:restartNumberingAfterBreak="0">
     <w:nsid w:val="0B9E699E"/>
     <w:multiLevelType w:val="hybridMultilevel"/>
     <w:tmpl w:val="22184412"/>
@@ -11697,7 +13541,7 @@
       </w:rPr>
     </w:lvl>
   </w:abstractNum>
-  <w:abstractNum w:abstractNumId="4" w15:restartNumberingAfterBreak="0">
+  <w:abstractNum w:abstractNumId="5" w15:restartNumberingAfterBreak="0">
     <w:nsid w:val="11C57885"/>
     <w:multiLevelType w:val="multilevel"/>
     <w:tmpl w:val="240A001F"/>
@@ -11783,7 +13627,7 @@
       </w:pPr>
     </w:lvl>
   </w:abstractNum>
-  <w:abstractNum w:abstractNumId="5" w15:restartNumberingAfterBreak="0">
+  <w:abstractNum w:abstractNumId="6" w15:restartNumberingAfterBreak="0">
     <w:nsid w:val="137E6F00"/>
     <w:multiLevelType w:val="hybridMultilevel"/>
     <w:tmpl w:val="41D4C834"/>
@@ -11869,7 +13713,7 @@
       </w:pPr>
     </w:lvl>
   </w:abstractNum>
-  <w:abstractNum w:abstractNumId="6" w15:restartNumberingAfterBreak="0">
+  <w:abstractNum w:abstractNumId="7" w15:restartNumberingAfterBreak="0">
     <w:nsid w:val="191D1638"/>
     <w:multiLevelType w:val="hybridMultilevel"/>
     <w:tmpl w:val="4E884DD0"/>
@@ -11955,7 +13799,7 @@
       </w:pPr>
     </w:lvl>
   </w:abstractNum>
-  <w:abstractNum w:abstractNumId="7" w15:restartNumberingAfterBreak="0">
+  <w:abstractNum w:abstractNumId="8" w15:restartNumberingAfterBreak="0">
     <w:nsid w:val="1BE42D71"/>
     <w:multiLevelType w:val="multilevel"/>
     <w:tmpl w:val="240A001F"/>
@@ -12041,7 +13885,7 @@
       </w:pPr>
     </w:lvl>
   </w:abstractNum>
-  <w:abstractNum w:abstractNumId="8" w15:restartNumberingAfterBreak="0">
+  <w:abstractNum w:abstractNumId="9" w15:restartNumberingAfterBreak="0">
     <w:nsid w:val="1F9F4000"/>
     <w:multiLevelType w:val="multilevel"/>
     <w:tmpl w:val="22B4B7E2"/>
@@ -12190,7 +14034,7 @@
       </w:rPr>
     </w:lvl>
   </w:abstractNum>
-  <w:abstractNum w:abstractNumId="9" w15:restartNumberingAfterBreak="0">
+  <w:abstractNum w:abstractNumId="10" w15:restartNumberingAfterBreak="0">
     <w:nsid w:val="24EA5FEB"/>
     <w:multiLevelType w:val="multilevel"/>
     <w:tmpl w:val="240A001F"/>
@@ -12276,7 +14120,7 @@
       </w:pPr>
     </w:lvl>
   </w:abstractNum>
-  <w:abstractNum w:abstractNumId="10" w15:restartNumberingAfterBreak="0">
+  <w:abstractNum w:abstractNumId="11" w15:restartNumberingAfterBreak="0">
     <w:nsid w:val="250E3CDB"/>
     <w:multiLevelType w:val="multilevel"/>
     <w:tmpl w:val="AC863C8C"/>
@@ -12425,7 +14269,7 @@
       </w:rPr>
     </w:lvl>
   </w:abstractNum>
-  <w:abstractNum w:abstractNumId="11" w15:restartNumberingAfterBreak="0">
+  <w:abstractNum w:abstractNumId="12" w15:restartNumberingAfterBreak="0">
     <w:nsid w:val="28A173CC"/>
     <w:multiLevelType w:val="multilevel"/>
     <w:tmpl w:val="6A9674AA"/>
@@ -12574,7 +14418,7 @@
       </w:rPr>
     </w:lvl>
   </w:abstractNum>
-  <w:abstractNum w:abstractNumId="12" w15:restartNumberingAfterBreak="0">
+  <w:abstractNum w:abstractNumId="13" w15:restartNumberingAfterBreak="0">
     <w:nsid w:val="2A3F62D9"/>
     <w:multiLevelType w:val="multilevel"/>
     <w:tmpl w:val="240A001F"/>
@@ -12660,7 +14504,7 @@
       </w:pPr>
     </w:lvl>
   </w:abstractNum>
-  <w:abstractNum w:abstractNumId="13" w15:restartNumberingAfterBreak="0">
+  <w:abstractNum w:abstractNumId="14" w15:restartNumberingAfterBreak="0">
     <w:nsid w:val="2EEE13B8"/>
     <w:multiLevelType w:val="hybridMultilevel"/>
     <w:tmpl w:val="7EBEC842"/>
@@ -12746,7 +14590,7 @@
       </w:pPr>
     </w:lvl>
   </w:abstractNum>
-  <w:abstractNum w:abstractNumId="14" w15:restartNumberingAfterBreak="0">
+  <w:abstractNum w:abstractNumId="15" w15:restartNumberingAfterBreak="0">
     <w:nsid w:val="343A532E"/>
     <w:multiLevelType w:val="multilevel"/>
     <w:tmpl w:val="BF22317E"/>
@@ -12895,7 +14739,7 @@
       </w:rPr>
     </w:lvl>
   </w:abstractNum>
-  <w:abstractNum w:abstractNumId="15" w15:restartNumberingAfterBreak="0">
+  <w:abstractNum w:abstractNumId="16" w15:restartNumberingAfterBreak="0">
     <w:nsid w:val="398C022F"/>
     <w:multiLevelType w:val="hybridMultilevel"/>
     <w:tmpl w:val="646277A0"/>
@@ -12984,7 +14828,7 @@
       </w:pPr>
     </w:lvl>
   </w:abstractNum>
-  <w:abstractNum w:abstractNumId="16" w15:restartNumberingAfterBreak="0">
+  <w:abstractNum w:abstractNumId="17" w15:restartNumberingAfterBreak="0">
     <w:nsid w:val="413A185B"/>
     <w:multiLevelType w:val="multilevel"/>
     <w:tmpl w:val="3D381468"/>
@@ -13133,7 +14977,7 @@
       </w:rPr>
     </w:lvl>
   </w:abstractNum>
-  <w:abstractNum w:abstractNumId="17" w15:restartNumberingAfterBreak="0">
+  <w:abstractNum w:abstractNumId="18" w15:restartNumberingAfterBreak="0">
     <w:nsid w:val="4192327A"/>
     <w:multiLevelType w:val="multilevel"/>
     <w:tmpl w:val="48520568"/>
@@ -13282,7 +15126,7 @@
       </w:rPr>
     </w:lvl>
   </w:abstractNum>
-  <w:abstractNum w:abstractNumId="18" w15:restartNumberingAfterBreak="0">
+  <w:abstractNum w:abstractNumId="19" w15:restartNumberingAfterBreak="0">
     <w:nsid w:val="4B4E2F72"/>
     <w:multiLevelType w:val="multilevel"/>
     <w:tmpl w:val="240A001F"/>
@@ -13368,7 +15212,7 @@
       </w:pPr>
     </w:lvl>
   </w:abstractNum>
-  <w:abstractNum w:abstractNumId="19" w15:restartNumberingAfterBreak="0">
+  <w:abstractNum w:abstractNumId="20" w15:restartNumberingAfterBreak="0">
     <w:nsid w:val="4BE2561E"/>
     <w:multiLevelType w:val="hybridMultilevel"/>
     <w:tmpl w:val="3508D800"/>
@@ -13454,7 +15298,7 @@
       </w:pPr>
     </w:lvl>
   </w:abstractNum>
-  <w:abstractNum w:abstractNumId="20" w15:restartNumberingAfterBreak="0">
+  <w:abstractNum w:abstractNumId="21" w15:restartNumberingAfterBreak="0">
     <w:nsid w:val="4D8B2301"/>
     <w:multiLevelType w:val="multilevel"/>
     <w:tmpl w:val="2C7AC738"/>
@@ -13603,7 +15447,7 @@
       </w:rPr>
     </w:lvl>
   </w:abstractNum>
-  <w:abstractNum w:abstractNumId="21" w15:restartNumberingAfterBreak="0">
+  <w:abstractNum w:abstractNumId="22" w15:restartNumberingAfterBreak="0">
     <w:nsid w:val="4E613023"/>
     <w:multiLevelType w:val="hybridMultilevel"/>
     <w:tmpl w:val="84D6A950"/>
@@ -13689,7 +15533,7 @@
       </w:pPr>
     </w:lvl>
   </w:abstractNum>
-  <w:abstractNum w:abstractNumId="22" w15:restartNumberingAfterBreak="0">
+  <w:abstractNum w:abstractNumId="23" w15:restartNumberingAfterBreak="0">
     <w:nsid w:val="4F1C1D5A"/>
     <w:multiLevelType w:val="hybridMultilevel"/>
     <w:tmpl w:val="6226E236"/>
@@ -13775,7 +15619,7 @@
       </w:pPr>
     </w:lvl>
   </w:abstractNum>
-  <w:abstractNum w:abstractNumId="23" w15:restartNumberingAfterBreak="0">
+  <w:abstractNum w:abstractNumId="24" w15:restartNumberingAfterBreak="0">
     <w:nsid w:val="50A75C1A"/>
     <w:multiLevelType w:val="hybridMultilevel"/>
     <w:tmpl w:val="1B141D74"/>
@@ -13888,7 +15732,93 @@
       </w:rPr>
     </w:lvl>
   </w:abstractNum>
-  <w:abstractNum w:abstractNumId="24" w15:restartNumberingAfterBreak="0">
+  <w:abstractNum w:abstractNumId="25" w15:restartNumberingAfterBreak="0">
+    <w:nsid w:val="53437B37"/>
+    <w:multiLevelType w:val="hybridMultilevel"/>
+    <w:tmpl w:val="6156887C"/>
+    <w:lvl w:ilvl="0" w:tplc="240A000F">
+      <w:start w:val="1"/>
+      <w:numFmt w:val="decimal"/>
+      <w:lvlText w:val="%1."/>
+      <w:lvlJc w:val="left"/>
+      <w:pPr>
+        <w:ind w:left="720" w:hanging="360"/>
+      </w:pPr>
+    </w:lvl>
+    <w:lvl w:ilvl="1" w:tplc="240A0019" w:tentative="1">
+      <w:start w:val="1"/>
+      <w:numFmt w:val="lowerLetter"/>
+      <w:lvlText w:val="%2."/>
+      <w:lvlJc w:val="left"/>
+      <w:pPr>
+        <w:ind w:left="1440" w:hanging="360"/>
+      </w:pPr>
+    </w:lvl>
+    <w:lvl w:ilvl="2" w:tplc="240A001B" w:tentative="1">
+      <w:start w:val="1"/>
+      <w:numFmt w:val="lowerRoman"/>
+      <w:lvlText w:val="%3."/>
+      <w:lvlJc w:val="right"/>
+      <w:pPr>
+        <w:ind w:left="2160" w:hanging="180"/>
+      </w:pPr>
+    </w:lvl>
+    <w:lvl w:ilvl="3" w:tplc="240A000F" w:tentative="1">
+      <w:start w:val="1"/>
+      <w:numFmt w:val="decimal"/>
+      <w:lvlText w:val="%4."/>
+      <w:lvlJc w:val="left"/>
+      <w:pPr>
+        <w:ind w:left="2880" w:hanging="360"/>
+      </w:pPr>
+    </w:lvl>
+    <w:lvl w:ilvl="4" w:tplc="240A0019" w:tentative="1">
+      <w:start w:val="1"/>
+      <w:numFmt w:val="lowerLetter"/>
+      <w:lvlText w:val="%5."/>
+      <w:lvlJc w:val="left"/>
+      <w:pPr>
+        <w:ind w:left="3600" w:hanging="360"/>
+      </w:pPr>
+    </w:lvl>
+    <w:lvl w:ilvl="5" w:tplc="240A001B" w:tentative="1">
+      <w:start w:val="1"/>
+      <w:numFmt w:val="lowerRoman"/>
+      <w:lvlText w:val="%6."/>
+      <w:lvlJc w:val="right"/>
+      <w:pPr>
+        <w:ind w:left="4320" w:hanging="180"/>
+      </w:pPr>
+    </w:lvl>
+    <w:lvl w:ilvl="6" w:tplc="240A000F" w:tentative="1">
+      <w:start w:val="1"/>
+      <w:numFmt w:val="decimal"/>
+      <w:lvlText w:val="%7."/>
+      <w:lvlJc w:val="left"/>
+      <w:pPr>
+        <w:ind w:left="5040" w:hanging="360"/>
+      </w:pPr>
+    </w:lvl>
+    <w:lvl w:ilvl="7" w:tplc="240A0019" w:tentative="1">
+      <w:start w:val="1"/>
+      <w:numFmt w:val="lowerLetter"/>
+      <w:lvlText w:val="%8."/>
+      <w:lvlJc w:val="left"/>
+      <w:pPr>
+        <w:ind w:left="5760" w:hanging="360"/>
+      </w:pPr>
+    </w:lvl>
+    <w:lvl w:ilvl="8" w:tplc="240A001B" w:tentative="1">
+      <w:start w:val="1"/>
+      <w:numFmt w:val="lowerRoman"/>
+      <w:lvlText w:val="%9."/>
+      <w:lvlJc w:val="right"/>
+      <w:pPr>
+        <w:ind w:left="6480" w:hanging="180"/>
+      </w:pPr>
+    </w:lvl>
+  </w:abstractNum>
+  <w:abstractNum w:abstractNumId="26" w15:restartNumberingAfterBreak="0">
     <w:nsid w:val="540A43FE"/>
     <w:multiLevelType w:val="hybridMultilevel"/>
     <w:tmpl w:val="056EB708"/>
@@ -13974,7 +15904,7 @@
       </w:pPr>
     </w:lvl>
   </w:abstractNum>
-  <w:abstractNum w:abstractNumId="25" w15:restartNumberingAfterBreak="0">
+  <w:abstractNum w:abstractNumId="27" w15:restartNumberingAfterBreak="0">
     <w:nsid w:val="56245A7A"/>
     <w:multiLevelType w:val="hybridMultilevel"/>
     <w:tmpl w:val="85989CA6"/>
@@ -14087,7 +16017,7 @@
       </w:rPr>
     </w:lvl>
   </w:abstractNum>
-  <w:abstractNum w:abstractNumId="26" w15:restartNumberingAfterBreak="0">
+  <w:abstractNum w:abstractNumId="28" w15:restartNumberingAfterBreak="0">
     <w:nsid w:val="579B1B3A"/>
     <w:multiLevelType w:val="hybridMultilevel"/>
     <w:tmpl w:val="9502D76E"/>
@@ -14173,7 +16103,7 @@
       </w:pPr>
     </w:lvl>
   </w:abstractNum>
-  <w:abstractNum w:abstractNumId="27" w15:restartNumberingAfterBreak="0">
+  <w:abstractNum w:abstractNumId="29" w15:restartNumberingAfterBreak="0">
     <w:nsid w:val="5ED85714"/>
     <w:multiLevelType w:val="hybridMultilevel"/>
     <w:tmpl w:val="A1326EF2"/>
@@ -14286,7 +16216,7 @@
       </w:rPr>
     </w:lvl>
   </w:abstractNum>
-  <w:abstractNum w:abstractNumId="28" w15:restartNumberingAfterBreak="0">
+  <w:abstractNum w:abstractNumId="30" w15:restartNumberingAfterBreak="0">
     <w:nsid w:val="63A44A1B"/>
     <w:multiLevelType w:val="multilevel"/>
     <w:tmpl w:val="481E19FA"/>
@@ -14435,7 +16365,7 @@
       </w:rPr>
     </w:lvl>
   </w:abstractNum>
-  <w:abstractNum w:abstractNumId="29" w15:restartNumberingAfterBreak="0">
+  <w:abstractNum w:abstractNumId="31" w15:restartNumberingAfterBreak="0">
     <w:nsid w:val="6DAD629C"/>
     <w:multiLevelType w:val="multilevel"/>
     <w:tmpl w:val="80B8A8F6"/>
@@ -14584,7 +16514,7 @@
       </w:rPr>
     </w:lvl>
   </w:abstractNum>
-  <w:abstractNum w:abstractNumId="30" w15:restartNumberingAfterBreak="0">
+  <w:abstractNum w:abstractNumId="32" w15:restartNumberingAfterBreak="0">
     <w:nsid w:val="70036D2E"/>
     <w:multiLevelType w:val="hybridMultilevel"/>
     <w:tmpl w:val="9F727E1E"/>
@@ -14697,7 +16627,7 @@
       </w:rPr>
     </w:lvl>
   </w:abstractNum>
-  <w:abstractNum w:abstractNumId="31" w15:restartNumberingAfterBreak="0">
+  <w:abstractNum w:abstractNumId="33" w15:restartNumberingAfterBreak="0">
     <w:nsid w:val="702F00F0"/>
     <w:multiLevelType w:val="hybridMultilevel"/>
     <w:tmpl w:val="52DC5AB4"/>
@@ -14810,7 +16740,7 @@
       </w:rPr>
     </w:lvl>
   </w:abstractNum>
-  <w:abstractNum w:abstractNumId="32" w15:restartNumberingAfterBreak="0">
+  <w:abstractNum w:abstractNumId="34" w15:restartNumberingAfterBreak="0">
     <w:nsid w:val="71192DC9"/>
     <w:multiLevelType w:val="multilevel"/>
     <w:tmpl w:val="8544FC88"/>
@@ -14959,7 +16889,7 @@
       </w:rPr>
     </w:lvl>
   </w:abstractNum>
-  <w:abstractNum w:abstractNumId="33" w15:restartNumberingAfterBreak="0">
+  <w:abstractNum w:abstractNumId="35" w15:restartNumberingAfterBreak="0">
     <w:nsid w:val="73E56A65"/>
     <w:multiLevelType w:val="hybridMultilevel"/>
     <w:tmpl w:val="D2FA62DC"/>
@@ -15045,7 +16975,7 @@
       </w:pPr>
     </w:lvl>
   </w:abstractNum>
-  <w:abstractNum w:abstractNumId="34" w15:restartNumberingAfterBreak="0">
+  <w:abstractNum w:abstractNumId="36" w15:restartNumberingAfterBreak="0">
     <w:nsid w:val="7562004F"/>
     <w:multiLevelType w:val="hybridMultilevel"/>
     <w:tmpl w:val="F12A8284"/>
@@ -15131,7 +17061,7 @@
       </w:pPr>
     </w:lvl>
   </w:abstractNum>
-  <w:abstractNum w:abstractNumId="35" w15:restartNumberingAfterBreak="0">
+  <w:abstractNum w:abstractNumId="37" w15:restartNumberingAfterBreak="0">
     <w:nsid w:val="7A2B0C65"/>
     <w:multiLevelType w:val="multilevel"/>
     <w:tmpl w:val="4C54ADFE"/>
@@ -15280,7 +17210,7 @@
       </w:rPr>
     </w:lvl>
   </w:abstractNum>
-  <w:abstractNum w:abstractNumId="36" w15:restartNumberingAfterBreak="0">
+  <w:abstractNum w:abstractNumId="38" w15:restartNumberingAfterBreak="0">
     <w:nsid w:val="7B0011C5"/>
     <w:multiLevelType w:val="hybridMultilevel"/>
     <w:tmpl w:val="DE7E06DC"/>
@@ -15397,118 +17327,124 @@
     <w:abstractNumId w:val="0"/>
   </w:num>
   <w:num w:numId="2" w16cid:durableId="850799477">
+    <w:abstractNumId w:val="31"/>
+  </w:num>
+  <w:num w:numId="3" w16cid:durableId="176962430">
+    <w:abstractNumId w:val="3"/>
+  </w:num>
+  <w:num w:numId="4" w16cid:durableId="1836263258">
+    <w:abstractNumId w:val="23"/>
+  </w:num>
+  <w:num w:numId="5" w16cid:durableId="1711104261">
+    <w:abstractNumId w:val="22"/>
+  </w:num>
+  <w:num w:numId="6" w16cid:durableId="1840191591">
+    <w:abstractNumId w:val="19"/>
+  </w:num>
+  <w:num w:numId="7" w16cid:durableId="1755662524">
+    <w:abstractNumId w:val="5"/>
+  </w:num>
+  <w:num w:numId="8" w16cid:durableId="2070806721">
+    <w:abstractNumId w:val="20"/>
+  </w:num>
+  <w:num w:numId="9" w16cid:durableId="1230964383">
+    <w:abstractNumId w:val="14"/>
+  </w:num>
+  <w:num w:numId="10" w16cid:durableId="873270123">
+    <w:abstractNumId w:val="28"/>
+  </w:num>
+  <w:num w:numId="11" w16cid:durableId="1854805821">
+    <w:abstractNumId w:val="10"/>
+  </w:num>
+  <w:num w:numId="12" w16cid:durableId="655492938">
+    <w:abstractNumId w:val="11"/>
+  </w:num>
+  <w:num w:numId="13" w16cid:durableId="1955332203">
+    <w:abstractNumId w:val="30"/>
+  </w:num>
+  <w:num w:numId="14" w16cid:durableId="494034560">
+    <w:abstractNumId w:val="15"/>
+  </w:num>
+  <w:num w:numId="15" w16cid:durableId="357510247">
+    <w:abstractNumId w:val="12"/>
+  </w:num>
+  <w:num w:numId="16" w16cid:durableId="2091461372">
+    <w:abstractNumId w:val="9"/>
+  </w:num>
+  <w:num w:numId="17" w16cid:durableId="1349792489">
+    <w:abstractNumId w:val="18"/>
+  </w:num>
+  <w:num w:numId="18" w16cid:durableId="283079109">
+    <w:abstractNumId w:val="21"/>
+  </w:num>
+  <w:num w:numId="19" w16cid:durableId="1165171428">
+    <w:abstractNumId w:val="34"/>
+  </w:num>
+  <w:num w:numId="20" w16cid:durableId="324475260">
+    <w:abstractNumId w:val="17"/>
+  </w:num>
+  <w:num w:numId="21" w16cid:durableId="183516822">
+    <w:abstractNumId w:val="16"/>
+  </w:num>
+  <w:num w:numId="22" w16cid:durableId="1087774231">
+    <w:abstractNumId w:val="7"/>
+  </w:num>
+  <w:num w:numId="23" w16cid:durableId="71589738">
+    <w:abstractNumId w:val="13"/>
+  </w:num>
+  <w:num w:numId="24" w16cid:durableId="1250386951">
+    <w:abstractNumId w:val="8"/>
+  </w:num>
+  <w:num w:numId="25" w16cid:durableId="827286330">
+    <w:abstractNumId w:val="33"/>
+  </w:num>
+  <w:num w:numId="26" w16cid:durableId="1992245361">
+    <w:abstractNumId w:val="38"/>
+  </w:num>
+  <w:num w:numId="27" w16cid:durableId="1698777105">
+    <w:abstractNumId w:val="35"/>
+  </w:num>
+  <w:num w:numId="28" w16cid:durableId="746653712">
+    <w:abstractNumId w:val="26"/>
+  </w:num>
+  <w:num w:numId="29" w16cid:durableId="325866430">
+    <w:abstractNumId w:val="32"/>
+  </w:num>
+  <w:num w:numId="30" w16cid:durableId="1625311795">
+    <w:abstractNumId w:val="24"/>
+  </w:num>
+  <w:num w:numId="31" w16cid:durableId="1202860078">
+    <w:abstractNumId w:val="2"/>
+  </w:num>
+  <w:num w:numId="32" w16cid:durableId="990870381">
     <w:abstractNumId w:val="29"/>
   </w:num>
-  <w:num w:numId="3" w16cid:durableId="176962430">
-    <w:abstractNumId w:val="2"/>
+  <w:num w:numId="33" w16cid:durableId="11956136">
+    <w:abstractNumId w:val="27"/>
   </w:num>
-  <w:num w:numId="4" w16cid:durableId="1836263258">
-    <w:abstractNumId w:val="22"/>
-  </w:num>
-  <w:num w:numId="5" w16cid:durableId="1711104261">
-    <w:abstractNumId w:val="21"/>
-  </w:num>
-  <w:num w:numId="6" w16cid:durableId="1840191591">
-    <w:abstractNumId w:val="18"/>
-  </w:num>
-  <w:num w:numId="7" w16cid:durableId="1755662524">
+  <w:num w:numId="34" w16cid:durableId="1976638592">
     <w:abstractNumId w:val="4"/>
   </w:num>
-  <w:num w:numId="8" w16cid:durableId="2070806721">
-    <w:abstractNumId w:val="19"/>
+  <w:num w:numId="35" w16cid:durableId="2085644464">
+    <w:abstractNumId w:val="36"/>
   </w:num>
-  <w:num w:numId="9" w16cid:durableId="1230964383">
-    <w:abstractNumId w:val="13"/>
-  </w:num>
-  <w:num w:numId="10" w16cid:durableId="873270123">
-    <w:abstractNumId w:val="26"/>
-  </w:num>
-  <w:num w:numId="11" w16cid:durableId="1854805821">
-    <w:abstractNumId w:val="9"/>
-  </w:num>
-  <w:num w:numId="12" w16cid:durableId="655492938">
-    <w:abstractNumId w:val="10"/>
-  </w:num>
-  <w:num w:numId="13" w16cid:durableId="1955332203">
-    <w:abstractNumId w:val="28"/>
-  </w:num>
-  <w:num w:numId="14" w16cid:durableId="494034560">
-    <w:abstractNumId w:val="14"/>
-  </w:num>
-  <w:num w:numId="15" w16cid:durableId="357510247">
-    <w:abstractNumId w:val="11"/>
-  </w:num>
-  <w:num w:numId="16" w16cid:durableId="2091461372">
-    <w:abstractNumId w:val="8"/>
-  </w:num>
-  <w:num w:numId="17" w16cid:durableId="1349792489">
-    <w:abstractNumId w:val="17"/>
-  </w:num>
-  <w:num w:numId="18" w16cid:durableId="283079109">
-    <w:abstractNumId w:val="20"/>
-  </w:num>
-  <w:num w:numId="19" w16cid:durableId="1165171428">
-    <w:abstractNumId w:val="32"/>
-  </w:num>
-  <w:num w:numId="20" w16cid:durableId="324475260">
-    <w:abstractNumId w:val="16"/>
-  </w:num>
-  <w:num w:numId="21" w16cid:durableId="183516822">
-    <w:abstractNumId w:val="15"/>
-  </w:num>
-  <w:num w:numId="22" w16cid:durableId="1087774231">
+  <w:num w:numId="36" w16cid:durableId="579753729">
     <w:abstractNumId w:val="6"/>
   </w:num>
-  <w:num w:numId="23" w16cid:durableId="71589738">
-    <w:abstractNumId w:val="12"/>
+  <w:num w:numId="37" w16cid:durableId="834036394">
+    <w:abstractNumId w:val="37"/>
   </w:num>
-  <w:num w:numId="24" w16cid:durableId="1250386951">
-    <w:abstractNumId w:val="7"/>
-  </w:num>
-  <w:num w:numId="25" w16cid:durableId="827286330">
-    <w:abstractNumId w:val="31"/>
-  </w:num>
-  <w:num w:numId="26" w16cid:durableId="1992245361">
-    <w:abstractNumId w:val="36"/>
-  </w:num>
-  <w:num w:numId="27" w16cid:durableId="1698777105">
-    <w:abstractNumId w:val="33"/>
-  </w:num>
-  <w:num w:numId="28" w16cid:durableId="746653712">
-    <w:abstractNumId w:val="24"/>
-  </w:num>
-  <w:num w:numId="29" w16cid:durableId="325866430">
-    <w:abstractNumId w:val="30"/>
-  </w:num>
-  <w:num w:numId="30" w16cid:durableId="1625311795">
-    <w:abstractNumId w:val="23"/>
-  </w:num>
-  <w:num w:numId="31" w16cid:durableId="1202860078">
+  <w:num w:numId="38" w16cid:durableId="1640497758">
     <w:abstractNumId w:val="1"/>
   </w:num>
-  <w:num w:numId="32" w16cid:durableId="990870381">
-    <w:abstractNumId w:val="27"/>
-  </w:num>
-  <w:num w:numId="33" w16cid:durableId="11956136">
+  <w:num w:numId="39" w16cid:durableId="2117291435">
     <w:abstractNumId w:val="25"/>
-  </w:num>
-  <w:num w:numId="34" w16cid:durableId="1976638592">
-    <w:abstractNumId w:val="3"/>
-  </w:num>
-  <w:num w:numId="35" w16cid:durableId="2085644464">
-    <w:abstractNumId w:val="34"/>
-  </w:num>
-  <w:num w:numId="36" w16cid:durableId="579753729">
-    <w:abstractNumId w:val="5"/>
-  </w:num>
-  <w:num w:numId="37" w16cid:durableId="834036394">
-    <w:abstractNumId w:val="35"/>
   </w:num>
 </w:numbering>
 </file>
 
 <file path=word/styles.xml><?xml version="1.0" encoding="utf-8"?>
-<w:styles xmlns:mc="http://schemas.openxmlformats.org/markup-compatibility/2006" xmlns:r="http://schemas.openxmlformats.org/officeDocument/2006/relationships" xmlns:w="http://schemas.openxmlformats.org/wordprocessingml/2006/main" xmlns:w14="http://schemas.microsoft.com/office/word/2010/wordml" xmlns:w15="http://schemas.microsoft.com/office/word/2012/wordml" xmlns:w16cex="http://schemas.microsoft.com/office/word/2018/wordml/cex" xmlns:w16cid="http://schemas.microsoft.com/office/word/2016/wordml/cid" xmlns:w16="http://schemas.microsoft.com/office/word/2018/wordml" xmlns:w16sdtdh="http://schemas.microsoft.com/office/word/2020/wordml/sdtdatahash" xmlns:w16se="http://schemas.microsoft.com/office/word/2015/wordml/symex" mc:Ignorable="w14 w15 w16se w16cid w16 w16cex w16sdtdh">
+<w:styles xmlns:mc="http://schemas.openxmlformats.org/markup-compatibility/2006" xmlns:r="http://schemas.openxmlformats.org/officeDocument/2006/relationships" xmlns:w="http://schemas.openxmlformats.org/wordprocessingml/2006/main" xmlns:w14="http://schemas.microsoft.com/office/word/2010/wordml" xmlns:w15="http://schemas.microsoft.com/office/word/2012/wordml" xmlns:w16cex="http://schemas.microsoft.com/office/word/2018/wordml/cex" xmlns:w16cid="http://schemas.microsoft.com/office/word/2016/wordml/cid" xmlns:w16="http://schemas.microsoft.com/office/word/2018/wordml" xmlns:w16du="http://schemas.microsoft.com/office/word/2023/wordml/word16du" xmlns:w16sdtdh="http://schemas.microsoft.com/office/word/2020/wordml/sdtdatahash" xmlns:w16sdtfl="http://schemas.microsoft.com/office/word/2024/wordml/sdtformatlock" xmlns:w16se="http://schemas.microsoft.com/office/word/2015/wordml/symex" mc:Ignorable="w14 w15 w16se w16cid w16 w16cex w16sdtdh w16sdtfl w16du">
   <w:docDefaults>
     <w:rPrDefault>
       <w:rPr>
@@ -16108,6 +18044,7 @@
   <w:style w:type="character" w:default="1" w:styleId="Fuentedeprrafopredeter">
     <w:name w:val="Default Paragraph Font"/>
     <w:uiPriority w:val="1"/>
+    <w:semiHidden/>
     <w:unhideWhenUsed/>
   </w:style>
   <w:style w:type="table" w:default="1" w:styleId="Tablanormal">

</xml_diff>